<commit_message>
Auto-save: 1 file(s) — 2026-10-16 18:21
</commit_message>
<xml_diff>
--- a/Notes/2026-10-16-xloop-poland-pitch-slide-plan.docx
+++ b/Notes/2026-10-16-xloop-poland-pitch-slide-plan.docx
@@ -98,7 +98,7 @@
           <w:sz w:val="22"/>
           <w:szCs w:val="22"/>
         </w:rPr>
-        <w:t xml:space="preserve">modern and premium, few words per slide. Style reference is the Gamma version of the pitch: https://gamma.app/docs/gk5p655q5rjxcif</w:t>
+        <w:t xml:space="preserve">modern and premium, few words per slide.</w:t>
       </w:r>
     </w:p>
     <w:p>
@@ -144,7 +144,7 @@
           <w:sz w:val="22"/>
           <w:szCs w:val="22"/>
         </w:rPr>
-        <w:t xml:space="preserve">Use the descriptors in this document, for example “a leading South African retailer”. This includes names inside screenshots and app mockups.</w:t>
+        <w:t xml:space="preserve">Use the descriptors in this document, for example â€œa leading South African retailerâ€. This includes names inside screenshots and app mockups.</w:t>
       </w:r>
     </w:p>
     <w:p>
@@ -624,7 +624,7 @@
                 <w:sz w:val="19"/>
                 <w:szCs w:val="19"/>
               </w:rPr>
-              <w:t xml:space="preserve">AI First: How We Rebuilt xLoop</w:t>
+              <w:t xml:space="preserve">AI First Engineering</w:t>
             </w:r>
           </w:p>
         </w:tc>
@@ -894,7 +894,7 @@
                 <w:sz w:val="19"/>
                 <w:szCs w:val="19"/>
               </w:rPr>
-              <w:t xml:space="preserve">Keep, small edits</w:t>
+              <w:t xml:space="preserve">Rebuild on the slide 36 layout</w:t>
             </w:r>
           </w:p>
         </w:tc>
@@ -1003,7 +1003,7 @@
                 <w:sz w:val="19"/>
                 <w:szCs w:val="19"/>
               </w:rPr>
-              <w:t xml:space="preserve">Rewrite text</w:t>
+              <w:t xml:space="preserve">Rebuild on the slide 36 layout</w:t>
             </w:r>
           </w:p>
         </w:tc>
@@ -1112,7 +1112,7 @@
                 <w:sz w:val="19"/>
                 <w:szCs w:val="19"/>
               </w:rPr>
-              <w:t xml:space="preserve">Keep as is</w:t>
+              <w:t xml:space="preserve">Rebuild on the slide 36 layout</w:t>
             </w:r>
           </w:p>
         </w:tc>
@@ -1221,7 +1221,7 @@
                 <w:sz w:val="19"/>
                 <w:szCs w:val="19"/>
               </w:rPr>
-              <w:t xml:space="preserve">Remove client name</w:t>
+              <w:t xml:space="preserve">Keep layout, new text</w:t>
             </w:r>
           </w:p>
         </w:tc>
@@ -1330,7 +1330,7 @@
                 <w:sz w:val="19"/>
                 <w:szCs w:val="19"/>
               </w:rPr>
-              <w:t xml:space="preserve">Remove client name, fix wording</w:t>
+              <w:t xml:space="preserve">Rebuild on the slide 36 layout</w:t>
             </w:r>
           </w:p>
         </w:tc>
@@ -1469,7 +1469,7 @@
           <w:sz w:val="20"/>
           <w:szCs w:val="20"/>
         </w:rPr>
-        <w:t xml:space="preserve">Not used: slides 54 and 55 (wrong headcount and office count), slide 74 (“ISO 27001 Aligned” tag), slide 75 and 51 (named logo walls).</w:t>
+        <w:t xml:space="preserve">Not used: slides 54 and 55 (wrong headcount and office count), slide 74 (â€œISO 27001 Alignedâ€ tag), slide 75 and 51 (named logo walls).</w:t>
       </w:r>
     </w:p>
     <w:p>
@@ -1598,6 +1598,9 @@
         <w:gridCol w:w="9360"/>
       </w:tblGrid>
       <w:tr>
+        <w:trPr>
+          <w:cantSplit/>
+        </w:trPr>
         <w:tc>
           <w:tcPr>
             <w:tcW w:type="dxa" w:w="9360"/>
@@ -1869,6 +1872,9 @@
         <w:gridCol w:w="9360"/>
       </w:tblGrid>
       <w:tr>
+        <w:trPr>
+          <w:cantSplit/>
+        </w:trPr>
         <w:tc>
           <w:tcPr>
             <w:tcW w:type="dxa" w:w="9360"/>
@@ -1949,7 +1955,7 @@
                 <w:sz w:val="22"/>
                 <w:szCs w:val="22"/>
               </w:rPr>
-              <w:t xml:space="preserve">$[X]M+  Annual revenue run rate (as of [month] 2026)</w:t>
+              <w:t xml:space="preserve">$5M+  Annual revenue run rate (as of 2026)</w:t>
             </w:r>
           </w:p>
           <w:p>
@@ -1997,7 +2003,7 @@
                 <w:sz w:val="22"/>
                 <w:szCs w:val="22"/>
               </w:rPr>
-              <w:t xml:space="preserve">[8]  Countries served</w:t>
+              <w:t xml:space="preserve">8  Countries served</w:t>
             </w:r>
           </w:p>
           <w:p>
@@ -2021,7 +2027,7 @@
                 <w:sz w:val="22"/>
                 <w:szCs w:val="22"/>
               </w:rPr>
-              <w:t xml:space="preserve">Founded in 2022. Team members in Europe, based in Hungary.</w:t>
+              <w:t xml:space="preserve">Founded in 2022</w:t>
             </w:r>
           </w:p>
           <w:p>
@@ -2045,7 +2051,7 @@
                 <w:sz w:val="22"/>
                 <w:szCs w:val="22"/>
               </w:rPr>
-              <w:t xml:space="preserve">Banking and Financial Services · Retail · Real Estate · Healthcare · Maritime and Logistics · Travel</w:t>
+              <w:t xml:space="preserve">Banking and Financial Services · Retail · Real Estate · Healthcare · Logistics · Travel</w:t>
             </w:r>
           </w:p>
           <w:p>
@@ -2069,7 +2075,7 @@
                 <w:sz w:val="22"/>
                 <w:szCs w:val="22"/>
               </w:rPr>
-              <w:t xml:space="preserve">AWS · Microsoft · Snowflake · Databricks · Salesforce (partner logos are fine)</w:t>
+              <w:t xml:space="preserve">AWS Â· Microsoft Â· Snowflake Â· Databricks Â· Salesforce (partner logos are fine)</w:t>
             </w:r>
           </w:p>
           <w:p>
@@ -2206,7 +2212,7 @@
           <w:sz w:val="22"/>
           <w:szCs w:val="22"/>
         </w:rPr>
-        <w:t xml:space="preserve">Two columns, Then on the left, Now on the right, with an arrow or the loop motif between them. The Now column is the visual focus. A bottom band shows three labels.</w:t>
+        <w:t xml:space="preserve">Two columns, Then on the left, Now on the right, with an arrow or the loop motif between them. The Now column is the visual focus. A bottom band carries the closing line. If five rows feel crowded, lay it out as a four step path instead: Understand our data, Fix the gaps, Automate with agentic workflows, AI native organization.</w:t>
       </w:r>
     </w:p>
     <w:tbl>
@@ -2225,6 +2231,9 @@
         <w:gridCol w:w="9360"/>
       </w:tblGrid>
       <w:tr>
+        <w:trPr>
+          <w:cantSplit/>
+        </w:trPr>
         <w:tc>
           <w:tcPr>
             <w:tcW w:type="dxa" w:w="9360"/>
@@ -2257,7 +2266,7 @@
                 <w:sz w:val="22"/>
                 <w:szCs w:val="22"/>
               </w:rPr>
-              <w:t xml:space="preserve">AI First: How We Rebuilt xLoop</w:t>
+              <w:t xml:space="preserve">AI First Engineering</w:t>
             </w:r>
           </w:p>
           <w:p>
@@ -2281,7 +2290,7 @@
                 <w:sz w:val="22"/>
                 <w:szCs w:val="22"/>
               </w:rPr>
-              <w:t xml:space="preserve">We changed how we work before we asked clients to change theirs.</w:t>
+              <w:t xml:space="preserve">We changed how we work before we asked clients to change theirs</w:t>
             </w:r>
           </w:p>
         </w:tc>
@@ -2403,7 +2412,7 @@
                 <w:sz w:val="19"/>
                 <w:szCs w:val="19"/>
               </w:rPr>
-              <w:t xml:space="preserve">Software and data engineering services</w:t>
+              <w:t xml:space="preserve">Data spread across systems, with gaps nobody could see</w:t>
             </w:r>
           </w:p>
         </w:tc>
@@ -2429,7 +2438,7 @@
                 <w:sz w:val="19"/>
                 <w:szCs w:val="19"/>
               </w:rPr>
-              <w:t xml:space="preserve">AI native delivery: engineers work with AI coding assistants, and an engineer reviews and tests every change</w:t>
+              <w:t xml:space="preserve">We mapped our data and fixed the gaps, so every decision runs on numbers we trust</w:t>
             </w:r>
           </w:p>
         </w:tc>
@@ -2460,7 +2469,7 @@
                 <w:sz w:val="19"/>
                 <w:szCs w:val="19"/>
               </w:rPr>
-              <w:t xml:space="preserve">Products built for one client at a time</w:t>
+              <w:t xml:space="preserve">Manual, repetitive processes</w:t>
             </w:r>
           </w:p>
         </w:tc>
@@ -2486,7 +2495,64 @@
                 <w:sz w:val="19"/>
                 <w:szCs w:val="19"/>
               </w:rPr>
-              <w:t xml:space="preserve">Our own AI products: xVision, Chat Genie, App Pilot, xServe</w:t>
+              <w:t xml:space="preserve">Automation and agentic workflows handle routine work, and people approve what matters</w:t>
+            </w:r>
+          </w:p>
+        </w:tc>
+      </w:tr>
+      <w:tr>
+        <w:trPr>
+          <w:tblHeader w:val="off"/>
+        </w:trPr>
+        <w:tc>
+          <w:tcPr>
+            <w:tcW w:type="dxa" w:w="4680"/>
+            <w:tcMar>
+              <w:top w:type="dxa" w:w="80"/>
+              <w:left w:type="dxa" w:w="100"/>
+              <w:bottom w:type="dxa" w:w="80"/>
+              <w:right w:type="dxa" w:w="100"/>
+            </w:tcMar>
+          </w:tcPr>
+          <w:p>
+            <w:pPr>
+              <w:spacing w:after="40"/>
+            </w:pPr>
+            <w:r>
+              <w:rPr>
+                <w:rFonts w:ascii="Calibri" w:cs="Calibri" w:eastAsia="Calibri" w:hAnsi="Calibri"/>
+                <w:b w:val="false"/>
+                <w:bCs w:val="false"/>
+                <w:sz w:val="19"/>
+                <w:szCs w:val="19"/>
+              </w:rPr>
+              <w:t xml:space="preserve">Software and data engineering services</w:t>
+            </w:r>
+          </w:p>
+        </w:tc>
+        <w:tc>
+          <w:tcPr>
+            <w:tcW w:type="dxa" w:w="4680"/>
+            <w:tcMar>
+              <w:top w:type="dxa" w:w="80"/>
+              <w:left w:type="dxa" w:w="100"/>
+              <w:bottom w:type="dxa" w:w="80"/>
+              <w:right w:type="dxa" w:w="100"/>
+            </w:tcMar>
+          </w:tcPr>
+          <w:p>
+            <w:pPr>
+              <w:spacing w:after="40"/>
+            </w:pPr>
+            <w:r>
+              <w:rPr>
+                <w:rFonts w:ascii="Calibri" w:cs="Calibri" w:eastAsia="Calibri" w:hAnsi="Calibri"/>
+                <w:b w:val="false"/>
+                <w:bCs w:val="false"/>
+                <w:sz w:val="19"/>
+                <w:szCs w:val="19"/>
+              </w:rPr>
+              <w:t xml:space="preserve">AI native delivery: engineers work with AI coding assistants, and an engineer reviews and tests every change</w:t>
             </w:r>
           </w:p>
         </w:tc>
@@ -2635,6 +2701,9 @@
         <w:gridCol w:w="9360"/>
       </w:tblGrid>
       <w:tr>
+        <w:trPr>
+          <w:cantSplit/>
+        </w:trPr>
         <w:tc>
           <w:tcPr>
             <w:tcW w:type="dxa" w:w="9360"/>
@@ -2667,7 +2736,7 @@
                 <w:sz w:val="22"/>
                 <w:szCs w:val="22"/>
               </w:rPr>
-              <w:t xml:space="preserve">Data foundation  ·  AI agents in production  ·  AI security and governance</w:t>
+              <w:t xml:space="preserve">Where we are going: an AI native organization that is agile, dependable and data backed.</w:t>
             </w:r>
           </w:p>
         </w:tc>
@@ -2799,6 +2868,9 @@
         <w:gridCol w:w="9360"/>
       </w:tblGrid>
       <w:tr>
+        <w:trPr>
+          <w:cantSplit/>
+        </w:trPr>
         <w:tc>
           <w:tcPr>
             <w:tcW w:type="dxa" w:w="9360"/>
@@ -3488,7 +3560,7 @@
                 <w:sz w:val="19"/>
                 <w:szCs w:val="19"/>
               </w:rPr>
-              <w:t xml:space="preserve">Maritime and Logistics</w:t>
+              <w:t xml:space="preserve">Logistics</w:t>
             </w:r>
           </w:p>
         </w:tc>
@@ -3687,25 +3759,7 @@
           <w:sz w:val="22"/>
           <w:szCs w:val="22"/>
         </w:rPr>
-        <w:t xml:space="preserve">Keep each source slide's design. Make the changes listed. All five must be anonymous.</w:t>
-      </w:r>
-    </w:p>
-    <w:p>
-      <w:pPr>
-        <w:pStyle w:val="Heading2"/>
-        <w:keepNext/>
-        <w:spacing w:after="120" w:before="280"/>
-      </w:pPr>
-      <w:r>
-        <w:rPr>
-          <w:rFonts w:ascii="Calibri" w:cs="Calibri" w:eastAsia="Calibri" w:hAnsi="Calibri"/>
-          <w:b/>
-          <w:bCs/>
-          <w:color w:val="22205D"/>
-          <w:sz w:val="28"/>
-          <w:szCs w:val="28"/>
-        </w:rPr>
-        <w:t xml:space="preserve">Slide 5: Banking, AI investment assistant</w:t>
+        <w:t xml:space="preserve">All five cases use one layout, so the deck reads as one set. Use the slide 36 layout for every case. Rebuild slides 27, 25, 28 and 62 on it, and reuse their existing images.</w:t>
       </w:r>
     </w:p>
     <w:p>
@@ -3718,7 +3772,7 @@
           <wp:inline distT="0" distB="0" distL="0" distR="0">
             <wp:extent cx="3657600" cy="2057400"/>
             <wp:effectExtent t="0" r="0" b="0" l="0"/>
-            <wp:docPr id="5" name="Source: slide 27" descr="Source: slide 27" title="Source: slide 27"/>
+            <wp:docPr id="5" name="Layout for all five cases: slide 36" descr="Layout for all five cases: slide 36" title="Layout for all five cases: slide 36"/>
             <wp:cNvGraphicFramePr>
               <a:graphicFrameLocks xmlns:a="http://schemas.openxmlformats.org/drawingml/2006/main" noChangeAspect="1"/>
             </wp:cNvGraphicFramePr>
@@ -3767,7 +3821,7 @@
           <w:sz w:val="18"/>
           <w:szCs w:val="18"/>
         </w:rPr>
-        <w:t xml:space="preserve">Source: slide 27</w:t>
+        <w:t xml:space="preserve">Layout for all five cases: slide 36</w:t>
       </w:r>
     </w:p>
     <w:p>
@@ -3784,16 +3838,782 @@
           <w:sz w:val="18"/>
           <w:szCs w:val="18"/>
         </w:rPr>
-        <w:t xml:space="preserve">ACTION</w:t>
+        <w:t xml:space="preserve">THE FORMAT, IN THIS ORDER</w:t>
       </w:r>
     </w:p>
+    <w:tbl>
+      <w:tblPr>
+        <w:tblW w:type="dxa" w:w="9360"/>
+        <w:tblBorders>
+          <w:top w:val="single" w:color="D5D9E6" w:sz="4"/>
+          <w:left w:val="single" w:color="D5D9E6" w:sz="4"/>
+          <w:bottom w:val="single" w:color="D5D9E6" w:sz="4"/>
+          <w:right w:val="single" w:color="D5D9E6" w:sz="4"/>
+          <w:insideH w:val="single" w:color="D5D9E6" w:sz="4"/>
+          <w:insideV w:val="single" w:color="D5D9E6" w:sz="4"/>
+        </w:tblBorders>
+      </w:tblPr>
+      <w:tblGrid>
+        <w:gridCol w:w="2200"/>
+        <w:gridCol w:w="4960"/>
+        <w:gridCol w:w="2200"/>
+      </w:tblGrid>
+      <w:tr>
+        <w:trPr>
+          <w:tblHeader/>
+        </w:trPr>
+        <w:tc>
+          <w:tcPr>
+            <w:tcW w:type="dxa" w:w="2200"/>
+            <w:shd w:fill="22205D" w:color="auto" w:val="clear"/>
+            <w:tcMar>
+              <w:top w:type="dxa" w:w="80"/>
+              <w:left w:type="dxa" w:w="100"/>
+              <w:bottom w:type="dxa" w:w="80"/>
+              <w:right w:type="dxa" w:w="100"/>
+            </w:tcMar>
+          </w:tcPr>
+          <w:p>
+            <w:pPr>
+              <w:spacing w:after="40"/>
+            </w:pPr>
+            <w:r>
+              <w:rPr>
+                <w:rFonts w:ascii="Calibri" w:cs="Calibri" w:eastAsia="Calibri" w:hAnsi="Calibri"/>
+                <w:b/>
+                <w:bCs/>
+                <w:color w:val="FFFFFF"/>
+                <w:sz w:val="19"/>
+                <w:szCs w:val="19"/>
+              </w:rPr>
+              <w:t xml:space="preserve">Element</w:t>
+            </w:r>
+          </w:p>
+        </w:tc>
+        <w:tc>
+          <w:tcPr>
+            <w:tcW w:type="dxa" w:w="4960"/>
+            <w:shd w:fill="22205D" w:color="auto" w:val="clear"/>
+            <w:tcMar>
+              <w:top w:type="dxa" w:w="80"/>
+              <w:left w:type="dxa" w:w="100"/>
+              <w:bottom w:type="dxa" w:w="80"/>
+              <w:right w:type="dxa" w:w="100"/>
+            </w:tcMar>
+          </w:tcPr>
+          <w:p>
+            <w:pPr>
+              <w:spacing w:after="40"/>
+            </w:pPr>
+            <w:r>
+              <w:rPr>
+                <w:rFonts w:ascii="Calibri" w:cs="Calibri" w:eastAsia="Calibri" w:hAnsi="Calibri"/>
+                <w:b/>
+                <w:bCs/>
+                <w:color w:val="FFFFFF"/>
+                <w:sz w:val="19"/>
+                <w:szCs w:val="19"/>
+              </w:rPr>
+              <w:t xml:space="preserve">What goes in it</w:t>
+            </w:r>
+          </w:p>
+        </w:tc>
+        <w:tc>
+          <w:tcPr>
+            <w:tcW w:type="dxa" w:w="2200"/>
+            <w:shd w:fill="22205D" w:color="auto" w:val="clear"/>
+            <w:tcMar>
+              <w:top w:type="dxa" w:w="80"/>
+              <w:left w:type="dxa" w:w="100"/>
+              <w:bottom w:type="dxa" w:w="80"/>
+              <w:right w:type="dxa" w:w="100"/>
+            </w:tcMar>
+          </w:tcPr>
+          <w:p>
+            <w:pPr>
+              <w:spacing w:after="40"/>
+            </w:pPr>
+            <w:r>
+              <w:rPr>
+                <w:rFonts w:ascii="Calibri" w:cs="Calibri" w:eastAsia="Calibri" w:hAnsi="Calibri"/>
+                <w:b/>
+                <w:bCs/>
+                <w:color w:val="FFFFFF"/>
+                <w:sz w:val="19"/>
+                <w:szCs w:val="19"/>
+              </w:rPr>
+              <w:t xml:space="preserve">Length</w:t>
+            </w:r>
+          </w:p>
+        </w:tc>
+      </w:tr>
+      <w:tr>
+        <w:trPr>
+          <w:tblHeader w:val="off"/>
+        </w:trPr>
+        <w:tc>
+          <w:tcPr>
+            <w:tcW w:type="dxa" w:w="2200"/>
+            <w:tcMar>
+              <w:top w:type="dxa" w:w="80"/>
+              <w:left w:type="dxa" w:w="100"/>
+              <w:bottom w:type="dxa" w:w="80"/>
+              <w:right w:type="dxa" w:w="100"/>
+            </w:tcMar>
+          </w:tcPr>
+          <w:p>
+            <w:pPr>
+              <w:spacing w:after="40"/>
+            </w:pPr>
+            <w:r>
+              <w:rPr>
+                <w:rFonts w:ascii="Calibri" w:cs="Calibri" w:eastAsia="Calibri" w:hAnsi="Calibri"/>
+                <w:b w:val="false"/>
+                <w:bCs w:val="false"/>
+                <w:sz w:val="19"/>
+                <w:szCs w:val="19"/>
+              </w:rPr>
+              <w:t xml:space="preserve">Client</w:t>
+            </w:r>
+          </w:p>
+        </w:tc>
+        <w:tc>
+          <w:tcPr>
+            <w:tcW w:type="dxa" w:w="4960"/>
+            <w:tcMar>
+              <w:top w:type="dxa" w:w="80"/>
+              <w:left w:type="dxa" w:w="100"/>
+              <w:bottom w:type="dxa" w:w="80"/>
+              <w:right w:type="dxa" w:w="100"/>
+            </w:tcMar>
+          </w:tcPr>
+          <w:p>
+            <w:pPr>
+              <w:spacing w:after="40"/>
+            </w:pPr>
+            <w:r>
+              <w:rPr>
+                <w:rFonts w:ascii="Calibri" w:cs="Calibri" w:eastAsia="Calibri" w:hAnsi="Calibri"/>
+                <w:b w:val="false"/>
+                <w:bCs w:val="false"/>
+                <w:sz w:val="19"/>
+                <w:szCs w:val="19"/>
+              </w:rPr>
+              <w:t xml:space="preserve">Anonymous descriptor, no name or logo</w:t>
+            </w:r>
+          </w:p>
+        </w:tc>
+        <w:tc>
+          <w:tcPr>
+            <w:tcW w:type="dxa" w:w="2200"/>
+            <w:tcMar>
+              <w:top w:type="dxa" w:w="80"/>
+              <w:left w:type="dxa" w:w="100"/>
+              <w:bottom w:type="dxa" w:w="80"/>
+              <w:right w:type="dxa" w:w="100"/>
+            </w:tcMar>
+          </w:tcPr>
+          <w:p>
+            <w:pPr>
+              <w:spacing w:after="40"/>
+            </w:pPr>
+            <w:r>
+              <w:rPr>
+                <w:rFonts w:ascii="Calibri" w:cs="Calibri" w:eastAsia="Calibri" w:hAnsi="Calibri"/>
+                <w:b w:val="false"/>
+                <w:bCs w:val="false"/>
+                <w:sz w:val="19"/>
+                <w:szCs w:val="19"/>
+              </w:rPr>
+              <w:t xml:space="preserve">One line</w:t>
+            </w:r>
+          </w:p>
+        </w:tc>
+      </w:tr>
+      <w:tr>
+        <w:trPr>
+          <w:tblHeader w:val="off"/>
+        </w:trPr>
+        <w:tc>
+          <w:tcPr>
+            <w:tcW w:type="dxa" w:w="2200"/>
+            <w:tcMar>
+              <w:top w:type="dxa" w:w="80"/>
+              <w:left w:type="dxa" w:w="100"/>
+              <w:bottom w:type="dxa" w:w="80"/>
+              <w:right w:type="dxa" w:w="100"/>
+            </w:tcMar>
+          </w:tcPr>
+          <w:p>
+            <w:pPr>
+              <w:spacing w:after="40"/>
+            </w:pPr>
+            <w:r>
+              <w:rPr>
+                <w:rFonts w:ascii="Calibri" w:cs="Calibri" w:eastAsia="Calibri" w:hAnsi="Calibri"/>
+                <w:b w:val="false"/>
+                <w:bCs w:val="false"/>
+                <w:sz w:val="19"/>
+                <w:szCs w:val="19"/>
+              </w:rPr>
+              <w:t xml:space="preserve">Headline</w:t>
+            </w:r>
+          </w:p>
+        </w:tc>
+        <w:tc>
+          <w:tcPr>
+            <w:tcW w:type="dxa" w:w="4960"/>
+            <w:tcMar>
+              <w:top w:type="dxa" w:w="80"/>
+              <w:left w:type="dxa" w:w="100"/>
+              <w:bottom w:type="dxa" w:w="80"/>
+              <w:right w:type="dxa" w:w="100"/>
+            </w:tcMar>
+          </w:tcPr>
+          <w:p>
+            <w:pPr>
+              <w:spacing w:after="40"/>
+            </w:pPr>
+            <w:r>
+              <w:rPr>
+                <w:rFonts w:ascii="Calibri" w:cs="Calibri" w:eastAsia="Calibri" w:hAnsi="Calibri"/>
+                <w:b w:val="false"/>
+                <w:bCs w:val="false"/>
+                <w:sz w:val="19"/>
+                <w:szCs w:val="19"/>
+              </w:rPr>
+              <w:t xml:space="preserve">What we built, in plain words</w:t>
+            </w:r>
+          </w:p>
+        </w:tc>
+        <w:tc>
+          <w:tcPr>
+            <w:tcW w:type="dxa" w:w="2200"/>
+            <w:tcMar>
+              <w:top w:type="dxa" w:w="80"/>
+              <w:left w:type="dxa" w:w="100"/>
+              <w:bottom w:type="dxa" w:w="80"/>
+              <w:right w:type="dxa" w:w="100"/>
+            </w:tcMar>
+          </w:tcPr>
+          <w:p>
+            <w:pPr>
+              <w:spacing w:after="40"/>
+            </w:pPr>
+            <w:r>
+              <w:rPr>
+                <w:rFonts w:ascii="Calibri" w:cs="Calibri" w:eastAsia="Calibri" w:hAnsi="Calibri"/>
+                <w:b w:val="false"/>
+                <w:bCs w:val="false"/>
+                <w:sz w:val="19"/>
+                <w:szCs w:val="19"/>
+              </w:rPr>
+              <w:t xml:space="preserve">Up to 8 words</w:t>
+            </w:r>
+          </w:p>
+        </w:tc>
+      </w:tr>
+      <w:tr>
+        <w:trPr>
+          <w:tblHeader w:val="off"/>
+        </w:trPr>
+        <w:tc>
+          <w:tcPr>
+            <w:tcW w:type="dxa" w:w="2200"/>
+            <w:tcMar>
+              <w:top w:type="dxa" w:w="80"/>
+              <w:left w:type="dxa" w:w="100"/>
+              <w:bottom w:type="dxa" w:w="80"/>
+              <w:right w:type="dxa" w:w="100"/>
+            </w:tcMar>
+          </w:tcPr>
+          <w:p>
+            <w:pPr>
+              <w:spacing w:after="40"/>
+            </w:pPr>
+            <w:r>
+              <w:rPr>
+                <w:rFonts w:ascii="Calibri" w:cs="Calibri" w:eastAsia="Calibri" w:hAnsi="Calibri"/>
+                <w:b w:val="false"/>
+                <w:bCs w:val="false"/>
+                <w:sz w:val="19"/>
+                <w:szCs w:val="19"/>
+              </w:rPr>
+              <w:t xml:space="preserve">Summary</w:t>
+            </w:r>
+          </w:p>
+        </w:tc>
+        <w:tc>
+          <w:tcPr>
+            <w:tcW w:type="dxa" w:w="4960"/>
+            <w:tcMar>
+              <w:top w:type="dxa" w:w="80"/>
+              <w:left w:type="dxa" w:w="100"/>
+              <w:bottom w:type="dxa" w:w="80"/>
+              <w:right w:type="dxa" w:w="100"/>
+            </w:tcMar>
+          </w:tcPr>
+          <w:p>
+            <w:pPr>
+              <w:spacing w:after="40"/>
+            </w:pPr>
+            <w:r>
+              <w:rPr>
+                <w:rFonts w:ascii="Calibri" w:cs="Calibri" w:eastAsia="Calibri" w:hAnsi="Calibri"/>
+                <w:b w:val="false"/>
+                <w:bCs w:val="false"/>
+                <w:sz w:val="19"/>
+                <w:szCs w:val="19"/>
+              </w:rPr>
+              <w:t xml:space="preserve">One sentence under the headline</w:t>
+            </w:r>
+          </w:p>
+        </w:tc>
+        <w:tc>
+          <w:tcPr>
+            <w:tcW w:type="dxa" w:w="2200"/>
+            <w:tcMar>
+              <w:top w:type="dxa" w:w="80"/>
+              <w:left w:type="dxa" w:w="100"/>
+              <w:bottom w:type="dxa" w:w="80"/>
+              <w:right w:type="dxa" w:w="100"/>
+            </w:tcMar>
+          </w:tcPr>
+          <w:p>
+            <w:pPr>
+              <w:spacing w:after="40"/>
+            </w:pPr>
+            <w:r>
+              <w:rPr>
+                <w:rFonts w:ascii="Calibri" w:cs="Calibri" w:eastAsia="Calibri" w:hAnsi="Calibri"/>
+                <w:b w:val="false"/>
+                <w:bCs w:val="false"/>
+                <w:sz w:val="19"/>
+                <w:szCs w:val="19"/>
+              </w:rPr>
+              <w:t xml:space="preserve">Up to 25 words</w:t>
+            </w:r>
+          </w:p>
+        </w:tc>
+      </w:tr>
+      <w:tr>
+        <w:trPr>
+          <w:tblHeader w:val="off"/>
+        </w:trPr>
+        <w:tc>
+          <w:tcPr>
+            <w:tcW w:type="dxa" w:w="2200"/>
+            <w:tcMar>
+              <w:top w:type="dxa" w:w="80"/>
+              <w:left w:type="dxa" w:w="100"/>
+              <w:bottom w:type="dxa" w:w="80"/>
+              <w:right w:type="dxa" w:w="100"/>
+            </w:tcMar>
+          </w:tcPr>
+          <w:p>
+            <w:pPr>
+              <w:spacing w:after="40"/>
+            </w:pPr>
+            <w:r>
+              <w:rPr>
+                <w:rFonts w:ascii="Calibri" w:cs="Calibri" w:eastAsia="Calibri" w:hAnsi="Calibri"/>
+                <w:b w:val="false"/>
+                <w:bCs w:val="false"/>
+                <w:sz w:val="19"/>
+                <w:szCs w:val="19"/>
+              </w:rPr>
+              <w:t xml:space="preserve">Tags</w:t>
+            </w:r>
+          </w:p>
+        </w:tc>
+        <w:tc>
+          <w:tcPr>
+            <w:tcW w:type="dxa" w:w="4960"/>
+            <w:tcMar>
+              <w:top w:type="dxa" w:w="80"/>
+              <w:left w:type="dxa" w:w="100"/>
+              <w:bottom w:type="dxa" w:w="80"/>
+              <w:right w:type="dxa" w:w="100"/>
+            </w:tcMar>
+          </w:tcPr>
+          <w:p>
+            <w:pPr>
+              <w:spacing w:after="40"/>
+            </w:pPr>
+            <w:r>
+              <w:rPr>
+                <w:rFonts w:ascii="Calibri" w:cs="Calibri" w:eastAsia="Calibri" w:hAnsi="Calibri"/>
+                <w:b w:val="false"/>
+                <w:bCs w:val="false"/>
+                <w:sz w:val="19"/>
+                <w:szCs w:val="19"/>
+              </w:rPr>
+              <w:t xml:space="preserve">Sector, service, technology</w:t>
+            </w:r>
+          </w:p>
+        </w:tc>
+        <w:tc>
+          <w:tcPr>
+            <w:tcW w:type="dxa" w:w="2200"/>
+            <w:tcMar>
+              <w:top w:type="dxa" w:w="80"/>
+              <w:left w:type="dxa" w:w="100"/>
+              <w:bottom w:type="dxa" w:w="80"/>
+              <w:right w:type="dxa" w:w="100"/>
+            </w:tcMar>
+          </w:tcPr>
+          <w:p>
+            <w:pPr>
+              <w:spacing w:after="40"/>
+            </w:pPr>
+            <w:r>
+              <w:rPr>
+                <w:rFonts w:ascii="Calibri" w:cs="Calibri" w:eastAsia="Calibri" w:hAnsi="Calibri"/>
+                <w:b w:val="false"/>
+                <w:bCs w:val="false"/>
+                <w:sz w:val="19"/>
+                <w:szCs w:val="19"/>
+              </w:rPr>
+              <w:t xml:space="preserve">Exactly 3</w:t>
+            </w:r>
+          </w:p>
+        </w:tc>
+      </w:tr>
+      <w:tr>
+        <w:trPr>
+          <w:tblHeader w:val="off"/>
+        </w:trPr>
+        <w:tc>
+          <w:tcPr>
+            <w:tcW w:type="dxa" w:w="2200"/>
+            <w:tcMar>
+              <w:top w:type="dxa" w:w="80"/>
+              <w:left w:type="dxa" w:w="100"/>
+              <w:bottom w:type="dxa" w:w="80"/>
+              <w:right w:type="dxa" w:w="100"/>
+            </w:tcMar>
+          </w:tcPr>
+          <w:p>
+            <w:pPr>
+              <w:spacing w:after="40"/>
+            </w:pPr>
+            <w:r>
+              <w:rPr>
+                <w:rFonts w:ascii="Calibri" w:cs="Calibri" w:eastAsia="Calibri" w:hAnsi="Calibri"/>
+                <w:b w:val="false"/>
+                <w:bCs w:val="false"/>
+                <w:sz w:val="19"/>
+                <w:szCs w:val="19"/>
+              </w:rPr>
+              <w:t xml:space="preserve">The Challenge</w:t>
+            </w:r>
+          </w:p>
+        </w:tc>
+        <w:tc>
+          <w:tcPr>
+            <w:tcW w:type="dxa" w:w="4960"/>
+            <w:tcMar>
+              <w:top w:type="dxa" w:w="80"/>
+              <w:left w:type="dxa" w:w="100"/>
+              <w:bottom w:type="dxa" w:w="80"/>
+              <w:right w:type="dxa" w:w="100"/>
+            </w:tcMar>
+          </w:tcPr>
+          <w:p>
+            <w:pPr>
+              <w:spacing w:after="40"/>
+            </w:pPr>
+            <w:r>
+              <w:rPr>
+                <w:rFonts w:ascii="Calibri" w:cs="Calibri" w:eastAsia="Calibri" w:hAnsi="Calibri"/>
+                <w:b w:val="false"/>
+                <w:bCs w:val="false"/>
+                <w:sz w:val="19"/>
+                <w:szCs w:val="19"/>
+              </w:rPr>
+              <w:t xml:space="preserve">Left box, bullet points</w:t>
+            </w:r>
+          </w:p>
+        </w:tc>
+        <w:tc>
+          <w:tcPr>
+            <w:tcW w:type="dxa" w:w="2200"/>
+            <w:tcMar>
+              <w:top w:type="dxa" w:w="80"/>
+              <w:left w:type="dxa" w:w="100"/>
+              <w:bottom w:type="dxa" w:w="80"/>
+              <w:right w:type="dxa" w:w="100"/>
+            </w:tcMar>
+          </w:tcPr>
+          <w:p>
+            <w:pPr>
+              <w:spacing w:after="40"/>
+            </w:pPr>
+            <w:r>
+              <w:rPr>
+                <w:rFonts w:ascii="Calibri" w:cs="Calibri" w:eastAsia="Calibri" w:hAnsi="Calibri"/>
+                <w:b w:val="false"/>
+                <w:bCs w:val="false"/>
+                <w:sz w:val="19"/>
+                <w:szCs w:val="19"/>
+              </w:rPr>
+              <w:t xml:space="preserve">Exactly 3 bullets</w:t>
+            </w:r>
+          </w:p>
+        </w:tc>
+      </w:tr>
+      <w:tr>
+        <w:trPr>
+          <w:tblHeader w:val="off"/>
+        </w:trPr>
+        <w:tc>
+          <w:tcPr>
+            <w:tcW w:type="dxa" w:w="2200"/>
+            <w:tcMar>
+              <w:top w:type="dxa" w:w="80"/>
+              <w:left w:type="dxa" w:w="100"/>
+              <w:bottom w:type="dxa" w:w="80"/>
+              <w:right w:type="dxa" w:w="100"/>
+            </w:tcMar>
+          </w:tcPr>
+          <w:p>
+            <w:pPr>
+              <w:spacing w:after="40"/>
+            </w:pPr>
+            <w:r>
+              <w:rPr>
+                <w:rFonts w:ascii="Calibri" w:cs="Calibri" w:eastAsia="Calibri" w:hAnsi="Calibri"/>
+                <w:b w:val="false"/>
+                <w:bCs w:val="false"/>
+                <w:sz w:val="19"/>
+                <w:szCs w:val="19"/>
+              </w:rPr>
+              <w:t xml:space="preserve">What xLoop Delivered</w:t>
+            </w:r>
+          </w:p>
+        </w:tc>
+        <w:tc>
+          <w:tcPr>
+            <w:tcW w:type="dxa" w:w="4960"/>
+            <w:tcMar>
+              <w:top w:type="dxa" w:w="80"/>
+              <w:left w:type="dxa" w:w="100"/>
+              <w:bottom w:type="dxa" w:w="80"/>
+              <w:right w:type="dxa" w:w="100"/>
+            </w:tcMar>
+          </w:tcPr>
+          <w:p>
+            <w:pPr>
+              <w:spacing w:after="40"/>
+            </w:pPr>
+            <w:r>
+              <w:rPr>
+                <w:rFonts w:ascii="Calibri" w:cs="Calibri" w:eastAsia="Calibri" w:hAnsi="Calibri"/>
+                <w:b w:val="false"/>
+                <w:bCs w:val="false"/>
+                <w:sz w:val="19"/>
+                <w:szCs w:val="19"/>
+              </w:rPr>
+              <w:t xml:space="preserve">Right box, numbered steps, each with a bold name and one line</w:t>
+            </w:r>
+          </w:p>
+        </w:tc>
+        <w:tc>
+          <w:tcPr>
+            <w:tcW w:type="dxa" w:w="2200"/>
+            <w:tcMar>
+              <w:top w:type="dxa" w:w="80"/>
+              <w:left w:type="dxa" w:w="100"/>
+              <w:bottom w:type="dxa" w:w="80"/>
+              <w:right w:type="dxa" w:w="100"/>
+            </w:tcMar>
+          </w:tcPr>
+          <w:p>
+            <w:pPr>
+              <w:spacing w:after="40"/>
+            </w:pPr>
+            <w:r>
+              <w:rPr>
+                <w:rFonts w:ascii="Calibri" w:cs="Calibri" w:eastAsia="Calibri" w:hAnsi="Calibri"/>
+                <w:b w:val="false"/>
+                <w:bCs w:val="false"/>
+                <w:sz w:val="19"/>
+                <w:szCs w:val="19"/>
+              </w:rPr>
+              <w:t xml:space="preserve">Exactly 4 steps</w:t>
+            </w:r>
+          </w:p>
+        </w:tc>
+      </w:tr>
+      <w:tr>
+        <w:trPr>
+          <w:tblHeader w:val="off"/>
+        </w:trPr>
+        <w:tc>
+          <w:tcPr>
+            <w:tcW w:type="dxa" w:w="2200"/>
+            <w:tcMar>
+              <w:top w:type="dxa" w:w="80"/>
+              <w:left w:type="dxa" w:w="100"/>
+              <w:bottom w:type="dxa" w:w="80"/>
+              <w:right w:type="dxa" w:w="100"/>
+            </w:tcMar>
+          </w:tcPr>
+          <w:p>
+            <w:pPr>
+              <w:spacing w:after="40"/>
+            </w:pPr>
+            <w:r>
+              <w:rPr>
+                <w:rFonts w:ascii="Calibri" w:cs="Calibri" w:eastAsia="Calibri" w:hAnsi="Calibri"/>
+                <w:b w:val="false"/>
+                <w:bCs w:val="false"/>
+                <w:sz w:val="19"/>
+                <w:szCs w:val="19"/>
+              </w:rPr>
+              <w:t xml:space="preserve">Business Value</w:t>
+            </w:r>
+          </w:p>
+        </w:tc>
+        <w:tc>
+          <w:tcPr>
+            <w:tcW w:type="dxa" w:w="4960"/>
+            <w:tcMar>
+              <w:top w:type="dxa" w:w="80"/>
+              <w:left w:type="dxa" w:w="100"/>
+              <w:bottom w:type="dxa" w:w="80"/>
+              <w:right w:type="dxa" w:w="100"/>
+            </w:tcMar>
+          </w:tcPr>
+          <w:p>
+            <w:pPr>
+              <w:spacing w:after="40"/>
+            </w:pPr>
+            <w:r>
+              <w:rPr>
+                <w:rFonts w:ascii="Calibri" w:cs="Calibri" w:eastAsia="Calibri" w:hAnsi="Calibri"/>
+                <w:b w:val="false"/>
+                <w:bCs w:val="false"/>
+                <w:sz w:val="19"/>
+                <w:szCs w:val="19"/>
+              </w:rPr>
+              <w:t xml:space="preserve">Bottom strip of short labels</w:t>
+            </w:r>
+          </w:p>
+        </w:tc>
+        <w:tc>
+          <w:tcPr>
+            <w:tcW w:type="dxa" w:w="2200"/>
+            <w:tcMar>
+              <w:top w:type="dxa" w:w="80"/>
+              <w:left w:type="dxa" w:w="100"/>
+              <w:bottom w:type="dxa" w:w="80"/>
+              <w:right w:type="dxa" w:w="100"/>
+            </w:tcMar>
+          </w:tcPr>
+          <w:p>
+            <w:pPr>
+              <w:spacing w:after="40"/>
+            </w:pPr>
+            <w:r>
+              <w:rPr>
+                <w:rFonts w:ascii="Calibri" w:cs="Calibri" w:eastAsia="Calibri" w:hAnsi="Calibri"/>
+                <w:b w:val="false"/>
+                <w:bCs w:val="false"/>
+                <w:sz w:val="19"/>
+                <w:szCs w:val="19"/>
+              </w:rPr>
+              <w:t xml:space="preserve">Exactly 4 labels</w:t>
+            </w:r>
+          </w:p>
+        </w:tc>
+      </w:tr>
+      <w:tr>
+        <w:trPr>
+          <w:tblHeader w:val="off"/>
+        </w:trPr>
+        <w:tc>
+          <w:tcPr>
+            <w:tcW w:type="dxa" w:w="2200"/>
+            <w:tcMar>
+              <w:top w:type="dxa" w:w="80"/>
+              <w:left w:type="dxa" w:w="100"/>
+              <w:bottom w:type="dxa" w:w="80"/>
+              <w:right w:type="dxa" w:w="100"/>
+            </w:tcMar>
+          </w:tcPr>
+          <w:p>
+            <w:pPr>
+              <w:spacing w:after="40"/>
+            </w:pPr>
+            <w:r>
+              <w:rPr>
+                <w:rFonts w:ascii="Calibri" w:cs="Calibri" w:eastAsia="Calibri" w:hAnsi="Calibri"/>
+                <w:b w:val="false"/>
+                <w:bCs w:val="false"/>
+                <w:sz w:val="19"/>
+                <w:szCs w:val="19"/>
+              </w:rPr>
+              <w:t xml:space="preserve">Image</w:t>
+            </w:r>
+          </w:p>
+        </w:tc>
+        <w:tc>
+          <w:tcPr>
+            <w:tcW w:type="dxa" w:w="4960"/>
+            <w:tcMar>
+              <w:top w:type="dxa" w:w="80"/>
+              <w:left w:type="dxa" w:w="100"/>
+              <w:bottom w:type="dxa" w:w="80"/>
+              <w:right w:type="dxa" w:w="100"/>
+            </w:tcMar>
+          </w:tcPr>
+          <w:p>
+            <w:pPr>
+              <w:spacing w:after="40"/>
+            </w:pPr>
+            <w:r>
+              <w:rPr>
+                <w:rFonts w:ascii="Calibri" w:cs="Calibri" w:eastAsia="Calibri" w:hAnsi="Calibri"/>
+                <w:b w:val="false"/>
+                <w:bCs w:val="false"/>
+                <w:sz w:val="19"/>
+                <w:szCs w:val="19"/>
+              </w:rPr>
+              <w:t xml:space="preserve">Left panel, reuse the slide's current image</w:t>
+            </w:r>
+          </w:p>
+        </w:tc>
+        <w:tc>
+          <w:tcPr>
+            <w:tcW w:type="dxa" w:w="2200"/>
+            <w:tcMar>
+              <w:top w:type="dxa" w:w="80"/>
+              <w:left w:type="dxa" w:w="100"/>
+              <w:bottom w:type="dxa" w:w="80"/>
+              <w:right w:type="dxa" w:w="100"/>
+            </w:tcMar>
+          </w:tcPr>
+          <w:p>
+            <w:pPr>
+              <w:spacing w:after="40"/>
+            </w:pPr>
+            <w:r>
+              <w:rPr>
+                <w:rFonts w:ascii="Calibri" w:cs="Calibri" w:eastAsia="Calibri" w:hAnsi="Calibri"/>
+                <w:b w:val="false"/>
+                <w:bCs w:val="false"/>
+                <w:sz w:val="19"/>
+                <w:szCs w:val="19"/>
+              </w:rPr>
+              <w:t xml:space="preserve">No client logos in it</w:t>
+            </w:r>
+          </w:p>
+        </w:tc>
+      </w:tr>
+    </w:tbl>
     <w:p>
       <w:pPr>
-        <w:pStyle w:val="ListParagraph"/>
-        <w:numPr>
-          <w:ilvl w:val="0"/>
-          <w:numId w:val="2"/>
-        </w:numPr>
         <w:spacing w:after="60"/>
       </w:pPr>
       <w:r>
@@ -3802,27 +4622,356 @@
           <w:sz w:val="22"/>
           <w:szCs w:val="22"/>
         </w:rPr>
-        <w:t xml:space="preserve">Keep as is. The text is already anonymous and approved.</w:t>
+        <w:t xml:space="preserve"/>
       </w:r>
     </w:p>
     <w:p>
       <w:pPr>
-        <w:pStyle w:val="ListParagraph"/>
-        <w:numPr>
-          <w:ilvl w:val="0"/>
-          <w:numId w:val="2"/>
-        </w:numPr>
-        <w:spacing w:after="60"/>
-      </w:pPr>
+        <w:spacing w:after="120"/>
+      </w:pPr>
+      <w:r>
+        <w:rPr>
+          <w:rFonts w:ascii="Calibri" w:cs="Calibri" w:eastAsia="Calibri" w:hAnsi="Calibri"/>
+          <w:color w:val="5B5A80"/>
+          <w:sz w:val="20"/>
+          <w:szCs w:val="20"/>
+        </w:rPr>
+        <w:t xml:space="preserve">No percentages or result numbers in any case. The only numbers allowed are the ones already in the text below.</w:t>
+      </w:r>
+    </w:p>
+    <w:p>
+      <w:pPr>
+        <w:pStyle w:val="Heading2"/>
+        <w:keepNext/>
+        <w:spacing w:after="120" w:before="280"/>
+      </w:pPr>
+      <w:r>
+        <w:rPr>
+          <w:rFonts w:ascii="Calibri" w:cs="Calibri" w:eastAsia="Calibri" w:hAnsi="Calibri"/>
+          <w:b/>
+          <w:bCs/>
+          <w:color w:val="22205D"/>
+          <w:sz w:val="28"/>
+          <w:szCs w:val="28"/>
+        </w:rPr>
+        <w:t xml:space="preserve">Slide 5: Banking, AI investment assistant</w:t>
+      </w:r>
+    </w:p>
+    <w:p>
+      <w:pPr>
+        <w:spacing w:after="120"/>
+      </w:pPr>
+      <w:r>
+        <w:rPr>
+          <w:rFonts w:ascii="Calibri" w:cs="Calibri" w:eastAsia="Calibri" w:hAnsi="Calibri"/>
+          <w:b/>
+          <w:bCs/>
+          <w:sz w:val="22"/>
+          <w:szCs w:val="22"/>
+        </w:rPr>
+        <w:t xml:space="preserve">Source: </w:t>
+      </w:r>
       <w:r>
         <w:rPr>
           <w:rFonts w:ascii="Calibri" w:cs="Calibri" w:eastAsia="Calibri" w:hAnsi="Calibri"/>
           <w:sz w:val="22"/>
           <w:szCs w:val="22"/>
         </w:rPr>
-        <w:t xml:space="preserve">Check the background image and any screenshot for the client's name or logo, and remove it if present.</w:t>
+        <w:t xml:space="preserve">slide 27. Rebuild on the slide 36 layout with the copy below. Reuse the current image.</w:t>
       </w:r>
     </w:p>
+    <w:tbl>
+      <w:tblPr>
+        <w:tblW w:type="dxa" w:w="9360"/>
+        <w:tblBorders>
+          <w:top w:val="single" w:color="D5D9E6" w:sz="4"/>
+          <w:left w:val="single" w:color="D5D9E6" w:sz="4"/>
+          <w:bottom w:val="single" w:color="D5D9E6" w:sz="4"/>
+          <w:right w:val="single" w:color="D5D9E6" w:sz="4"/>
+          <w:insideH w:val="single" w:color="D5D9E6" w:sz="4"/>
+          <w:insideV w:val="single" w:color="D5D9E6" w:sz="4"/>
+        </w:tblBorders>
+      </w:tblPr>
+      <w:tblGrid>
+        <w:gridCol w:w="9360"/>
+      </w:tblGrid>
+      <w:tr>
+        <w:trPr>
+          <w:cantSplit/>
+        </w:trPr>
+        <w:tc>
+          <w:tcPr>
+            <w:tcW w:type="dxa" w:w="9360"/>
+            <w:shd w:fill="EEF1F8" w:color="auto" w:val="clear"/>
+            <w:tcMar>
+              <w:top w:type="dxa" w:w="140"/>
+              <w:left w:type="dxa" w:w="180"/>
+              <w:bottom w:type="dxa" w:w="140"/>
+              <w:right w:type="dxa" w:w="180"/>
+            </w:tcMar>
+          </w:tcPr>
+          <w:p>
+            <w:pPr>
+              <w:spacing w:after="90"/>
+            </w:pPr>
+            <w:r>
+              <w:rPr>
+                <w:rFonts w:ascii="Calibri" w:cs="Calibri" w:eastAsia="Calibri" w:hAnsi="Calibri"/>
+                <w:b/>
+                <w:bCs/>
+                <w:color w:val="22205D"/>
+                <w:sz w:val="22"/>
+                <w:szCs w:val="22"/>
+              </w:rPr>
+              <w:t xml:space="preserve">Client  </w:t>
+            </w:r>
+            <w:r>
+              <w:rPr>
+                <w:rFonts w:ascii="Calibri" w:cs="Calibri" w:eastAsia="Calibri" w:hAnsi="Calibri"/>
+                <w:sz w:val="22"/>
+                <w:szCs w:val="22"/>
+              </w:rPr>
+              <w:t xml:space="preserve">A leading asset management firm</w:t>
+            </w:r>
+          </w:p>
+          <w:p>
+            <w:pPr>
+              <w:spacing w:after="90"/>
+            </w:pPr>
+            <w:r>
+              <w:rPr>
+                <w:rFonts w:ascii="Calibri" w:cs="Calibri" w:eastAsia="Calibri" w:hAnsi="Calibri"/>
+                <w:b/>
+                <w:bCs/>
+                <w:color w:val="22205D"/>
+                <w:sz w:val="22"/>
+                <w:szCs w:val="22"/>
+              </w:rPr>
+              <w:t xml:space="preserve">Headline  </w:t>
+            </w:r>
+            <w:r>
+              <w:rPr>
+                <w:rFonts w:ascii="Calibri" w:cs="Calibri" w:eastAsia="Calibri" w:hAnsi="Calibri"/>
+                <w:sz w:val="22"/>
+                <w:szCs w:val="22"/>
+              </w:rPr>
+              <w:t xml:space="preserve">AI Powered Funds Information Discovery</w:t>
+            </w:r>
+          </w:p>
+          <w:p>
+            <w:pPr>
+              <w:spacing w:after="90"/>
+            </w:pPr>
+            <w:r>
+              <w:rPr>
+                <w:rFonts w:ascii="Calibri" w:cs="Calibri" w:eastAsia="Calibri" w:hAnsi="Calibri"/>
+                <w:b/>
+                <w:bCs/>
+                <w:color w:val="22205D"/>
+                <w:sz w:val="22"/>
+                <w:szCs w:val="22"/>
+              </w:rPr>
+              <w:t xml:space="preserve">Summary  </w:t>
+            </w:r>
+            <w:r>
+              <w:rPr>
+                <w:rFonts w:ascii="Calibri" w:cs="Calibri" w:eastAsia="Calibri" w:hAnsi="Calibri"/>
+                <w:sz w:val="22"/>
+                <w:szCs w:val="22"/>
+              </w:rPr>
+              <w:t xml:space="preserve">An LLM investment assistant that turns long fund reports into plain language answers for investors.</w:t>
+            </w:r>
+          </w:p>
+          <w:p>
+            <w:pPr>
+              <w:spacing w:after="90"/>
+            </w:pPr>
+            <w:r>
+              <w:rPr>
+                <w:rFonts w:ascii="Calibri" w:cs="Calibri" w:eastAsia="Calibri" w:hAnsi="Calibri"/>
+                <w:b/>
+                <w:bCs/>
+                <w:color w:val="22205D"/>
+                <w:sz w:val="22"/>
+                <w:szCs w:val="22"/>
+              </w:rPr>
+              <w:t xml:space="preserve">Tags  </w:t>
+            </w:r>
+            <w:r>
+              <w:rPr>
+                <w:rFonts w:ascii="Calibri" w:cs="Calibri" w:eastAsia="Calibri" w:hAnsi="Calibri"/>
+                <w:sz w:val="22"/>
+                <w:szCs w:val="22"/>
+              </w:rPr>
+              <w:t xml:space="preserve">Financial Services  Â·  AI and LLM  Â·  Conversational AI</w:t>
+            </w:r>
+          </w:p>
+          <w:p>
+            <w:pPr>
+              <w:spacing w:after="90"/>
+            </w:pPr>
+            <w:r>
+              <w:rPr>
+                <w:rFonts w:ascii="Calibri" w:cs="Calibri" w:eastAsia="Calibri" w:hAnsi="Calibri"/>
+                <w:b/>
+                <w:bCs/>
+                <w:color w:val="22205D"/>
+                <w:sz w:val="22"/>
+                <w:szCs w:val="22"/>
+              </w:rPr>
+              <w:t xml:space="preserve">The Challenge  </w:t>
+            </w:r>
+            <w:r>
+              <w:rPr>
+                <w:rFonts w:ascii="Calibri" w:cs="Calibri" w:eastAsia="Calibri" w:hAnsi="Calibri"/>
+                <w:sz w:val="22"/>
+                <w:szCs w:val="22"/>
+              </w:rPr>
+              <w:t xml:space="preserve"/>
+            </w:r>
+          </w:p>
+          <w:p>
+            <w:pPr>
+              <w:spacing w:after="90"/>
+            </w:pPr>
+            <w:r>
+              <w:rPr>
+                <w:rFonts w:ascii="Calibri" w:cs="Calibri" w:eastAsia="Calibri" w:hAnsi="Calibri"/>
+                <w:sz w:val="22"/>
+                <w:szCs w:val="22"/>
+              </w:rPr>
+              <w:t xml:space="preserve">â€¢  Investors faced 40+ page fund reports and slow, manual research.</w:t>
+            </w:r>
+          </w:p>
+          <w:p>
+            <w:pPr>
+              <w:spacing w:after="90"/>
+            </w:pPr>
+            <w:r>
+              <w:rPr>
+                <w:rFonts w:ascii="Calibri" w:cs="Calibri" w:eastAsia="Calibri" w:hAnsi="Calibri"/>
+                <w:sz w:val="22"/>
+                <w:szCs w:val="22"/>
+              </w:rPr>
+              <w:t xml:space="preserve">â€¢  Risk profiling was unclear, which led to poor fund selection.</w:t>
+            </w:r>
+          </w:p>
+          <w:p>
+            <w:pPr>
+              <w:spacing w:after="90"/>
+            </w:pPr>
+            <w:r>
+              <w:rPr>
+                <w:rFonts w:ascii="Calibri" w:cs="Calibri" w:eastAsia="Calibri" w:hAnsi="Calibri"/>
+                <w:sz w:val="22"/>
+                <w:szCs w:val="22"/>
+              </w:rPr>
+              <w:t xml:space="preserve">â€¢  Basic fund details were hard to find, and support was delayed by manual processes.</w:t>
+            </w:r>
+          </w:p>
+          <w:p>
+            <w:pPr>
+              <w:spacing w:after="90"/>
+            </w:pPr>
+            <w:r>
+              <w:rPr>
+                <w:rFonts w:ascii="Calibri" w:cs="Calibri" w:eastAsia="Calibri" w:hAnsi="Calibri"/>
+                <w:b/>
+                <w:bCs/>
+                <w:color w:val="22205D"/>
+                <w:sz w:val="22"/>
+                <w:szCs w:val="22"/>
+              </w:rPr>
+              <w:t xml:space="preserve">What xLoop Delivered  </w:t>
+            </w:r>
+            <w:r>
+              <w:rPr>
+                <w:rFonts w:ascii="Calibri" w:cs="Calibri" w:eastAsia="Calibri" w:hAnsi="Calibri"/>
+                <w:sz w:val="22"/>
+                <w:szCs w:val="22"/>
+              </w:rPr>
+              <w:t xml:space="preserve"/>
+            </w:r>
+          </w:p>
+          <w:p>
+            <w:pPr>
+              <w:spacing w:after="90"/>
+            </w:pPr>
+            <w:r>
+              <w:rPr>
+                <w:rFonts w:ascii="Calibri" w:cs="Calibri" w:eastAsia="Calibri" w:hAnsi="Calibri"/>
+                <w:sz w:val="22"/>
+                <w:szCs w:val="22"/>
+              </w:rPr>
+              <w:t xml:space="preserve">1  Risk Profiling: Investors describe their goals in plain language and get a risk profile.</w:t>
+            </w:r>
+          </w:p>
+          <w:p>
+            <w:pPr>
+              <w:spacing w:after="90"/>
+            </w:pPr>
+            <w:r>
+              <w:rPr>
+                <w:rFonts w:ascii="Calibri" w:cs="Calibri" w:eastAsia="Calibri" w:hAnsi="Calibri"/>
+                <w:sz w:val="22"/>
+                <w:szCs w:val="22"/>
+              </w:rPr>
+              <w:t xml:space="preserve">2  Fund Suggestions: Personalized fund suggestions matched to each investor's profile.</w:t>
+            </w:r>
+          </w:p>
+          <w:p>
+            <w:pPr>
+              <w:spacing w:after="90"/>
+            </w:pPr>
+            <w:r>
+              <w:rPr>
+                <w:rFonts w:ascii="Calibri" w:cs="Calibri" w:eastAsia="Calibri" w:hAnsi="Calibri"/>
+                <w:sz w:val="22"/>
+                <w:szCs w:val="22"/>
+              </w:rPr>
+              <w:t xml:space="preserve">3  Fund Comparison: Side by side comparison of fund performance, returns and risk.</w:t>
+            </w:r>
+          </w:p>
+          <w:p>
+            <w:pPr>
+              <w:spacing w:after="90"/>
+            </w:pPr>
+            <w:r>
+              <w:rPr>
+                <w:rFonts w:ascii="Calibri" w:cs="Calibri" w:eastAsia="Calibri" w:hAnsi="Calibri"/>
+                <w:sz w:val="22"/>
+                <w:szCs w:val="22"/>
+              </w:rPr>
+              <w:t xml:space="preserve">4  Always On Assistant: A conversational interface available 24/7, with no complex navigation.</w:t>
+            </w:r>
+          </w:p>
+          <w:p>
+            <w:pPr>
+              <w:spacing w:after="90"/>
+            </w:pPr>
+            <w:r>
+              <w:rPr>
+                <w:rFonts w:ascii="Calibri" w:cs="Calibri" w:eastAsia="Calibri" w:hAnsi="Calibri"/>
+                <w:b/>
+                <w:bCs/>
+                <w:color w:val="22205D"/>
+                <w:sz w:val="22"/>
+                <w:szCs w:val="22"/>
+              </w:rPr>
+              <w:t xml:space="preserve">Business Value  </w:t>
+            </w:r>
+            <w:r>
+              <w:rPr>
+                <w:rFonts w:ascii="Calibri" w:cs="Calibri" w:eastAsia="Calibri" w:hAnsi="Calibri"/>
+                <w:sz w:val="22"/>
+                <w:szCs w:val="22"/>
+              </w:rPr>
+              <w:t xml:space="preserve">Faster investor research  Â·  Clearer risk profiling  Â·  24/7 investor support  Â·  Less manual support work</w:t>
+            </w:r>
+          </w:p>
+        </w:tc>
+      </w:tr>
+    </w:tbl>
     <w:p>
       <w:pPr>
         <w:pStyle w:val="Heading2"/>
@@ -3843,6 +4992,1365 @@
     </w:p>
     <w:p>
       <w:pPr>
+        <w:spacing w:after="120"/>
+      </w:pPr>
+      <w:r>
+        <w:rPr>
+          <w:rFonts w:ascii="Calibri" w:cs="Calibri" w:eastAsia="Calibri" w:hAnsi="Calibri"/>
+          <w:b/>
+          <w:bCs/>
+          <w:sz w:val="22"/>
+          <w:szCs w:val="22"/>
+        </w:rPr>
+        <w:t xml:space="preserve">Source: </w:t>
+      </w:r>
+      <w:r>
+        <w:rPr>
+          <w:rFonts w:ascii="Calibri" w:cs="Calibri" w:eastAsia="Calibri" w:hAnsi="Calibri"/>
+          <w:sz w:val="22"/>
+          <w:szCs w:val="22"/>
+        </w:rPr>
+        <w:t xml:space="preserve">slide 25. Rebuild on the slide 36 layout with the copy below. Reuse the current image.</w:t>
+      </w:r>
+    </w:p>
+    <w:tbl>
+      <w:tblPr>
+        <w:tblW w:type="dxa" w:w="9360"/>
+        <w:tblBorders>
+          <w:top w:val="single" w:color="D5D9E6" w:sz="4"/>
+          <w:left w:val="single" w:color="D5D9E6" w:sz="4"/>
+          <w:bottom w:val="single" w:color="D5D9E6" w:sz="4"/>
+          <w:right w:val="single" w:color="D5D9E6" w:sz="4"/>
+          <w:insideH w:val="single" w:color="D5D9E6" w:sz="4"/>
+          <w:insideV w:val="single" w:color="D5D9E6" w:sz="4"/>
+        </w:tblBorders>
+      </w:tblPr>
+      <w:tblGrid>
+        <w:gridCol w:w="9360"/>
+      </w:tblGrid>
+      <w:tr>
+        <w:trPr>
+          <w:cantSplit/>
+        </w:trPr>
+        <w:tc>
+          <w:tcPr>
+            <w:tcW w:type="dxa" w:w="9360"/>
+            <w:shd w:fill="EEF1F8" w:color="auto" w:val="clear"/>
+            <w:tcMar>
+              <w:top w:type="dxa" w:w="140"/>
+              <w:left w:type="dxa" w:w="180"/>
+              <w:bottom w:type="dxa" w:w="140"/>
+              <w:right w:type="dxa" w:w="180"/>
+            </w:tcMar>
+          </w:tcPr>
+          <w:p>
+            <w:pPr>
+              <w:spacing w:after="90"/>
+            </w:pPr>
+            <w:r>
+              <w:rPr>
+                <w:rFonts w:ascii="Calibri" w:cs="Calibri" w:eastAsia="Calibri" w:hAnsi="Calibri"/>
+                <w:b/>
+                <w:bCs/>
+                <w:color w:val="22205D"/>
+                <w:sz w:val="22"/>
+                <w:szCs w:val="22"/>
+              </w:rPr>
+              <w:t xml:space="preserve">Client  </w:t>
+            </w:r>
+            <w:r>
+              <w:rPr>
+                <w:rFonts w:ascii="Calibri" w:cs="Calibri" w:eastAsia="Calibri" w:hAnsi="Calibri"/>
+                <w:sz w:val="22"/>
+                <w:szCs w:val="22"/>
+              </w:rPr>
+              <w:t xml:space="preserve">A leading South African retailer</w:t>
+            </w:r>
+          </w:p>
+          <w:p>
+            <w:pPr>
+              <w:spacing w:after="90"/>
+            </w:pPr>
+            <w:r>
+              <w:rPr>
+                <w:rFonts w:ascii="Calibri" w:cs="Calibri" w:eastAsia="Calibri" w:hAnsi="Calibri"/>
+                <w:b/>
+                <w:bCs/>
+                <w:color w:val="22205D"/>
+                <w:sz w:val="22"/>
+                <w:szCs w:val="22"/>
+              </w:rPr>
+              <w:t xml:space="preserve">Headline  </w:t>
+            </w:r>
+            <w:r>
+              <w:rPr>
+                <w:rFonts w:ascii="Calibri" w:cs="Calibri" w:eastAsia="Calibri" w:hAnsi="Calibri"/>
+                <w:sz w:val="22"/>
+                <w:szCs w:val="22"/>
+              </w:rPr>
+              <w:t xml:space="preserve">Data Strategy and Migration to Snowflake</w:t>
+            </w:r>
+          </w:p>
+          <w:p>
+            <w:pPr>
+              <w:spacing w:after="90"/>
+            </w:pPr>
+            <w:r>
+              <w:rPr>
+                <w:rFonts w:ascii="Calibri" w:cs="Calibri" w:eastAsia="Calibri" w:hAnsi="Calibri"/>
+                <w:b/>
+                <w:bCs/>
+                <w:color w:val="22205D"/>
+                <w:sz w:val="22"/>
+                <w:szCs w:val="22"/>
+              </w:rPr>
+              <w:t xml:space="preserve">Summary  </w:t>
+            </w:r>
+            <w:r>
+              <w:rPr>
+                <w:rFonts w:ascii="Calibri" w:cs="Calibri" w:eastAsia="Calibri" w:hAnsi="Calibri"/>
+                <w:sz w:val="22"/>
+                <w:szCs w:val="22"/>
+              </w:rPr>
+              <w:t xml:space="preserve">One trusted source of truth for reporting, data analysis, data science and AI.</w:t>
+            </w:r>
+          </w:p>
+          <w:p>
+            <w:pPr>
+              <w:spacing w:after="90"/>
+            </w:pPr>
+            <w:r>
+              <w:rPr>
+                <w:rFonts w:ascii="Calibri" w:cs="Calibri" w:eastAsia="Calibri" w:hAnsi="Calibri"/>
+                <w:b/>
+                <w:bCs/>
+                <w:color w:val="22205D"/>
+                <w:sz w:val="22"/>
+                <w:szCs w:val="22"/>
+              </w:rPr>
+              <w:t xml:space="preserve">Tags  </w:t>
+            </w:r>
+            <w:r>
+              <w:rPr>
+                <w:rFonts w:ascii="Calibri" w:cs="Calibri" w:eastAsia="Calibri" w:hAnsi="Calibri"/>
+                <w:sz w:val="22"/>
+                <w:szCs w:val="22"/>
+              </w:rPr>
+              <w:t xml:space="preserve">Retail  Â·  Data Platform  Â·  Snowflake on AWS</w:t>
+            </w:r>
+          </w:p>
+          <w:p>
+            <w:pPr>
+              <w:spacing w:after="90"/>
+            </w:pPr>
+            <w:r>
+              <w:rPr>
+                <w:rFonts w:ascii="Calibri" w:cs="Calibri" w:eastAsia="Calibri" w:hAnsi="Calibri"/>
+                <w:b/>
+                <w:bCs/>
+                <w:color w:val="22205D"/>
+                <w:sz w:val="22"/>
+                <w:szCs w:val="22"/>
+              </w:rPr>
+              <w:t xml:space="preserve">The Challenge  </w:t>
+            </w:r>
+            <w:r>
+              <w:rPr>
+                <w:rFonts w:ascii="Calibri" w:cs="Calibri" w:eastAsia="Calibri" w:hAnsi="Calibri"/>
+                <w:sz w:val="22"/>
+                <w:szCs w:val="22"/>
+              </w:rPr>
+              <w:t xml:space="preserve"/>
+            </w:r>
+          </w:p>
+          <w:p>
+            <w:pPr>
+              <w:spacing w:after="90"/>
+            </w:pPr>
+            <w:r>
+              <w:rPr>
+                <w:rFonts w:ascii="Calibri" w:cs="Calibri" w:eastAsia="Calibri" w:hAnsi="Calibri"/>
+                <w:sz w:val="22"/>
+                <w:szCs w:val="22"/>
+              </w:rPr>
+              <w:t xml:space="preserve">â€¢  Data was spread across SAP ERP, SAP BW and application databases.</w:t>
+            </w:r>
+          </w:p>
+          <w:p>
+            <w:pPr>
+              <w:spacing w:after="90"/>
+            </w:pPr>
+            <w:r>
+              <w:rPr>
+                <w:rFonts w:ascii="Calibri" w:cs="Calibri" w:eastAsia="Calibri" w:hAnsi="Calibri"/>
+                <w:sz w:val="22"/>
+                <w:szCs w:val="22"/>
+              </w:rPr>
+              <w:t xml:space="preserve">â€¢  Several competing sources of truth, and no unified view.</w:t>
+            </w:r>
+          </w:p>
+          <w:p>
+            <w:pPr>
+              <w:spacing w:after="90"/>
+            </w:pPr>
+            <w:r>
+              <w:rPr>
+                <w:rFonts w:ascii="Calibri" w:cs="Calibri" w:eastAsia="Calibri" w:hAnsi="Calibri"/>
+                <w:sz w:val="22"/>
+                <w:szCs w:val="22"/>
+              </w:rPr>
+              <w:t xml:space="preserve">â€¢  Reporting and analysis could not rely on one consistent set of numbers.</w:t>
+            </w:r>
+          </w:p>
+          <w:p>
+            <w:pPr>
+              <w:spacing w:after="90"/>
+            </w:pPr>
+            <w:r>
+              <w:rPr>
+                <w:rFonts w:ascii="Calibri" w:cs="Calibri" w:eastAsia="Calibri" w:hAnsi="Calibri"/>
+                <w:b/>
+                <w:bCs/>
+                <w:color w:val="22205D"/>
+                <w:sz w:val="22"/>
+                <w:szCs w:val="22"/>
+              </w:rPr>
+              <w:t xml:space="preserve">What xLoop Delivered  </w:t>
+            </w:r>
+            <w:r>
+              <w:rPr>
+                <w:rFonts w:ascii="Calibri" w:cs="Calibri" w:eastAsia="Calibri" w:hAnsi="Calibri"/>
+                <w:sz w:val="22"/>
+                <w:szCs w:val="22"/>
+              </w:rPr>
+              <w:t xml:space="preserve"/>
+            </w:r>
+          </w:p>
+          <w:p>
+            <w:pPr>
+              <w:spacing w:after="90"/>
+            </w:pPr>
+            <w:r>
+              <w:rPr>
+                <w:rFonts w:ascii="Calibri" w:cs="Calibri" w:eastAsia="Calibri" w:hAnsi="Calibri"/>
+                <w:sz w:val="22"/>
+                <w:szCs w:val="22"/>
+              </w:rPr>
+              <w:t xml:space="preserve">1  Data Strategy: Defined the migration and analytics strategy.</w:t>
+            </w:r>
+          </w:p>
+          <w:p>
+            <w:pPr>
+              <w:spacing w:after="90"/>
+            </w:pPr>
+            <w:r>
+              <w:rPr>
+                <w:rFonts w:ascii="Calibri" w:cs="Calibri" w:eastAsia="Calibri" w:hAnsi="Calibri"/>
+                <w:sz w:val="22"/>
+                <w:szCs w:val="22"/>
+              </w:rPr>
+              <w:t xml:space="preserve">2  Central Data Warehouse: Built on Snowflake with a medallion architecture.</w:t>
+            </w:r>
+          </w:p>
+          <w:p>
+            <w:pPr>
+              <w:spacing w:after="90"/>
+            </w:pPr>
+            <w:r>
+              <w:rPr>
+                <w:rFonts w:ascii="Calibri" w:cs="Calibri" w:eastAsia="Calibri" w:hAnsi="Calibri"/>
+                <w:sz w:val="22"/>
+                <w:szCs w:val="22"/>
+              </w:rPr>
+              <w:t xml:space="preserve">3  Lakehouse Migration: Moved data from traditional databases to a cloud lakehouse on Snowflake and AWS.</w:t>
+            </w:r>
+          </w:p>
+          <w:p>
+            <w:pPr>
+              <w:spacing w:after="90"/>
+            </w:pPr>
+            <w:r>
+              <w:rPr>
+                <w:rFonts w:ascii="Calibri" w:cs="Calibri" w:eastAsia="Calibri" w:hAnsi="Calibri"/>
+                <w:sz w:val="22"/>
+                <w:szCs w:val="22"/>
+              </w:rPr>
+              <w:t xml:space="preserve">4  Pipeline Optimization: Optimized the pipelines end to end, from data creation to use.</w:t>
+            </w:r>
+          </w:p>
+          <w:p>
+            <w:pPr>
+              <w:spacing w:after="90"/>
+            </w:pPr>
+            <w:r>
+              <w:rPr>
+                <w:rFonts w:ascii="Calibri" w:cs="Calibri" w:eastAsia="Calibri" w:hAnsi="Calibri"/>
+                <w:b/>
+                <w:bCs/>
+                <w:color w:val="22205D"/>
+                <w:sz w:val="22"/>
+                <w:szCs w:val="22"/>
+              </w:rPr>
+              <w:t xml:space="preserve">Business Value  </w:t>
+            </w:r>
+            <w:r>
+              <w:rPr>
+                <w:rFonts w:ascii="Calibri" w:cs="Calibri" w:eastAsia="Calibri" w:hAnsi="Calibri"/>
+                <w:sz w:val="22"/>
+                <w:szCs w:val="22"/>
+              </w:rPr>
+              <w:t xml:space="preserve">Single source of truth  Â·  Consistent reporting  Â·  Ready for data science and AI  Â·  Scalable cloud platform</w:t>
+            </w:r>
+          </w:p>
+        </w:tc>
+      </w:tr>
+    </w:tbl>
+    <w:p>
+      <w:pPr>
+        <w:pStyle w:val="Heading2"/>
+        <w:keepNext/>
+        <w:spacing w:after="120" w:before="280"/>
+      </w:pPr>
+      <w:r>
+        <w:rPr>
+          <w:rFonts w:ascii="Calibri" w:cs="Calibri" w:eastAsia="Calibri" w:hAnsi="Calibri"/>
+          <w:b/>
+          <w:bCs/>
+          <w:color w:val="22205D"/>
+          <w:sz w:val="28"/>
+          <w:szCs w:val="28"/>
+        </w:rPr>
+        <w:t xml:space="preserve">Slide 7: Healthcare, AI search over recordings</w:t>
+      </w:r>
+    </w:p>
+    <w:p>
+      <w:pPr>
+        <w:spacing w:after="120"/>
+      </w:pPr>
+      <w:r>
+        <w:rPr>
+          <w:rFonts w:ascii="Calibri" w:cs="Calibri" w:eastAsia="Calibri" w:hAnsi="Calibri"/>
+          <w:b/>
+          <w:bCs/>
+          <w:sz w:val="22"/>
+          <w:szCs w:val="22"/>
+        </w:rPr>
+        <w:t xml:space="preserve">Source: </w:t>
+      </w:r>
+      <w:r>
+        <w:rPr>
+          <w:rFonts w:ascii="Calibri" w:cs="Calibri" w:eastAsia="Calibri" w:hAnsi="Calibri"/>
+          <w:sz w:val="22"/>
+          <w:szCs w:val="22"/>
+        </w:rPr>
+        <w:t xml:space="preserve">slide 28. Rebuild on the slide 36 layout with the copy below. Reuse the current image.</w:t>
+      </w:r>
+    </w:p>
+    <w:tbl>
+      <w:tblPr>
+        <w:tblW w:type="dxa" w:w="9360"/>
+        <w:tblBorders>
+          <w:top w:val="single" w:color="D5D9E6" w:sz="4"/>
+          <w:left w:val="single" w:color="D5D9E6" w:sz="4"/>
+          <w:bottom w:val="single" w:color="D5D9E6" w:sz="4"/>
+          <w:right w:val="single" w:color="D5D9E6" w:sz="4"/>
+          <w:insideH w:val="single" w:color="D5D9E6" w:sz="4"/>
+          <w:insideV w:val="single" w:color="D5D9E6" w:sz="4"/>
+        </w:tblBorders>
+      </w:tblPr>
+      <w:tblGrid>
+        <w:gridCol w:w="9360"/>
+      </w:tblGrid>
+      <w:tr>
+        <w:trPr>
+          <w:cantSplit/>
+        </w:trPr>
+        <w:tc>
+          <w:tcPr>
+            <w:tcW w:type="dxa" w:w="9360"/>
+            <w:shd w:fill="EEF1F8" w:color="auto" w:val="clear"/>
+            <w:tcMar>
+              <w:top w:type="dxa" w:w="140"/>
+              <w:left w:type="dxa" w:w="180"/>
+              <w:bottom w:type="dxa" w:w="140"/>
+              <w:right w:type="dxa" w:w="180"/>
+            </w:tcMar>
+          </w:tcPr>
+          <w:p>
+            <w:pPr>
+              <w:spacing w:after="90"/>
+            </w:pPr>
+            <w:r>
+              <w:rPr>
+                <w:rFonts w:ascii="Calibri" w:cs="Calibri" w:eastAsia="Calibri" w:hAnsi="Calibri"/>
+                <w:b/>
+                <w:bCs/>
+                <w:color w:val="22205D"/>
+                <w:sz w:val="22"/>
+                <w:szCs w:val="22"/>
+              </w:rPr>
+              <w:t xml:space="preserve">Client  </w:t>
+            </w:r>
+            <w:r>
+              <w:rPr>
+                <w:rFonts w:ascii="Calibri" w:cs="Calibri" w:eastAsia="Calibri" w:hAnsi="Calibri"/>
+                <w:sz w:val="22"/>
+                <w:szCs w:val="22"/>
+              </w:rPr>
+              <w:t xml:space="preserve">A Canadian healthcare platform</w:t>
+            </w:r>
+          </w:p>
+          <w:p>
+            <w:pPr>
+              <w:spacing w:after="90"/>
+            </w:pPr>
+            <w:r>
+              <w:rPr>
+                <w:rFonts w:ascii="Calibri" w:cs="Calibri" w:eastAsia="Calibri" w:hAnsi="Calibri"/>
+                <w:b/>
+                <w:bCs/>
+                <w:color w:val="22205D"/>
+                <w:sz w:val="22"/>
+                <w:szCs w:val="22"/>
+              </w:rPr>
+              <w:t xml:space="preserve">Headline  </w:t>
+            </w:r>
+            <w:r>
+              <w:rPr>
+                <w:rFonts w:ascii="Calibri" w:cs="Calibri" w:eastAsia="Calibri" w:hAnsi="Calibri"/>
+                <w:sz w:val="22"/>
+                <w:szCs w:val="22"/>
+              </w:rPr>
+              <w:t xml:space="preserve">AI Search Across Thousands of Recordings</w:t>
+            </w:r>
+          </w:p>
+          <w:p>
+            <w:pPr>
+              <w:spacing w:after="90"/>
+            </w:pPr>
+            <w:r>
+              <w:rPr>
+                <w:rFonts w:ascii="Calibri" w:cs="Calibri" w:eastAsia="Calibri" w:hAnsi="Calibri"/>
+                <w:b/>
+                <w:bCs/>
+                <w:color w:val="22205D"/>
+                <w:sz w:val="22"/>
+                <w:szCs w:val="22"/>
+              </w:rPr>
+              <w:t xml:space="preserve">Summary  </w:t>
+            </w:r>
+            <w:r>
+              <w:rPr>
+                <w:rFonts w:ascii="Calibri" w:cs="Calibri" w:eastAsia="Calibri" w:hAnsi="Calibri"/>
+                <w:sz w:val="22"/>
+                <w:szCs w:val="22"/>
+              </w:rPr>
+              <w:t xml:space="preserve">Staff ask a question in plain language and get answers from the full recordings archive.</w:t>
+            </w:r>
+          </w:p>
+          <w:p>
+            <w:pPr>
+              <w:spacing w:after="90"/>
+            </w:pPr>
+            <w:r>
+              <w:rPr>
+                <w:rFonts w:ascii="Calibri" w:cs="Calibri" w:eastAsia="Calibri" w:hAnsi="Calibri"/>
+                <w:b/>
+                <w:bCs/>
+                <w:color w:val="22205D"/>
+                <w:sz w:val="22"/>
+                <w:szCs w:val="22"/>
+              </w:rPr>
+              <w:t xml:space="preserve">Tags  </w:t>
+            </w:r>
+            <w:r>
+              <w:rPr>
+                <w:rFonts w:ascii="Calibri" w:cs="Calibri" w:eastAsia="Calibri" w:hAnsi="Calibri"/>
+                <w:sz w:val="22"/>
+                <w:szCs w:val="22"/>
+              </w:rPr>
+              <w:t xml:space="preserve">Healthcare  Â·  AI and RAG  Â·  Conversational AI</w:t>
+            </w:r>
+          </w:p>
+          <w:p>
+            <w:pPr>
+              <w:spacing w:after="90"/>
+            </w:pPr>
+            <w:r>
+              <w:rPr>
+                <w:rFonts w:ascii="Calibri" w:cs="Calibri" w:eastAsia="Calibri" w:hAnsi="Calibri"/>
+                <w:b/>
+                <w:bCs/>
+                <w:color w:val="22205D"/>
+                <w:sz w:val="22"/>
+                <w:szCs w:val="22"/>
+              </w:rPr>
+              <w:t xml:space="preserve">The Challenge  </w:t>
+            </w:r>
+            <w:r>
+              <w:rPr>
+                <w:rFonts w:ascii="Calibri" w:cs="Calibri" w:eastAsia="Calibri" w:hAnsi="Calibri"/>
+                <w:sz w:val="22"/>
+                <w:szCs w:val="22"/>
+              </w:rPr>
+              <w:t xml:space="preserve"/>
+            </w:r>
+          </w:p>
+          <w:p>
+            <w:pPr>
+              <w:spacing w:after="90"/>
+            </w:pPr>
+            <w:r>
+              <w:rPr>
+                <w:rFonts w:ascii="Calibri" w:cs="Calibri" w:eastAsia="Calibri" w:hAnsi="Calibri"/>
+                <w:sz w:val="22"/>
+                <w:szCs w:val="22"/>
+              </w:rPr>
+              <w:t xml:space="preserve">â€¢  Thousands of video recordings sat unprocessed in the cloud.</w:t>
+            </w:r>
+          </w:p>
+          <w:p>
+            <w:pPr>
+              <w:spacing w:after="90"/>
+            </w:pPr>
+            <w:r>
+              <w:rPr>
+                <w:rFonts w:ascii="Calibri" w:cs="Calibri" w:eastAsia="Calibri" w:hAnsi="Calibri"/>
+                <w:sz w:val="22"/>
+                <w:szCs w:val="22"/>
+              </w:rPr>
+              <w:t xml:space="preserve">â€¢  Key insights were buried in hours of conversations, with no way to retrieve them.</w:t>
+            </w:r>
+          </w:p>
+          <w:p>
+            <w:pPr>
+              <w:spacing w:after="90"/>
+            </w:pPr>
+            <w:r>
+              <w:rPr>
+                <w:rFonts w:ascii="Calibri" w:cs="Calibri" w:eastAsia="Calibri" w:hAnsi="Calibri"/>
+                <w:sz w:val="22"/>
+                <w:szCs w:val="22"/>
+              </w:rPr>
+              <w:t xml:space="preserve">â€¢  Staff had no practical way to find relevant information on demand.</w:t>
+            </w:r>
+          </w:p>
+          <w:p>
+            <w:pPr>
+              <w:spacing w:after="90"/>
+            </w:pPr>
+            <w:r>
+              <w:rPr>
+                <w:rFonts w:ascii="Calibri" w:cs="Calibri" w:eastAsia="Calibri" w:hAnsi="Calibri"/>
+                <w:b/>
+                <w:bCs/>
+                <w:color w:val="22205D"/>
+                <w:sz w:val="22"/>
+                <w:szCs w:val="22"/>
+              </w:rPr>
+              <w:t xml:space="preserve">What xLoop Delivered  </w:t>
+            </w:r>
+            <w:r>
+              <w:rPr>
+                <w:rFonts w:ascii="Calibri" w:cs="Calibri" w:eastAsia="Calibri" w:hAnsi="Calibri"/>
+                <w:sz w:val="22"/>
+                <w:szCs w:val="22"/>
+              </w:rPr>
+              <w:t xml:space="preserve"/>
+            </w:r>
+          </w:p>
+          <w:p>
+            <w:pPr>
+              <w:spacing w:after="90"/>
+            </w:pPr>
+            <w:r>
+              <w:rPr>
+                <w:rFonts w:ascii="Calibri" w:cs="Calibri" w:eastAsia="Calibri" w:hAnsi="Calibri"/>
+                <w:sz w:val="22"/>
+                <w:szCs w:val="22"/>
+              </w:rPr>
+              <w:t xml:space="preserve">1  Transcription Engine: Converted historical recordings into searchable text, stored securely in Amazon S3.</w:t>
+            </w:r>
+          </w:p>
+          <w:p>
+            <w:pPr>
+              <w:spacing w:after="90"/>
+            </w:pPr>
+            <w:r>
+              <w:rPr>
+                <w:rFonts w:ascii="Calibri" w:cs="Calibri" w:eastAsia="Calibri" w:hAnsi="Calibri"/>
+                <w:sz w:val="22"/>
+                <w:szCs w:val="22"/>
+              </w:rPr>
+              <w:t xml:space="preserve">2  Retrieval Augmented Generation: An LLM finds and puts into context the relevant parts of the transcripts.</w:t>
+            </w:r>
+          </w:p>
+          <w:p>
+            <w:pPr>
+              <w:spacing w:after="90"/>
+            </w:pPr>
+            <w:r>
+              <w:rPr>
+                <w:rFonts w:ascii="Calibri" w:cs="Calibri" w:eastAsia="Calibri" w:hAnsi="Calibri"/>
+                <w:sz w:val="22"/>
+                <w:szCs w:val="22"/>
+              </w:rPr>
+              <w:t xml:space="preserve">3  Natural Language Chatbot: Staff ask questions and get contextual answers instantly.</w:t>
+            </w:r>
+          </w:p>
+          <w:p>
+            <w:pPr>
+              <w:spacing w:after="90"/>
+            </w:pPr>
+            <w:r>
+              <w:rPr>
+                <w:rFonts w:ascii="Calibri" w:cs="Calibri" w:eastAsia="Calibri" w:hAnsi="Calibri"/>
+                <w:sz w:val="22"/>
+                <w:szCs w:val="22"/>
+              </w:rPr>
+              <w:t xml:space="preserve">4  React Dashboard: A simple front end for staff to search and review.</w:t>
+            </w:r>
+          </w:p>
+          <w:p>
+            <w:pPr>
+              <w:spacing w:after="90"/>
+            </w:pPr>
+            <w:r>
+              <w:rPr>
+                <w:rFonts w:ascii="Calibri" w:cs="Calibri" w:eastAsia="Calibri" w:hAnsi="Calibri"/>
+                <w:b/>
+                <w:bCs/>
+                <w:color w:val="22205D"/>
+                <w:sz w:val="22"/>
+                <w:szCs w:val="22"/>
+              </w:rPr>
+              <w:t xml:space="preserve">Business Value  </w:t>
+            </w:r>
+            <w:r>
+              <w:rPr>
+                <w:rFonts w:ascii="Calibri" w:cs="Calibri" w:eastAsia="Calibri" w:hAnsi="Calibri"/>
+                <w:sz w:val="22"/>
+                <w:szCs w:val="22"/>
+              </w:rPr>
+              <w:t xml:space="preserve">Archive fully searchable  Â·  Answers on demand  Â·  Less manual searching  Â·  Insights put to use</w:t>
+            </w:r>
+          </w:p>
+        </w:tc>
+      </w:tr>
+    </w:tbl>
+    <w:p>
+      <w:pPr>
+        <w:pStyle w:val="Heading2"/>
+        <w:keepNext/>
+        <w:spacing w:after="120" w:before="280"/>
+      </w:pPr>
+      <w:r>
+        <w:rPr>
+          <w:rFonts w:ascii="Calibri" w:cs="Calibri" w:eastAsia="Calibri" w:hAnsi="Calibri"/>
+          <w:b/>
+          <w:bCs/>
+          <w:color w:val="22205D"/>
+          <w:sz w:val="28"/>
+          <w:szCs w:val="28"/>
+        </w:rPr>
+        <w:t xml:space="preserve">Slide 8: Middle East, AWS to Azure migration assessment</w:t>
+      </w:r>
+    </w:p>
+    <w:p>
+      <w:pPr>
+        <w:spacing w:after="120"/>
+      </w:pPr>
+      <w:r>
+        <w:rPr>
+          <w:rFonts w:ascii="Calibri" w:cs="Calibri" w:eastAsia="Calibri" w:hAnsi="Calibri"/>
+          <w:b/>
+          <w:bCs/>
+          <w:sz w:val="22"/>
+          <w:szCs w:val="22"/>
+        </w:rPr>
+        <w:t xml:space="preserve">Source: </w:t>
+      </w:r>
+      <w:r>
+        <w:rPr>
+          <w:rFonts w:ascii="Calibri" w:cs="Calibri" w:eastAsia="Calibri" w:hAnsi="Calibri"/>
+          <w:sz w:val="22"/>
+          <w:szCs w:val="22"/>
+        </w:rPr>
+        <w:t xml:space="preserve">slide 36. Keep the layout. Replace the text with the copy below.</w:t>
+      </w:r>
+    </w:p>
+    <w:tbl>
+      <w:tblPr>
+        <w:tblW w:type="dxa" w:w="9360"/>
+        <w:tblBorders>
+          <w:top w:val="single" w:color="D5D9E6" w:sz="4"/>
+          <w:left w:val="single" w:color="D5D9E6" w:sz="4"/>
+          <w:bottom w:val="single" w:color="D5D9E6" w:sz="4"/>
+          <w:right w:val="single" w:color="D5D9E6" w:sz="4"/>
+          <w:insideH w:val="single" w:color="D5D9E6" w:sz="4"/>
+          <w:insideV w:val="single" w:color="D5D9E6" w:sz="4"/>
+        </w:tblBorders>
+      </w:tblPr>
+      <w:tblGrid>
+        <w:gridCol w:w="9360"/>
+      </w:tblGrid>
+      <w:tr>
+        <w:trPr>
+          <w:cantSplit/>
+        </w:trPr>
+        <w:tc>
+          <w:tcPr>
+            <w:tcW w:type="dxa" w:w="9360"/>
+            <w:shd w:fill="EEF1F8" w:color="auto" w:val="clear"/>
+            <w:tcMar>
+              <w:top w:type="dxa" w:w="140"/>
+              <w:left w:type="dxa" w:w="180"/>
+              <w:bottom w:type="dxa" w:w="140"/>
+              <w:right w:type="dxa" w:w="180"/>
+            </w:tcMar>
+          </w:tcPr>
+          <w:p>
+            <w:pPr>
+              <w:spacing w:after="90"/>
+            </w:pPr>
+            <w:r>
+              <w:rPr>
+                <w:rFonts w:ascii="Calibri" w:cs="Calibri" w:eastAsia="Calibri" w:hAnsi="Calibri"/>
+                <w:b/>
+                <w:bCs/>
+                <w:color w:val="22205D"/>
+                <w:sz w:val="22"/>
+                <w:szCs w:val="22"/>
+              </w:rPr>
+              <w:t xml:space="preserve">Client  </w:t>
+            </w:r>
+            <w:r>
+              <w:rPr>
+                <w:rFonts w:ascii="Calibri" w:cs="Calibri" w:eastAsia="Calibri" w:hAnsi="Calibri"/>
+                <w:sz w:val="22"/>
+                <w:szCs w:val="22"/>
+              </w:rPr>
+              <w:t xml:space="preserve">A large retail and real estate group in the Middle East</w:t>
+            </w:r>
+          </w:p>
+          <w:p>
+            <w:pPr>
+              <w:spacing w:after="90"/>
+            </w:pPr>
+            <w:r>
+              <w:rPr>
+                <w:rFonts w:ascii="Calibri" w:cs="Calibri" w:eastAsia="Calibri" w:hAnsi="Calibri"/>
+                <w:b/>
+                <w:bCs/>
+                <w:color w:val="22205D"/>
+                <w:sz w:val="22"/>
+                <w:szCs w:val="22"/>
+              </w:rPr>
+              <w:t xml:space="preserve">Headline  </w:t>
+            </w:r>
+            <w:r>
+              <w:rPr>
+                <w:rFonts w:ascii="Calibri" w:cs="Calibri" w:eastAsia="Calibri" w:hAnsi="Calibri"/>
+                <w:sz w:val="22"/>
+                <w:szCs w:val="22"/>
+              </w:rPr>
+              <w:t xml:space="preserve">AWS to Azure Migration Assessment and Roadmap</w:t>
+            </w:r>
+          </w:p>
+          <w:p>
+            <w:pPr>
+              <w:spacing w:after="90"/>
+            </w:pPr>
+            <w:r>
+              <w:rPr>
+                <w:rFonts w:ascii="Calibri" w:cs="Calibri" w:eastAsia="Calibri" w:hAnsi="Calibri"/>
+                <w:b/>
+                <w:bCs/>
+                <w:color w:val="22205D"/>
+                <w:sz w:val="22"/>
+                <w:szCs w:val="22"/>
+              </w:rPr>
+              <w:t xml:space="preserve">Summary  </w:t>
+            </w:r>
+            <w:r>
+              <w:rPr>
+                <w:rFonts w:ascii="Calibri" w:cs="Calibri" w:eastAsia="Calibri" w:hAnsi="Calibri"/>
+                <w:sz w:val="22"/>
+                <w:szCs w:val="22"/>
+              </w:rPr>
+              <w:t xml:space="preserve">A structured assessment and target state roadmap for a controlled move from AWS to Azure, delivered with Microsoft.</w:t>
+            </w:r>
+          </w:p>
+          <w:p>
+            <w:pPr>
+              <w:spacing w:after="90"/>
+            </w:pPr>
+            <w:r>
+              <w:rPr>
+                <w:rFonts w:ascii="Calibri" w:cs="Calibri" w:eastAsia="Calibri" w:hAnsi="Calibri"/>
+                <w:b/>
+                <w:bCs/>
+                <w:color w:val="22205D"/>
+                <w:sz w:val="22"/>
+                <w:szCs w:val="22"/>
+              </w:rPr>
+              <w:t xml:space="preserve">Tags  </w:t>
+            </w:r>
+            <w:r>
+              <w:rPr>
+                <w:rFonts w:ascii="Calibri" w:cs="Calibri" w:eastAsia="Calibri" w:hAnsi="Calibri"/>
+                <w:sz w:val="22"/>
+                <w:szCs w:val="22"/>
+              </w:rPr>
+              <w:t xml:space="preserve">Retail and Real Estate  Â·  Cloud Migration  Â·  Microsoft Azure</w:t>
+            </w:r>
+          </w:p>
+          <w:p>
+            <w:pPr>
+              <w:spacing w:after="90"/>
+            </w:pPr>
+            <w:r>
+              <w:rPr>
+                <w:rFonts w:ascii="Calibri" w:cs="Calibri" w:eastAsia="Calibri" w:hAnsi="Calibri"/>
+                <w:b/>
+                <w:bCs/>
+                <w:color w:val="22205D"/>
+                <w:sz w:val="22"/>
+                <w:szCs w:val="22"/>
+              </w:rPr>
+              <w:t xml:space="preserve">The Challenge  </w:t>
+            </w:r>
+            <w:r>
+              <w:rPr>
+                <w:rFonts w:ascii="Calibri" w:cs="Calibri" w:eastAsia="Calibri" w:hAnsi="Calibri"/>
+                <w:sz w:val="22"/>
+                <w:szCs w:val="22"/>
+              </w:rPr>
+              <w:t xml:space="preserve"/>
+            </w:r>
+          </w:p>
+          <w:p>
+            <w:pPr>
+              <w:spacing w:after="90"/>
+            </w:pPr>
+            <w:r>
+              <w:rPr>
+                <w:rFonts w:ascii="Calibri" w:cs="Calibri" w:eastAsia="Calibri" w:hAnsi="Calibri"/>
+                <w:sz w:val="22"/>
+                <w:szCs w:val="22"/>
+              </w:rPr>
+              <w:t xml:space="preserve">â€¢  An AWS estate of applications, data and infrastructure, including critical platforms such as Vertica.</w:t>
+            </w:r>
+          </w:p>
+          <w:p>
+            <w:pPr>
+              <w:spacing w:after="90"/>
+            </w:pPr>
+            <w:r>
+              <w:rPr>
+                <w:rFonts w:ascii="Calibri" w:cs="Calibri" w:eastAsia="Calibri" w:hAnsi="Calibri"/>
+                <w:sz w:val="22"/>
+                <w:szCs w:val="22"/>
+              </w:rPr>
+              <w:t xml:space="preserve">â€¢  Many interconnected applications, data sources and business units made dependency mapping complex.</w:t>
+            </w:r>
+          </w:p>
+          <w:p>
+            <w:pPr>
+              <w:spacing w:after="90"/>
+            </w:pPr>
+            <w:r>
+              <w:rPr>
+                <w:rFonts w:ascii="Calibri" w:cs="Calibri" w:eastAsia="Calibri" w:hAnsi="Calibri"/>
+                <w:sz w:val="22"/>
+                <w:szCs w:val="22"/>
+              </w:rPr>
+              <w:t xml:space="preserve">â€¢  Limited visibility into workload readiness, migration effort and business impact.</w:t>
+            </w:r>
+          </w:p>
+          <w:p>
+            <w:pPr>
+              <w:spacing w:after="90"/>
+            </w:pPr>
+            <w:r>
+              <w:rPr>
+                <w:rFonts w:ascii="Calibri" w:cs="Calibri" w:eastAsia="Calibri" w:hAnsi="Calibri"/>
+                <w:b/>
+                <w:bCs/>
+                <w:color w:val="22205D"/>
+                <w:sz w:val="22"/>
+                <w:szCs w:val="22"/>
+              </w:rPr>
+              <w:t xml:space="preserve">What xLoop Delivered  </w:t>
+            </w:r>
+            <w:r>
+              <w:rPr>
+                <w:rFonts w:ascii="Calibri" w:cs="Calibri" w:eastAsia="Calibri" w:hAnsi="Calibri"/>
+                <w:sz w:val="22"/>
+                <w:szCs w:val="22"/>
+              </w:rPr>
+              <w:t xml:space="preserve"/>
+            </w:r>
+          </w:p>
+          <w:p>
+            <w:pPr>
+              <w:spacing w:after="90"/>
+            </w:pPr>
+            <w:r>
+              <w:rPr>
+                <w:rFonts w:ascii="Calibri" w:cs="Calibri" w:eastAsia="Calibri" w:hAnsi="Calibri"/>
+                <w:sz w:val="22"/>
+                <w:szCs w:val="22"/>
+              </w:rPr>
+              <w:t xml:space="preserve">1  Estate and Data Discovery: A 3 to 3.5 month discovery across applications, workloads, data, AWS services and business dependencies.</w:t>
+            </w:r>
+          </w:p>
+          <w:p>
+            <w:pPr>
+              <w:spacing w:after="90"/>
+            </w:pPr>
+            <w:r>
+              <w:rPr>
+                <w:rFonts w:ascii="Calibri" w:cs="Calibri" w:eastAsia="Calibri" w:hAnsi="Calibri"/>
+                <w:sz w:val="22"/>
+                <w:szCs w:val="22"/>
+              </w:rPr>
+              <w:t xml:space="preserve">2  Migration Business Case: A TCO model quantifying Azure adoption benefits, cost optimization and long term savings.</w:t>
+            </w:r>
+          </w:p>
+          <w:p>
+            <w:pPr>
+              <w:spacing w:after="90"/>
+            </w:pPr>
+            <w:r>
+              <w:rPr>
+                <w:rFonts w:ascii="Calibri" w:cs="Calibri" w:eastAsia="Calibri" w:hAnsi="Calibri"/>
+                <w:sz w:val="22"/>
+                <w:szCs w:val="22"/>
+              </w:rPr>
+              <w:t xml:space="preserve">3  Waves and Target Architecture: Phased workload waves and an Azure architecture with landing zones, aligned with Microsoft best practices.</w:t>
+            </w:r>
+          </w:p>
+          <w:p>
+            <w:pPr>
+              <w:spacing w:after="90"/>
+            </w:pPr>
+            <w:r>
+              <w:rPr>
+                <w:rFonts w:ascii="Calibri" w:cs="Calibri" w:eastAsia="Calibri" w:hAnsi="Calibri"/>
+                <w:sz w:val="22"/>
+                <w:szCs w:val="22"/>
+              </w:rPr>
+              <w:t xml:space="preserve">4  Roadmap and Executive Reporting: Current state, target architecture, timelines, risks and recommendations, delivered with Microsoft.</w:t>
+            </w:r>
+          </w:p>
+          <w:p>
+            <w:pPr>
+              <w:spacing w:after="90"/>
+            </w:pPr>
+            <w:r>
+              <w:rPr>
+                <w:rFonts w:ascii="Calibri" w:cs="Calibri" w:eastAsia="Calibri" w:hAnsi="Calibri"/>
+                <w:b/>
+                <w:bCs/>
+                <w:color w:val="22205D"/>
+                <w:sz w:val="22"/>
+                <w:szCs w:val="22"/>
+              </w:rPr>
+              <w:t xml:space="preserve">Business Value  </w:t>
+            </w:r>
+            <w:r>
+              <w:rPr>
+                <w:rFonts w:ascii="Calibri" w:cs="Calibri" w:eastAsia="Calibri" w:hAnsi="Calibri"/>
+                <w:sz w:val="22"/>
+                <w:szCs w:val="22"/>
+              </w:rPr>
+              <w:t xml:space="preserve">Clear migration path  Â·  Quantified TCO and value  Â·  Reduced migration risk  Â·  Azure ready architecture</w:t>
+            </w:r>
+          </w:p>
+        </w:tc>
+      </w:tr>
+    </w:tbl>
+    <w:p>
+      <w:pPr>
+        <w:pStyle w:val="Heading2"/>
+        <w:keepNext/>
+        <w:spacing w:after="120" w:before="280"/>
+      </w:pPr>
+      <w:r>
+        <w:rPr>
+          <w:rFonts w:ascii="Calibri" w:cs="Calibri" w:eastAsia="Calibri" w:hAnsi="Calibri"/>
+          <w:b/>
+          <w:bCs/>
+          <w:color w:val="22205D"/>
+          <w:sz w:val="28"/>
+          <w:szCs w:val="28"/>
+        </w:rPr>
+        <w:t xml:space="preserve">Slide 9: Poland, fintech platform</w:t>
+      </w:r>
+    </w:p>
+    <w:p>
+      <w:pPr>
+        <w:spacing w:after="120"/>
+      </w:pPr>
+      <w:r>
+        <w:rPr>
+          <w:rFonts w:ascii="Calibri" w:cs="Calibri" w:eastAsia="Calibri" w:hAnsi="Calibri"/>
+          <w:b/>
+          <w:bCs/>
+          <w:sz w:val="22"/>
+          <w:szCs w:val="22"/>
+        </w:rPr>
+        <w:t xml:space="preserve">Source: </w:t>
+      </w:r>
+      <w:r>
+        <w:rPr>
+          <w:rFonts w:ascii="Calibri" w:cs="Calibri" w:eastAsia="Calibri" w:hAnsi="Calibri"/>
+          <w:sz w:val="22"/>
+          <w:szCs w:val="22"/>
+        </w:rPr>
+        <w:t xml:space="preserve">slide 62. Rebuild on the slide 36 layout with the copy below. Reuse the current image.</w:t>
+      </w:r>
+    </w:p>
+    <w:tbl>
+      <w:tblPr>
+        <w:tblW w:type="dxa" w:w="9360"/>
+        <w:tblBorders>
+          <w:top w:val="single" w:color="D5D9E6" w:sz="4"/>
+          <w:left w:val="single" w:color="D5D9E6" w:sz="4"/>
+          <w:bottom w:val="single" w:color="D5D9E6" w:sz="4"/>
+          <w:right w:val="single" w:color="D5D9E6" w:sz="4"/>
+          <w:insideH w:val="single" w:color="D5D9E6" w:sz="4"/>
+          <w:insideV w:val="single" w:color="D5D9E6" w:sz="4"/>
+        </w:tblBorders>
+      </w:tblPr>
+      <w:tblGrid>
+        <w:gridCol w:w="9360"/>
+      </w:tblGrid>
+      <w:tr>
+        <w:trPr>
+          <w:cantSplit/>
+        </w:trPr>
+        <w:tc>
+          <w:tcPr>
+            <w:tcW w:type="dxa" w:w="9360"/>
+            <w:shd w:fill="EEF1F8" w:color="auto" w:val="clear"/>
+            <w:tcMar>
+              <w:top w:type="dxa" w:w="140"/>
+              <w:left w:type="dxa" w:w="180"/>
+              <w:bottom w:type="dxa" w:w="140"/>
+              <w:right w:type="dxa" w:w="180"/>
+            </w:tcMar>
+          </w:tcPr>
+          <w:p>
+            <w:pPr>
+              <w:spacing w:after="90"/>
+            </w:pPr>
+            <w:r>
+              <w:rPr>
+                <w:rFonts w:ascii="Calibri" w:cs="Calibri" w:eastAsia="Calibri" w:hAnsi="Calibri"/>
+                <w:b/>
+                <w:bCs/>
+                <w:color w:val="22205D"/>
+                <w:sz w:val="22"/>
+                <w:szCs w:val="22"/>
+              </w:rPr>
+              <w:t xml:space="preserve">Client  </w:t>
+            </w:r>
+            <w:r>
+              <w:rPr>
+                <w:rFonts w:ascii="Calibri" w:cs="Calibri" w:eastAsia="Calibri" w:hAnsi="Calibri"/>
+                <w:sz w:val="22"/>
+                <w:szCs w:val="22"/>
+              </w:rPr>
+              <w:t xml:space="preserve">A Polish fintech company</w:t>
+            </w:r>
+          </w:p>
+          <w:p>
+            <w:pPr>
+              <w:spacing w:after="90"/>
+            </w:pPr>
+            <w:r>
+              <w:rPr>
+                <w:rFonts w:ascii="Calibri" w:cs="Calibri" w:eastAsia="Calibri" w:hAnsi="Calibri"/>
+                <w:b/>
+                <w:bCs/>
+                <w:color w:val="22205D"/>
+                <w:sz w:val="22"/>
+                <w:szCs w:val="22"/>
+              </w:rPr>
+              <w:t xml:space="preserve">Headline  </w:t>
+            </w:r>
+            <w:r>
+              <w:rPr>
+                <w:rFonts w:ascii="Calibri" w:cs="Calibri" w:eastAsia="Calibri" w:hAnsi="Calibri"/>
+                <w:sz w:val="22"/>
+                <w:szCs w:val="22"/>
+              </w:rPr>
+              <w:t xml:space="preserve">Secure Real Time Transactions and Faster Onboarding</w:t>
+            </w:r>
+          </w:p>
+          <w:p>
+            <w:pPr>
+              <w:spacing w:after="90"/>
+            </w:pPr>
+            <w:r>
+              <w:rPr>
+                <w:rFonts w:ascii="Calibri" w:cs="Calibri" w:eastAsia="Calibri" w:hAnsi="Calibri"/>
+                <w:b/>
+                <w:bCs/>
+                <w:color w:val="22205D"/>
+                <w:sz w:val="22"/>
+                <w:szCs w:val="22"/>
+              </w:rPr>
+              <w:t xml:space="preserve">Summary  </w:t>
+            </w:r>
+            <w:r>
+              <w:rPr>
+                <w:rFonts w:ascii="Calibri" w:cs="Calibri" w:eastAsia="Calibri" w:hAnsi="Calibri"/>
+                <w:sz w:val="22"/>
+                <w:szCs w:val="22"/>
+              </w:rPr>
+              <w:t xml:space="preserve">A secure, scalable fintech platform with real time transaction monitoring and simple onboarding.</w:t>
+            </w:r>
+          </w:p>
+          <w:p>
+            <w:pPr>
+              <w:spacing w:after="90"/>
+            </w:pPr>
+            <w:r>
+              <w:rPr>
+                <w:rFonts w:ascii="Calibri" w:cs="Calibri" w:eastAsia="Calibri" w:hAnsi="Calibri"/>
+                <w:b/>
+                <w:bCs/>
+                <w:color w:val="22205D"/>
+                <w:sz w:val="22"/>
+                <w:szCs w:val="22"/>
+              </w:rPr>
+              <w:t xml:space="preserve">Tags  </w:t>
+            </w:r>
+            <w:r>
+              <w:rPr>
+                <w:rFonts w:ascii="Calibri" w:cs="Calibri" w:eastAsia="Calibri" w:hAnsi="Calibri"/>
+                <w:sz w:val="22"/>
+                <w:szCs w:val="22"/>
+              </w:rPr>
+              <w:t xml:space="preserve">Fintech  Â·  Web and Mobile Platform  Â·  Django and Stripe</w:t>
+            </w:r>
+          </w:p>
+          <w:p>
+            <w:pPr>
+              <w:spacing w:after="90"/>
+            </w:pPr>
+            <w:r>
+              <w:rPr>
+                <w:rFonts w:ascii="Calibri" w:cs="Calibri" w:eastAsia="Calibri" w:hAnsi="Calibri"/>
+                <w:b/>
+                <w:bCs/>
+                <w:color w:val="22205D"/>
+                <w:sz w:val="22"/>
+                <w:szCs w:val="22"/>
+              </w:rPr>
+              <w:t xml:space="preserve">The Challenge  </w:t>
+            </w:r>
+            <w:r>
+              <w:rPr>
+                <w:rFonts w:ascii="Calibri" w:cs="Calibri" w:eastAsia="Calibri" w:hAnsi="Calibri"/>
+                <w:sz w:val="22"/>
+                <w:szCs w:val="22"/>
+              </w:rPr>
+              <w:t xml:space="preserve"/>
+            </w:r>
+          </w:p>
+          <w:p>
+            <w:pPr>
+              <w:spacing w:after="90"/>
+            </w:pPr>
+            <w:r>
+              <w:rPr>
+                <w:rFonts w:ascii="Calibri" w:cs="Calibri" w:eastAsia="Calibri" w:hAnsi="Calibri"/>
+                <w:sz w:val="22"/>
+                <w:szCs w:val="22"/>
+              </w:rPr>
+              <w:t xml:space="preserve">â€¢  The platform had to handle real time transactions securely.</w:t>
+            </w:r>
+          </w:p>
+          <w:p>
+            <w:pPr>
+              <w:spacing w:after="90"/>
+            </w:pPr>
+            <w:r>
+              <w:rPr>
+                <w:rFonts w:ascii="Calibri" w:cs="Calibri" w:eastAsia="Calibri" w:hAnsi="Calibri"/>
+                <w:sz w:val="22"/>
+                <w:szCs w:val="22"/>
+              </w:rPr>
+              <w:t xml:space="preserve">â€¢  New users needed a frictionless onboarding experience.</w:t>
+            </w:r>
+          </w:p>
+          <w:p>
+            <w:pPr>
+              <w:spacing w:after="90"/>
+            </w:pPr>
+            <w:r>
+              <w:rPr>
+                <w:rFonts w:ascii="Calibri" w:cs="Calibri" w:eastAsia="Calibri" w:hAnsi="Calibri"/>
+                <w:sz w:val="22"/>
+                <w:szCs w:val="22"/>
+              </w:rPr>
+              <w:t xml:space="preserve">â€¢  The platform had to scale as transaction volume grew.</w:t>
+            </w:r>
+          </w:p>
+          <w:p>
+            <w:pPr>
+              <w:spacing w:after="90"/>
+            </w:pPr>
+            <w:r>
+              <w:rPr>
+                <w:rFonts w:ascii="Calibri" w:cs="Calibri" w:eastAsia="Calibri" w:hAnsi="Calibri"/>
+                <w:b/>
+                <w:bCs/>
+                <w:color w:val="22205D"/>
+                <w:sz w:val="22"/>
+                <w:szCs w:val="22"/>
+              </w:rPr>
+              <w:t xml:space="preserve">What xLoop Delivered  </w:t>
+            </w:r>
+            <w:r>
+              <w:rPr>
+                <w:rFonts w:ascii="Calibri" w:cs="Calibri" w:eastAsia="Calibri" w:hAnsi="Calibri"/>
+                <w:sz w:val="22"/>
+                <w:szCs w:val="22"/>
+              </w:rPr>
+              <w:t xml:space="preserve"/>
+            </w:r>
+          </w:p>
+          <w:p>
+            <w:pPr>
+              <w:spacing w:after="90"/>
+            </w:pPr>
+            <w:r>
+              <w:rPr>
+                <w:rFonts w:ascii="Calibri" w:cs="Calibri" w:eastAsia="Calibri" w:hAnsi="Calibri"/>
+                <w:sz w:val="22"/>
+                <w:szCs w:val="22"/>
+              </w:rPr>
+              <w:t xml:space="preserve">1  Transaction Insights: Real time monitoring for immediate financial clarity and control.</w:t>
+            </w:r>
+          </w:p>
+          <w:p>
+            <w:pPr>
+              <w:spacing w:after="90"/>
+            </w:pPr>
+            <w:r>
+              <w:rPr>
+                <w:rFonts w:ascii="Calibri" w:cs="Calibri" w:eastAsia="Calibri" w:hAnsi="Calibri"/>
+                <w:sz w:val="22"/>
+                <w:szCs w:val="22"/>
+              </w:rPr>
+              <w:t xml:space="preserve">2  Simple Onboarding: A streamlined process that makes joining quick and easy.</w:t>
+            </w:r>
+          </w:p>
+          <w:p>
+            <w:pPr>
+              <w:spacing w:after="90"/>
+            </w:pPr>
+            <w:r>
+              <w:rPr>
+                <w:rFonts w:ascii="Calibri" w:cs="Calibri" w:eastAsia="Calibri" w:hAnsi="Calibri"/>
+                <w:sz w:val="22"/>
+                <w:szCs w:val="22"/>
+              </w:rPr>
+              <w:t xml:space="preserve">3  Mobile Experience: Built with React Native for a responsive interface on any device.</w:t>
+            </w:r>
+          </w:p>
+          <w:p>
+            <w:pPr>
+              <w:spacing w:after="90"/>
+            </w:pPr>
+            <w:r>
+              <w:rPr>
+                <w:rFonts w:ascii="Calibri" w:cs="Calibri" w:eastAsia="Calibri" w:hAnsi="Calibri"/>
+                <w:sz w:val="22"/>
+                <w:szCs w:val="22"/>
+              </w:rPr>
+              <w:t xml:space="preserve">4  Security and Scale: Security built in, and a platform that grows with transaction volume.</w:t>
+            </w:r>
+          </w:p>
+          <w:p>
+            <w:pPr>
+              <w:spacing w:after="90"/>
+            </w:pPr>
+            <w:r>
+              <w:rPr>
+                <w:rFonts w:ascii="Calibri" w:cs="Calibri" w:eastAsia="Calibri" w:hAnsi="Calibri"/>
+                <w:b/>
+                <w:bCs/>
+                <w:color w:val="22205D"/>
+                <w:sz w:val="22"/>
+                <w:szCs w:val="22"/>
+              </w:rPr>
+              <w:t xml:space="preserve">Business Value  </w:t>
+            </w:r>
+            <w:r>
+              <w:rPr>
+                <w:rFonts w:ascii="Calibri" w:cs="Calibri" w:eastAsia="Calibri" w:hAnsi="Calibri"/>
+                <w:sz w:val="22"/>
+                <w:szCs w:val="22"/>
+              </w:rPr>
+              <w:t xml:space="preserve">Real time monitoring  Â·  Simpler onboarding  Â·  Security built in  Â·  Scales on demand</w:t>
+            </w:r>
+          </w:p>
+        </w:tc>
+      </w:tr>
+    </w:tbl>
+    <w:p>
+      <w:pPr>
+        <w:spacing w:after="60"/>
+      </w:pPr>
+      <w:r>
+        <w:rPr>
+          <w:rFonts w:ascii="Calibri" w:cs="Calibri" w:eastAsia="Calibri" w:hAnsi="Calibri"/>
+          <w:sz w:val="22"/>
+          <w:szCs w:val="22"/>
+        </w:rPr>
+        <w:t xml:space="preserve"/>
+      </w:r>
+    </w:p>
+    <w:p>
+      <w:pPr>
+        <w:spacing w:after="120"/>
+      </w:pPr>
+      <w:r>
+        <w:rPr>
+          <w:rFonts w:ascii="Calibri" w:cs="Calibri" w:eastAsia="Calibri" w:hAnsi="Calibri"/>
+          <w:color w:val="5B5A80"/>
+          <w:sz w:val="20"/>
+          <w:szCs w:val="20"/>
+        </w:rPr>
+        <w:t xml:space="preserve">Slide 8 was an assessment and roadmap. Do not change any wording to say the migration itself was completed.</w:t>
+      </w:r>
+    </w:p>
+    <w:p>
+      <w:pPr>
+        <w:pStyle w:val="Heading1"/>
+        <w:keepNext/>
+        <w:spacing w:after="160" w:before="360"/>
+      </w:pPr>
+      <w:r>
+        <w:rPr>
+          <w:rFonts w:ascii="Calibri" w:cs="Calibri" w:eastAsia="Calibri" w:hAnsi="Calibri"/>
+          <w:b/>
+          <w:bCs/>
+          <w:color w:val="22205D"/>
+          <w:sz w:val="34"/>
+          <w:szCs w:val="34"/>
+        </w:rPr>
+        <w:t xml:space="preserve">Slide 10: Why xLoop for Poland, and contact</w:t>
+      </w:r>
+    </w:p>
+    <w:p>
+      <w:pPr>
         <w:keepNext/>
         <w:spacing w:after="40"/>
       </w:pPr>
@@ -3851,7 +6359,7 @@
           <wp:inline distT="0" distB="0" distL="0" distR="0">
             <wp:extent cx="3657600" cy="2057400"/>
             <wp:effectExtent t="0" r="0" b="0" l="0"/>
-            <wp:docPr id="6" name="Source: slide 25" descr="Source: slide 25" title="Source: slide 25"/>
+            <wp:docPr id="6" name="Source: slide 104" descr="Source: slide 104" title="Source: slide 104"/>
             <wp:cNvGraphicFramePr>
               <a:graphicFrameLocks xmlns:a="http://schemas.openxmlformats.org/drawingml/2006/main" noChangeAspect="1"/>
             </wp:cNvGraphicFramePr>
@@ -3900,7 +6408,7 @@
           <w:sz w:val="18"/>
           <w:szCs w:val="18"/>
         </w:rPr>
-        <w:t xml:space="preserve">Source: slide 25</w:t>
+        <w:t xml:space="preserve">Source: slide 104</w:t>
       </w:r>
     </w:p>
     <w:p>
@@ -3922,7 +6430,12 @@
     </w:p>
     <w:p>
       <w:pPr>
-        <w:spacing w:after="120"/>
+        <w:pStyle w:val="ListParagraph"/>
+        <w:numPr>
+          <w:ilvl w:val="0"/>
+          <w:numId w:val="2"/>
+        </w:numPr>
+        <w:spacing w:after="60"/>
       </w:pPr>
       <w:r>
         <w:rPr>
@@ -3930,7 +6443,43 @@
           <w:sz w:val="22"/>
           <w:szCs w:val="22"/>
         </w:rPr>
-        <w:t xml:space="preserve">Keep the design. Replace the Problem and Solution text. The current text has three errors the CTO corrected: data was not “manually fetched”, there were no “data delays”, and the dashboards are not “real time”.</w:t>
+        <w:t xml:space="preserve">Keep the dark design, logo and footer.</w:t>
+      </w:r>
+    </w:p>
+    <w:p>
+      <w:pPr>
+        <w:pStyle w:val="ListParagraph"/>
+        <w:numPr>
+          <w:ilvl w:val="0"/>
+          <w:numId w:val="2"/>
+        </w:numPr>
+        <w:spacing w:after="60"/>
+      </w:pPr>
+      <w:r>
+        <w:rPr>
+          <w:rFonts w:ascii="Calibri" w:cs="Calibri" w:eastAsia="Calibri" w:hAnsi="Calibri"/>
+          <w:sz w:val="22"/>
+          <w:szCs w:val="22"/>
+        </w:rPr>
+        <w:t xml:space="preserve">Replace the headline, body text and button with the copy below.</w:t>
+      </w:r>
+    </w:p>
+    <w:p>
+      <w:pPr>
+        <w:pStyle w:val="ListParagraph"/>
+        <w:numPr>
+          <w:ilvl w:val="0"/>
+          <w:numId w:val="2"/>
+        </w:numPr>
+        <w:spacing w:after="60"/>
+      </w:pPr>
+      <w:r>
+        <w:rPr>
+          <w:rFonts w:ascii="Calibri" w:cs="Calibri" w:eastAsia="Calibri" w:hAnsi="Calibri"/>
+          <w:sz w:val="22"/>
+          <w:szCs w:val="22"/>
+        </w:rPr>
+        <w:t xml:space="preserve">Footer: add the Doha office so it matches the four offices on slide 2.</w:t>
       </w:r>
     </w:p>
     <w:tbl>
@@ -3949,6 +6498,9 @@
         <w:gridCol w:w="9360"/>
       </w:tblGrid>
       <w:tr>
+        <w:trPr>
+          <w:cantSplit/>
+        </w:trPr>
         <w:tc>
           <w:tcPr>
             <w:tcW w:type="dxa" w:w="9360"/>
@@ -3973,15 +6525,15 @@
                 <w:sz w:val="22"/>
                 <w:szCs w:val="22"/>
               </w:rPr>
-              <w:t xml:space="preserve">Title  </w:t>
-            </w:r>
-            <w:r>
-              <w:rPr>
-                <w:rFonts w:ascii="Calibri" w:cs="Calibri" w:eastAsia="Calibri" w:hAnsi="Calibri"/>
-                <w:sz w:val="22"/>
-                <w:szCs w:val="22"/>
-              </w:rPr>
-              <w:t xml:space="preserve">Data Strategy and Migration to Snowflake</w:t>
+              <w:t xml:space="preserve">Headline  </w:t>
+            </w:r>
+            <w:r>
+              <w:rPr>
+                <w:rFonts w:ascii="Calibri" w:cs="Calibri" w:eastAsia="Calibri" w:hAnsi="Calibri"/>
+                <w:sz w:val="22"/>
+                <w:szCs w:val="22"/>
+              </w:rPr>
+              <w:t xml:space="preserve">Why xLoop for Poland</w:t>
             </w:r>
           </w:p>
           <w:p>
@@ -3997,15 +6549,15 @@
                 <w:sz w:val="22"/>
                 <w:szCs w:val="22"/>
               </w:rPr>
-              <w:t xml:space="preserve">Tags  </w:t>
-            </w:r>
-            <w:r>
-              <w:rPr>
-                <w:rFonts w:ascii="Calibri" w:cs="Calibri" w:eastAsia="Calibri" w:hAnsi="Calibri"/>
-                <w:sz w:val="22"/>
-                <w:szCs w:val="22"/>
-              </w:rPr>
-              <w:t xml:space="preserve">Retail · Cloud Database · AWS</w:t>
+              <w:t xml:space="preserve">Point 1  </w:t>
+            </w:r>
+            <w:r>
+              <w:rPr>
+                <w:rFonts w:ascii="Calibri" w:cs="Calibri" w:eastAsia="Calibri" w:hAnsi="Calibri"/>
+                <w:sz w:val="22"/>
+                <w:szCs w:val="22"/>
+              </w:rPr>
+              <w:t xml:space="preserve">We already deliver for Polish companies: a fintech platform, plus application modernization and a SIEM migration for a Polish cloud company.</w:t>
             </w:r>
           </w:p>
           <w:p>
@@ -4021,15 +6573,15 @@
                 <w:sz w:val="22"/>
                 <w:szCs w:val="22"/>
               </w:rPr>
-              <w:t xml:space="preserve">Problem  </w:t>
-            </w:r>
-            <w:r>
-              <w:rPr>
-                <w:rFonts w:ascii="Calibri" w:cs="Calibri" w:eastAsia="Calibri" w:hAnsi="Calibri"/>
-                <w:sz w:val="22"/>
-                <w:szCs w:val="22"/>
-              </w:rPr>
-              <w:t xml:space="preserve">A leading South African retailer had data spread across SAP ERP, SAP BW and application databases, with several competing sources of truth and no unified view.</w:t>
+              <w:t xml:space="preserve">Point 2  </w:t>
+            </w:r>
+            <w:r>
+              <w:rPr>
+                <w:rFonts w:ascii="Calibri" w:cs="Calibri" w:eastAsia="Calibri" w:hAnsi="Calibri"/>
+                <w:sz w:val="22"/>
+                <w:szCs w:val="22"/>
+              </w:rPr>
+              <w:t xml:space="preserve">People in your time zone: team members based in Hungary.</w:t>
             </w:r>
           </w:p>
           <w:p>
@@ -4045,15 +6597,15 @@
                 <w:sz w:val="22"/>
                 <w:szCs w:val="22"/>
               </w:rPr>
-              <w:t xml:space="preserve">Solution  </w:t>
-            </w:r>
-            <w:r>
-              <w:rPr>
-                <w:rFonts w:ascii="Calibri" w:cs="Calibri" w:eastAsia="Calibri" w:hAnsi="Calibri"/>
-                <w:sz w:val="22"/>
-                <w:szCs w:val="22"/>
-              </w:rPr>
-              <w:t xml:space="preserve">We built a central data warehouse on Snowflake using a medallion architecture. Our data consultants defined the migration and analytics strategy, then moved existing data from traditional databases to a cloud lakehouse on Snowflake and AWS, and optimized the pipelines end to end.</w:t>
+              <w:t xml:space="preserve">Point 3  </w:t>
+            </w:r>
+            <w:r>
+              <w:rPr>
+                <w:rFonts w:ascii="Calibri" w:cs="Calibri" w:eastAsia="Calibri" w:hAnsi="Calibri"/>
+                <w:sz w:val="22"/>
+                <w:szCs w:val="22"/>
+              </w:rPr>
+              <w:t xml:space="preserve">AI first, with security built in: certified ISO 42001 and ISO 27001 Lead Auditors on our team.</w:t>
             </w:r>
           </w:p>
           <w:p>
@@ -4069,15 +6621,87 @@
                 <w:sz w:val="22"/>
                 <w:szCs w:val="22"/>
               </w:rPr>
-              <w:t xml:space="preserve">Result  </w:t>
-            </w:r>
-            <w:r>
-              <w:rPr>
-                <w:rFonts w:ascii="Calibri" w:cs="Calibri" w:eastAsia="Calibri" w:hAnsi="Calibri"/>
-                <w:sz w:val="22"/>
-                <w:szCs w:val="22"/>
-              </w:rPr>
-              <w:t xml:space="preserve">One trusted source of truth for reporting, data analysis, data science models and AI use cases.</w:t>
+              <w:t xml:space="preserve">Quote  </w:t>
+            </w:r>
+            <w:r>
+              <w:rPr>
+                <w:rFonts w:ascii="Calibri" w:cs="Calibri" w:eastAsia="Calibri" w:hAnsi="Calibri"/>
+                <w:sz w:val="22"/>
+                <w:szCs w:val="22"/>
+              </w:rPr>
+              <w:t xml:space="preserve">â€œxLoop architects meticulously planned and executed the migration, ensuring minimal disruption to our operations.â€</w:t>
+            </w:r>
+          </w:p>
+          <w:p>
+            <w:pPr>
+              <w:spacing w:after="90"/>
+            </w:pPr>
+            <w:r>
+              <w:rPr>
+                <w:rFonts w:ascii="Calibri" w:cs="Calibri" w:eastAsia="Calibri" w:hAnsi="Calibri"/>
+                <w:b/>
+                <w:bCs/>
+                <w:color w:val="22205D"/>
+                <w:sz w:val="22"/>
+                <w:szCs w:val="22"/>
+              </w:rPr>
+              <w:t xml:space="preserve">Attribution  </w:t>
+            </w:r>
+            <w:r>
+              <w:rPr>
+                <w:rFonts w:ascii="Calibri" w:cs="Calibri" w:eastAsia="Calibri" w:hAnsi="Calibri"/>
+                <w:sz w:val="22"/>
+                <w:szCs w:val="22"/>
+              </w:rPr>
+              <w:t xml:space="preserve">John Waterhouse, Founder and CEO, Cloud Titans Ltd</w:t>
+            </w:r>
+          </w:p>
+          <w:p>
+            <w:pPr>
+              <w:spacing w:after="90"/>
+            </w:pPr>
+            <w:r>
+              <w:rPr>
+                <w:rFonts w:ascii="Calibri" w:cs="Calibri" w:eastAsia="Calibri" w:hAnsi="Calibri"/>
+                <w:b/>
+                <w:bCs/>
+                <w:color w:val="22205D"/>
+                <w:sz w:val="22"/>
+                <w:szCs w:val="22"/>
+              </w:rPr>
+              <w:t xml:space="preserve">Button  </w:t>
+            </w:r>
+            <w:r>
+              <w:rPr>
+                <w:rFonts w:ascii="Calibri" w:cs="Calibri" w:eastAsia="Calibri" w:hAnsi="Calibri"/>
+                <w:sz w:val="22"/>
+                <w:szCs w:val="22"/>
+              </w:rPr>
+              <w:t xml:space="preserve">Start with one use case</w:t>
+            </w:r>
+          </w:p>
+          <w:p>
+            <w:pPr>
+              <w:spacing w:after="90"/>
+            </w:pPr>
+            <w:r>
+              <w:rPr>
+                <w:rFonts w:ascii="Calibri" w:cs="Calibri" w:eastAsia="Calibri" w:hAnsi="Calibri"/>
+                <w:b/>
+                <w:bCs/>
+                <w:color w:val="22205D"/>
+                <w:sz w:val="22"/>
+                <w:szCs w:val="22"/>
+              </w:rPr>
+              <w:t xml:space="preserve">Doha footer  </w:t>
+            </w:r>
+            <w:r>
+              <w:rPr>
+                <w:rFonts w:ascii="Calibri" w:cs="Calibri" w:eastAsia="Calibri" w:hAnsi="Calibri"/>
+                <w:sz w:val="22"/>
+                <w:szCs w:val="22"/>
+              </w:rPr>
+              <w:t xml:space="preserve">QFC Tower 1, West Bay, Doha, Qatar (RHQ)</w:t>
             </w:r>
           </w:p>
         </w:tc>
@@ -4085,9 +6709,36 @@
     </w:tbl>
     <w:p>
       <w:pPr>
-        <w:pStyle w:val="Heading2"/>
+        <w:spacing w:after="60"/>
+      </w:pPr>
+      <w:r>
+        <w:rPr>
+          <w:rFonts w:ascii="Calibri" w:cs="Calibri" w:eastAsia="Calibri" w:hAnsi="Calibri"/>
+          <w:sz w:val="22"/>
+          <w:szCs w:val="22"/>
+        </w:rPr>
+        <w:t xml:space="preserve"/>
+      </w:r>
+    </w:p>
+    <w:p>
+      <w:pPr>
+        <w:spacing w:after="120"/>
+      </w:pPr>
+      <w:r>
+        <w:rPr>
+          <w:rFonts w:ascii="Calibri" w:cs="Calibri" w:eastAsia="Calibri" w:hAnsi="Calibri"/>
+          <w:color w:val="5B5A80"/>
+          <w:sz w:val="20"/>
+          <w:szCs w:val="20"/>
+        </w:rPr>
+        <w:t xml:space="preserve">The quote must stay word for word. It is from a signed testimonial and is the only client name allowed in the deck.</w:t>
+      </w:r>
+    </w:p>
+    <w:p>
+      <w:pPr>
+        <w:pStyle w:val="Heading1"/>
         <w:keepNext/>
-        <w:spacing w:after="120" w:before="280"/>
+        <w:spacing w:after="160" w:before="360"/>
       </w:pPr>
       <w:r>
         <w:rPr>
@@ -4095,99 +6746,15 @@
           <w:b/>
           <w:bCs/>
           <w:color w:val="22205D"/>
-          <w:sz w:val="28"/>
-          <w:szCs w:val="28"/>
+          <w:sz w:val="34"/>
+          <w:szCs w:val="34"/>
         </w:rPr>
-        <w:t xml:space="preserve">Slide 7: Healthcare, AI search over recordings</w:t>
+        <w:t xml:space="preserve">Optional swap: Gulf data platforms</w:t>
       </w:r>
     </w:p>
     <w:p>
       <w:pPr>
-        <w:keepNext/>
-        <w:spacing w:after="40"/>
-      </w:pPr>
-      <w:r>
-        <w:drawing>
-          <wp:inline distT="0" distB="0" distL="0" distR="0">
-            <wp:extent cx="3657600" cy="2057400"/>
-            <wp:effectExtent t="0" r="0" b="0" l="0"/>
-            <wp:docPr id="7" name="Source: slide 28" descr="Source: slide 28" title="Source: slide 28"/>
-            <wp:cNvGraphicFramePr>
-              <a:graphicFrameLocks xmlns:a="http://schemas.openxmlformats.org/drawingml/2006/main" noChangeAspect="1"/>
-            </wp:cNvGraphicFramePr>
-            <a:graphic xmlns:a="http://schemas.openxmlformats.org/drawingml/2006/main">
-              <a:graphicData uri="http://schemas.openxmlformats.org/drawingml/2006/picture">
-                <pic:pic xmlns:pic="http://schemas.openxmlformats.org/drawingml/2006/picture">
-                  <pic:nvPicPr>
-                    <pic:cNvPr id="0" name="" descr=""/>
-                    <pic:cNvPicPr>
-                      <a:picLocks noChangeAspect="1" noChangeArrowheads="1"/>
-                    </pic:cNvPicPr>
-                  </pic:nvPicPr>
-                  <pic:blipFill>
-                    <a:blip r:embed="rId13" cstate="none"/>
-                    <a:srcRect/>
-                    <a:stretch>
-                      <a:fillRect/>
-                    </a:stretch>
-                  </pic:blipFill>
-                  <pic:spPr bwMode="auto">
-                    <a:xfrm>
-                      <a:off x="0" y="0"/>
-                      <a:ext cx="3657600" cy="2057400"/>
-                    </a:xfrm>
-                    <a:prstGeom prst="rect">
-                      <a:avLst/>
-                    </a:prstGeom>
-                  </pic:spPr>
-                </pic:pic>
-              </a:graphicData>
-            </a:graphic>
-          </wp:inline>
-        </w:drawing>
-      </w:r>
-    </w:p>
-    <w:p>
-      <w:pPr>
-        <w:spacing w:after="160"/>
-      </w:pPr>
-      <w:r>
-        <w:rPr>
-          <w:rFonts w:ascii="Calibri" w:cs="Calibri" w:eastAsia="Calibri" w:hAnsi="Calibri"/>
-          <w:i/>
-          <w:iCs/>
-          <w:color w:val="5B5A80"/>
-          <w:sz w:val="18"/>
-          <w:szCs w:val="18"/>
-        </w:rPr>
-        <w:t xml:space="preserve">Source: slide 28</w:t>
-      </w:r>
-    </w:p>
-    <w:p>
-      <w:pPr>
-        <w:keepNext/>
-        <w:spacing w:after="60" w:before="120"/>
-      </w:pPr>
-      <w:r>
-        <w:rPr>
-          <w:rFonts w:ascii="Calibri" w:cs="Calibri" w:eastAsia="Calibri" w:hAnsi="Calibri"/>
-          <w:b/>
-          <w:bCs/>
-          <w:color w:val="0061F6"/>
-          <w:sz w:val="18"/>
-          <w:szCs w:val="18"/>
-        </w:rPr>
-        <w:t xml:space="preserve">ACTION</w:t>
-      </w:r>
-    </w:p>
-    <w:p>
-      <w:pPr>
-        <w:pStyle w:val="ListParagraph"/>
-        <w:numPr>
-          <w:ilvl w:val="0"/>
-          <w:numId w:val="2"/>
-        </w:numPr>
-        <w:spacing w:after="60"/>
+        <w:spacing w:after="120"/>
       </w:pPr>
       <w:r>
         <w:rPr>
@@ -4195,319 +6762,7 @@
           <w:sz w:val="22"/>
           <w:szCs w:val="22"/>
         </w:rPr>
-        <w:t xml:space="preserve">Keep as is. The text is already anonymous and approved.</w:t>
-      </w:r>
-    </w:p>
-    <w:p>
-      <w:pPr>
-        <w:pStyle w:val="Heading2"/>
-        <w:keepNext/>
-        <w:spacing w:after="120" w:before="280"/>
-      </w:pPr>
-      <w:r>
-        <w:rPr>
-          <w:rFonts w:ascii="Calibri" w:cs="Calibri" w:eastAsia="Calibri" w:hAnsi="Calibri"/>
-          <w:b/>
-          <w:bCs/>
-          <w:color w:val="22205D"/>
-          <w:sz w:val="28"/>
-          <w:szCs w:val="28"/>
-        </w:rPr>
-        <w:t xml:space="preserve">Slide 8: Middle East, AWS to Azure migration assessment</w:t>
-      </w:r>
-    </w:p>
-    <w:p>
-      <w:pPr>
-        <w:keepNext/>
-        <w:spacing w:after="40"/>
-      </w:pPr>
-      <w:r>
-        <w:drawing>
-          <wp:inline distT="0" distB="0" distL="0" distR="0">
-            <wp:extent cx="3657600" cy="2057400"/>
-            <wp:effectExtent t="0" r="0" b="0" l="0"/>
-            <wp:docPr id="8" name="Source: slide 36" descr="Source: slide 36" title="Source: slide 36"/>
-            <wp:cNvGraphicFramePr>
-              <a:graphicFrameLocks xmlns:a="http://schemas.openxmlformats.org/drawingml/2006/main" noChangeAspect="1"/>
-            </wp:cNvGraphicFramePr>
-            <a:graphic xmlns:a="http://schemas.openxmlformats.org/drawingml/2006/main">
-              <a:graphicData uri="http://schemas.openxmlformats.org/drawingml/2006/picture">
-                <pic:pic xmlns:pic="http://schemas.openxmlformats.org/drawingml/2006/picture">
-                  <pic:nvPicPr>
-                    <pic:cNvPr id="0" name="" descr=""/>
-                    <pic:cNvPicPr>
-                      <a:picLocks noChangeAspect="1" noChangeArrowheads="1"/>
-                    </pic:cNvPicPr>
-                  </pic:nvPicPr>
-                  <pic:blipFill>
-                    <a:blip r:embed="rId14" cstate="none"/>
-                    <a:srcRect/>
-                    <a:stretch>
-                      <a:fillRect/>
-                    </a:stretch>
-                  </pic:blipFill>
-                  <pic:spPr bwMode="auto">
-                    <a:xfrm>
-                      <a:off x="0" y="0"/>
-                      <a:ext cx="3657600" cy="2057400"/>
-                    </a:xfrm>
-                    <a:prstGeom prst="rect">
-                      <a:avLst/>
-                    </a:prstGeom>
-                  </pic:spPr>
-                </pic:pic>
-              </a:graphicData>
-            </a:graphic>
-          </wp:inline>
-        </w:drawing>
-      </w:r>
-    </w:p>
-    <w:p>
-      <w:pPr>
-        <w:spacing w:after="160"/>
-      </w:pPr>
-      <w:r>
-        <w:rPr>
-          <w:rFonts w:ascii="Calibri" w:cs="Calibri" w:eastAsia="Calibri" w:hAnsi="Calibri"/>
-          <w:i/>
-          <w:iCs/>
-          <w:color w:val="5B5A80"/>
-          <w:sz w:val="18"/>
-          <w:szCs w:val="18"/>
-        </w:rPr>
-        <w:t xml:space="preserve">Source: slide 36</w:t>
-      </w:r>
-    </w:p>
-    <w:p>
-      <w:pPr>
-        <w:keepNext/>
-        <w:spacing w:after="60" w:before="120"/>
-      </w:pPr>
-      <w:r>
-        <w:rPr>
-          <w:rFonts w:ascii="Calibri" w:cs="Calibri" w:eastAsia="Calibri" w:hAnsi="Calibri"/>
-          <w:b/>
-          <w:bCs/>
-          <w:color w:val="0061F6"/>
-          <w:sz w:val="18"/>
-          <w:szCs w:val="18"/>
-        </w:rPr>
-        <w:t xml:space="preserve">ACTION</w:t>
-      </w:r>
-    </w:p>
-    <w:p>
-      <w:pPr>
-        <w:pStyle w:val="ListParagraph"/>
-        <w:numPr>
-          <w:ilvl w:val="0"/>
-          <w:numId w:val="2"/>
-        </w:numPr>
-        <w:spacing w:after="60"/>
-      </w:pPr>
-      <w:r>
-        <w:rPr>
-          <w:rFonts w:ascii="Calibri" w:cs="Calibri" w:eastAsia="Calibri" w:hAnsi="Calibri"/>
-          <w:sz w:val="22"/>
-          <w:szCs w:val="22"/>
-        </w:rPr>
-        <w:t xml:space="preserve">Replace the client name “Majid Al Futtaim” with: </w:t>
-      </w:r>
-      <w:r>
-        <w:rPr>
-          <w:rFonts w:ascii="Calibri" w:cs="Calibri" w:eastAsia="Calibri" w:hAnsi="Calibri"/>
-          <w:b/>
-          <w:bCs/>
-          <w:sz w:val="22"/>
-          <w:szCs w:val="22"/>
-        </w:rPr>
-        <w:t xml:space="preserve">A Large Retail and Real Estate Group in the Middle East</w:t>
-      </w:r>
-    </w:p>
-    <w:p>
-      <w:pPr>
-        <w:pStyle w:val="ListParagraph"/>
-        <w:numPr>
-          <w:ilvl w:val="0"/>
-          <w:numId w:val="2"/>
-        </w:numPr>
-        <w:spacing w:after="60"/>
-      </w:pPr>
-      <w:r>
-        <w:rPr>
-          <w:rFonts w:ascii="Calibri" w:cs="Calibri" w:eastAsia="Calibri" w:hAnsi="Calibri"/>
-          <w:sz w:val="22"/>
-          <w:szCs w:val="22"/>
-        </w:rPr>
-        <w:t xml:space="preserve">Keep the rest of the slide as is, including “with Microsoft” in step 6.</w:t>
-      </w:r>
-    </w:p>
-    <w:p>
-      <w:pPr>
-        <w:pStyle w:val="ListParagraph"/>
-        <w:numPr>
-          <w:ilvl w:val="0"/>
-          <w:numId w:val="2"/>
-        </w:numPr>
-        <w:spacing w:after="60"/>
-      </w:pPr>
-      <w:r>
-        <w:rPr>
-          <w:rFonts w:ascii="Calibri" w:cs="Calibri" w:eastAsia="Calibri" w:hAnsi="Calibri"/>
-          <w:sz w:val="22"/>
-          <w:szCs w:val="22"/>
-        </w:rPr>
-        <w:t xml:space="preserve">This was an assessment and roadmap. Do not change any wording to say the migration itself was completed.</w:t>
-      </w:r>
-    </w:p>
-    <w:p>
-      <w:pPr>
-        <w:pStyle w:val="Heading2"/>
-        <w:keepNext/>
-        <w:spacing w:after="120" w:before="280"/>
-      </w:pPr>
-      <w:r>
-        <w:rPr>
-          <w:rFonts w:ascii="Calibri" w:cs="Calibri" w:eastAsia="Calibri" w:hAnsi="Calibri"/>
-          <w:b/>
-          <w:bCs/>
-          <w:color w:val="22205D"/>
-          <w:sz w:val="28"/>
-          <w:szCs w:val="28"/>
-        </w:rPr>
-        <w:t xml:space="preserve">Slide 9: Poland, fintech platform</w:t>
-      </w:r>
-    </w:p>
-    <w:p>
-      <w:pPr>
-        <w:keepNext/>
-        <w:spacing w:after="40"/>
-      </w:pPr>
-      <w:r>
-        <w:drawing>
-          <wp:inline distT="0" distB="0" distL="0" distR="0">
-            <wp:extent cx="3657600" cy="2057400"/>
-            <wp:effectExtent t="0" r="0" b="0" l="0"/>
-            <wp:docPr id="9" name="Source: slide 62" descr="Source: slide 62" title="Source: slide 62"/>
-            <wp:cNvGraphicFramePr>
-              <a:graphicFrameLocks xmlns:a="http://schemas.openxmlformats.org/drawingml/2006/main" noChangeAspect="1"/>
-            </wp:cNvGraphicFramePr>
-            <a:graphic xmlns:a="http://schemas.openxmlformats.org/drawingml/2006/main">
-              <a:graphicData uri="http://schemas.openxmlformats.org/drawingml/2006/picture">
-                <pic:pic xmlns:pic="http://schemas.openxmlformats.org/drawingml/2006/picture">
-                  <pic:nvPicPr>
-                    <pic:cNvPr id="0" name="" descr=""/>
-                    <pic:cNvPicPr>
-                      <a:picLocks noChangeAspect="1" noChangeArrowheads="1"/>
-                    </pic:cNvPicPr>
-                  </pic:nvPicPr>
-                  <pic:blipFill>
-                    <a:blip r:embed="rId15" cstate="none"/>
-                    <a:srcRect/>
-                    <a:stretch>
-                      <a:fillRect/>
-                    </a:stretch>
-                  </pic:blipFill>
-                  <pic:spPr bwMode="auto">
-                    <a:xfrm>
-                      <a:off x="0" y="0"/>
-                      <a:ext cx="3657600" cy="2057400"/>
-                    </a:xfrm>
-                    <a:prstGeom prst="rect">
-                      <a:avLst/>
-                    </a:prstGeom>
-                  </pic:spPr>
-                </pic:pic>
-              </a:graphicData>
-            </a:graphic>
-          </wp:inline>
-        </w:drawing>
-      </w:r>
-    </w:p>
-    <w:p>
-      <w:pPr>
-        <w:spacing w:after="160"/>
-      </w:pPr>
-      <w:r>
-        <w:rPr>
-          <w:rFonts w:ascii="Calibri" w:cs="Calibri" w:eastAsia="Calibri" w:hAnsi="Calibri"/>
-          <w:i/>
-          <w:iCs/>
-          <w:color w:val="5B5A80"/>
-          <w:sz w:val="18"/>
-          <w:szCs w:val="18"/>
-        </w:rPr>
-        <w:t xml:space="preserve">Source: slide 62</w:t>
-      </w:r>
-    </w:p>
-    <w:p>
-      <w:pPr>
-        <w:keepNext/>
-        <w:spacing w:after="60" w:before="120"/>
-      </w:pPr>
-      <w:r>
-        <w:rPr>
-          <w:rFonts w:ascii="Calibri" w:cs="Calibri" w:eastAsia="Calibri" w:hAnsi="Calibri"/>
-          <w:b/>
-          <w:bCs/>
-          <w:color w:val="0061F6"/>
-          <w:sz w:val="18"/>
-          <w:szCs w:val="18"/>
-        </w:rPr>
-        <w:t xml:space="preserve">ACTION</w:t>
-      </w:r>
-    </w:p>
-    <w:p>
-      <w:pPr>
-        <w:pStyle w:val="ListParagraph"/>
-        <w:numPr>
-          <w:ilvl w:val="0"/>
-          <w:numId w:val="2"/>
-        </w:numPr>
-        <w:spacing w:after="60"/>
-      </w:pPr>
-      <w:r>
-        <w:rPr>
-          <w:rFonts w:ascii="Calibri" w:cs="Calibri" w:eastAsia="Calibri" w:hAnsi="Calibri"/>
-          <w:sz w:val="22"/>
-          <w:szCs w:val="22"/>
-        </w:rPr>
-        <w:t xml:space="preserve">Remove the client logo at the top of the text panel, and the client name from any screenshot.</w:t>
-      </w:r>
-    </w:p>
-    <w:p>
-      <w:pPr>
-        <w:pStyle w:val="ListParagraph"/>
-        <w:numPr>
-          <w:ilvl w:val="0"/>
-          <w:numId w:val="2"/>
-        </w:numPr>
-        <w:spacing w:after="60"/>
-      </w:pPr>
-      <w:r>
-        <w:rPr>
-          <w:rFonts w:ascii="Calibri" w:cs="Calibri" w:eastAsia="Calibri" w:hAnsi="Calibri"/>
-          <w:sz w:val="22"/>
-          <w:szCs w:val="22"/>
-        </w:rPr>
-        <w:t xml:space="preserve">Change the label “App Engineering | Web” to “Case Study | Poland”.</w:t>
-      </w:r>
-    </w:p>
-    <w:p>
-      <w:pPr>
-        <w:pStyle w:val="ListParagraph"/>
-        <w:numPr>
-          <w:ilvl w:val="0"/>
-          <w:numId w:val="2"/>
-        </w:numPr>
-        <w:spacing w:after="60"/>
-      </w:pPr>
-      <w:r>
-        <w:rPr>
-          <w:rFonts w:ascii="Calibri" w:cs="Calibri" w:eastAsia="Calibri" w:hAnsi="Calibri"/>
-          <w:sz w:val="22"/>
-          <w:szCs w:val="22"/>
-        </w:rPr>
-        <w:t xml:space="preserve">Change the feature chip “Fortified Security” to “Security Built In”.</w:t>
+        <w:t xml:space="preserve">Use this only if sales asks for the bank, real estate and maritime clients as a case study. It would replace slide 8. Build it on the slide 38 template (Challenge, What xLoop Delivered, Business Value).</w:t>
       </w:r>
     </w:p>
     <w:tbl>
@@ -4526,6 +6781,9 @@
         <w:gridCol w:w="9360"/>
       </w:tblGrid>
       <w:tr>
+        <w:trPr>
+          <w:cantSplit/>
+        </w:trPr>
         <w:tc>
           <w:tcPr>
             <w:tcW w:type="dxa" w:w="9360"/>
@@ -4558,7 +6816,7 @@
                 <w:sz w:val="22"/>
                 <w:szCs w:val="22"/>
               </w:rPr>
-              <w:t xml:space="preserve">Enabled secure real time transactions with new user onboarding features</w:t>
+              <w:t xml:space="preserve">One Source of Truth for Gulf Enterprises</w:t>
             </w:r>
           </w:p>
           <w:p>
@@ -4574,15 +6832,15 @@
                 <w:sz w:val="22"/>
                 <w:szCs w:val="22"/>
               </w:rPr>
-              <w:t xml:space="preserve">Body  </w:t>
-            </w:r>
-            <w:r>
-              <w:rPr>
-                <w:rFonts w:ascii="Calibri" w:cs="Calibri" w:eastAsia="Calibri" w:hAnsi="Calibri"/>
-                <w:sz w:val="22"/>
-                <w:szCs w:val="22"/>
-              </w:rPr>
-              <w:t xml:space="preserve">A Polish fintech company needed a platform that could handle real time transactions securely and give new users a frictionless experience. We engineered a secure and highly scalable platform tailored to their needs.</w:t>
+              <w:t xml:space="preserve">The Challenge  </w:t>
+            </w:r>
+            <w:r>
+              <w:rPr>
+                <w:rFonts w:ascii="Calibri" w:cs="Calibri" w:eastAsia="Calibri" w:hAnsi="Calibri"/>
+                <w:sz w:val="22"/>
+                <w:szCs w:val="22"/>
+              </w:rPr>
+              <w:t xml:space="preserve">Analytics teams could not get full value from data spread across many systems.</w:t>
             </w:r>
           </w:p>
           <w:p>
@@ -4598,198 +6856,17 @@
                 <w:sz w:val="22"/>
                 <w:szCs w:val="22"/>
               </w:rPr>
-              <w:t xml:space="preserve">Result  </w:t>
-            </w:r>
-            <w:r>
-              <w:rPr>
-                <w:rFonts w:ascii="Calibri" w:cs="Calibri" w:eastAsia="Calibri" w:hAnsi="Calibri"/>
-                <w:sz w:val="22"/>
-                <w:szCs w:val="22"/>
-              </w:rPr>
-              <w:t xml:space="preserve">The platform gives the client real time transaction monitoring and a much simpler onboarding process.</w:t>
-            </w:r>
-          </w:p>
-        </w:tc>
-      </w:tr>
-    </w:tbl>
-    <w:p>
-      <w:pPr>
-        <w:pStyle w:val="Heading1"/>
-        <w:keepNext/>
-        <w:spacing w:after="160" w:before="360"/>
-      </w:pPr>
-      <w:r>
-        <w:rPr>
-          <w:rFonts w:ascii="Calibri" w:cs="Calibri" w:eastAsia="Calibri" w:hAnsi="Calibri"/>
-          <w:b/>
-          <w:bCs/>
-          <w:color w:val="22205D"/>
-          <w:sz w:val="34"/>
-          <w:szCs w:val="34"/>
-        </w:rPr>
-        <w:t xml:space="preserve">Slide 10: Why xLoop for Poland, and contact</w:t>
-      </w:r>
-    </w:p>
-    <w:p>
-      <w:pPr>
-        <w:keepNext/>
-        <w:spacing w:after="40"/>
-      </w:pPr>
-      <w:r>
-        <w:drawing>
-          <wp:inline distT="0" distB="0" distL="0" distR="0">
-            <wp:extent cx="3657600" cy="2057400"/>
-            <wp:effectExtent t="0" r="0" b="0" l="0"/>
-            <wp:docPr id="10" name="Source: slide 104" descr="Source: slide 104" title="Source: slide 104"/>
-            <wp:cNvGraphicFramePr>
-              <a:graphicFrameLocks xmlns:a="http://schemas.openxmlformats.org/drawingml/2006/main" noChangeAspect="1"/>
-            </wp:cNvGraphicFramePr>
-            <a:graphic xmlns:a="http://schemas.openxmlformats.org/drawingml/2006/main">
-              <a:graphicData uri="http://schemas.openxmlformats.org/drawingml/2006/picture">
-                <pic:pic xmlns:pic="http://schemas.openxmlformats.org/drawingml/2006/picture">
-                  <pic:nvPicPr>
-                    <pic:cNvPr id="0" name="" descr=""/>
-                    <pic:cNvPicPr>
-                      <a:picLocks noChangeAspect="1" noChangeArrowheads="1"/>
-                    </pic:cNvPicPr>
-                  </pic:nvPicPr>
-                  <pic:blipFill>
-                    <a:blip r:embed="rId16" cstate="none"/>
-                    <a:srcRect/>
-                    <a:stretch>
-                      <a:fillRect/>
-                    </a:stretch>
-                  </pic:blipFill>
-                  <pic:spPr bwMode="auto">
-                    <a:xfrm>
-                      <a:off x="0" y="0"/>
-                      <a:ext cx="3657600" cy="2057400"/>
-                    </a:xfrm>
-                    <a:prstGeom prst="rect">
-                      <a:avLst/>
-                    </a:prstGeom>
-                  </pic:spPr>
-                </pic:pic>
-              </a:graphicData>
-            </a:graphic>
-          </wp:inline>
-        </w:drawing>
-      </w:r>
-    </w:p>
-    <w:p>
-      <w:pPr>
-        <w:spacing w:after="160"/>
-      </w:pPr>
-      <w:r>
-        <w:rPr>
-          <w:rFonts w:ascii="Calibri" w:cs="Calibri" w:eastAsia="Calibri" w:hAnsi="Calibri"/>
-          <w:i/>
-          <w:iCs/>
-          <w:color w:val="5B5A80"/>
-          <w:sz w:val="18"/>
-          <w:szCs w:val="18"/>
-        </w:rPr>
-        <w:t xml:space="preserve">Source: slide 104</w:t>
-      </w:r>
-    </w:p>
-    <w:p>
-      <w:pPr>
-        <w:keepNext/>
-        <w:spacing w:after="60" w:before="120"/>
-      </w:pPr>
-      <w:r>
-        <w:rPr>
-          <w:rFonts w:ascii="Calibri" w:cs="Calibri" w:eastAsia="Calibri" w:hAnsi="Calibri"/>
-          <w:b/>
-          <w:bCs/>
-          <w:color w:val="0061F6"/>
-          <w:sz w:val="18"/>
-          <w:szCs w:val="18"/>
-        </w:rPr>
-        <w:t xml:space="preserve">ACTION</w:t>
-      </w:r>
-    </w:p>
-    <w:p>
-      <w:pPr>
-        <w:pStyle w:val="ListParagraph"/>
-        <w:numPr>
-          <w:ilvl w:val="0"/>
-          <w:numId w:val="2"/>
-        </w:numPr>
-        <w:spacing w:after="60"/>
-      </w:pPr>
-      <w:r>
-        <w:rPr>
-          <w:rFonts w:ascii="Calibri" w:cs="Calibri" w:eastAsia="Calibri" w:hAnsi="Calibri"/>
-          <w:sz w:val="22"/>
-          <w:szCs w:val="22"/>
-        </w:rPr>
-        <w:t xml:space="preserve">Keep the dark design, logo and footer.</w:t>
-      </w:r>
-    </w:p>
-    <w:p>
-      <w:pPr>
-        <w:pStyle w:val="ListParagraph"/>
-        <w:numPr>
-          <w:ilvl w:val="0"/>
-          <w:numId w:val="2"/>
-        </w:numPr>
-        <w:spacing w:after="60"/>
-      </w:pPr>
-      <w:r>
-        <w:rPr>
-          <w:rFonts w:ascii="Calibri" w:cs="Calibri" w:eastAsia="Calibri" w:hAnsi="Calibri"/>
-          <w:sz w:val="22"/>
-          <w:szCs w:val="22"/>
-        </w:rPr>
-        <w:t xml:space="preserve">Replace the headline, body text and button with the copy below.</w:t>
-      </w:r>
-    </w:p>
-    <w:p>
-      <w:pPr>
-        <w:pStyle w:val="ListParagraph"/>
-        <w:numPr>
-          <w:ilvl w:val="0"/>
-          <w:numId w:val="2"/>
-        </w:numPr>
-        <w:spacing w:after="60"/>
-      </w:pPr>
-      <w:r>
-        <w:rPr>
-          <w:rFonts w:ascii="Calibri" w:cs="Calibri" w:eastAsia="Calibri" w:hAnsi="Calibri"/>
-          <w:sz w:val="22"/>
-          <w:szCs w:val="22"/>
-        </w:rPr>
-        <w:t xml:space="preserve">Footer: add the Doha office so it matches the four offices on slide 2.</w:t>
-      </w:r>
-    </w:p>
-    <w:tbl>
-      <w:tblPr>
-        <w:tblW w:type="dxa" w:w="9360"/>
-        <w:tblBorders>
-          <w:top w:val="single" w:color="D5D9E6" w:sz="4"/>
-          <w:left w:val="single" w:color="D5D9E6" w:sz="4"/>
-          <w:bottom w:val="single" w:color="D5D9E6" w:sz="4"/>
-          <w:right w:val="single" w:color="D5D9E6" w:sz="4"/>
-          <w:insideH w:val="single" w:color="D5D9E6" w:sz="4"/>
-          <w:insideV w:val="single" w:color="D5D9E6" w:sz="4"/>
-        </w:tblBorders>
-      </w:tblPr>
-      <w:tblGrid>
-        <w:gridCol w:w="9360"/>
-      </w:tblGrid>
-      <w:tr>
-        <w:tc>
-          <w:tcPr>
-            <w:tcW w:type="dxa" w:w="9360"/>
-            <w:shd w:fill="EEF1F8" w:color="auto" w:val="clear"/>
-            <w:tcMar>
-              <w:top w:type="dxa" w:w="140"/>
-              <w:left w:type="dxa" w:w="180"/>
-              <w:bottom w:type="dxa" w:w="140"/>
-              <w:right w:type="dxa" w:w="180"/>
-            </w:tcMar>
-          </w:tcPr>
+              <w:t xml:space="preserve">What we do  </w:t>
+            </w:r>
+            <w:r>
+              <w:rPr>
+                <w:rFonts w:ascii="Calibri" w:cs="Calibri" w:eastAsia="Calibri" w:hAnsi="Calibri"/>
+                <w:sz w:val="22"/>
+                <w:szCs w:val="22"/>
+              </w:rPr>
+              <w:t xml:space="preserve">We build one trusted data platform on Databricks and Microsoft Azure, so leadership decides from the same numbers.</w:t>
+            </w:r>
+          </w:p>
           <w:p>
             <w:pPr>
               <w:spacing w:after="90"/>
@@ -4803,15 +6880,15 @@
                 <w:sz w:val="22"/>
                 <w:szCs w:val="22"/>
               </w:rPr>
-              <w:t xml:space="preserve">Headline  </w:t>
-            </w:r>
-            <w:r>
-              <w:rPr>
-                <w:rFonts w:ascii="Calibri" w:cs="Calibri" w:eastAsia="Calibri" w:hAnsi="Calibri"/>
-                <w:sz w:val="22"/>
-                <w:szCs w:val="22"/>
-              </w:rPr>
-              <w:t xml:space="preserve">Why xLoop for Poland</w:t>
+              <w:t xml:space="preserve">Client 1  </w:t>
+            </w:r>
+            <w:r>
+              <w:rPr>
+                <w:rFonts w:ascii="Calibri" w:cs="Calibri" w:eastAsia="Calibri" w:hAnsi="Calibri"/>
+                <w:sz w:val="22"/>
+                <w:szCs w:val="22"/>
+              </w:rPr>
+              <w:t xml:space="preserve">A UAE commercial bank Â· Banking Â· Migration to Microsoft Azure</w:t>
             </w:r>
           </w:p>
           <w:p>
@@ -4827,15 +6904,15 @@
                 <w:sz w:val="22"/>
                 <w:szCs w:val="22"/>
               </w:rPr>
-              <w:t xml:space="preserve">Point 1  </w:t>
-            </w:r>
-            <w:r>
-              <w:rPr>
-                <w:rFonts w:ascii="Calibri" w:cs="Calibri" w:eastAsia="Calibri" w:hAnsi="Calibri"/>
-                <w:sz w:val="22"/>
-                <w:szCs w:val="22"/>
-              </w:rPr>
-              <w:t xml:space="preserve">We already deliver for Polish companies: a fintech platform, plus application modernization and a SIEM migration for a Polish cloud company.</w:t>
+              <w:t xml:space="preserve">Client 2  </w:t>
+            </w:r>
+            <w:r>
+              <w:rPr>
+                <w:rFonts w:ascii="Calibri" w:cs="Calibri" w:eastAsia="Calibri" w:hAnsi="Calibri"/>
+                <w:sz w:val="22"/>
+                <w:szCs w:val="22"/>
+              </w:rPr>
+              <w:t xml:space="preserve">A leading UAE real estate group Â· Real Estate Â· Data platform on Databricks</w:t>
             </w:r>
           </w:p>
           <w:p>
@@ -4851,358 +6928,6 @@
                 <w:sz w:val="22"/>
                 <w:szCs w:val="22"/>
               </w:rPr>
-              <w:t xml:space="preserve">Point 2  </w:t>
-            </w:r>
-            <w:r>
-              <w:rPr>
-                <w:rFonts w:ascii="Calibri" w:cs="Calibri" w:eastAsia="Calibri" w:hAnsi="Calibri"/>
-                <w:sz w:val="22"/>
-                <w:szCs w:val="22"/>
-              </w:rPr>
-              <w:t xml:space="preserve">People in your time zone: team members based in Hungary.</w:t>
-            </w:r>
-          </w:p>
-          <w:p>
-            <w:pPr>
-              <w:spacing w:after="90"/>
-            </w:pPr>
-            <w:r>
-              <w:rPr>
-                <w:rFonts w:ascii="Calibri" w:cs="Calibri" w:eastAsia="Calibri" w:hAnsi="Calibri"/>
-                <w:b/>
-                <w:bCs/>
-                <w:color w:val="22205D"/>
-                <w:sz w:val="22"/>
-                <w:szCs w:val="22"/>
-              </w:rPr>
-              <w:t xml:space="preserve">Point 3  </w:t>
-            </w:r>
-            <w:r>
-              <w:rPr>
-                <w:rFonts w:ascii="Calibri" w:cs="Calibri" w:eastAsia="Calibri" w:hAnsi="Calibri"/>
-                <w:sz w:val="22"/>
-                <w:szCs w:val="22"/>
-              </w:rPr>
-              <w:t xml:space="preserve">AI first, with security built in: certified ISO 42001 and ISO 27001 Lead Auditors on our team.</w:t>
-            </w:r>
-          </w:p>
-          <w:p>
-            <w:pPr>
-              <w:spacing w:after="90"/>
-            </w:pPr>
-            <w:r>
-              <w:rPr>
-                <w:rFonts w:ascii="Calibri" w:cs="Calibri" w:eastAsia="Calibri" w:hAnsi="Calibri"/>
-                <w:b/>
-                <w:bCs/>
-                <w:color w:val="22205D"/>
-                <w:sz w:val="22"/>
-                <w:szCs w:val="22"/>
-              </w:rPr>
-              <w:t xml:space="preserve">Quote  </w:t>
-            </w:r>
-            <w:r>
-              <w:rPr>
-                <w:rFonts w:ascii="Calibri" w:cs="Calibri" w:eastAsia="Calibri" w:hAnsi="Calibri"/>
-                <w:sz w:val="22"/>
-                <w:szCs w:val="22"/>
-              </w:rPr>
-              <w:t xml:space="preserve">“xLoop architects meticulously planned and executed the migration, ensuring minimal disruption to our operations.”</w:t>
-            </w:r>
-          </w:p>
-          <w:p>
-            <w:pPr>
-              <w:spacing w:after="90"/>
-            </w:pPr>
-            <w:r>
-              <w:rPr>
-                <w:rFonts w:ascii="Calibri" w:cs="Calibri" w:eastAsia="Calibri" w:hAnsi="Calibri"/>
-                <w:b/>
-                <w:bCs/>
-                <w:color w:val="22205D"/>
-                <w:sz w:val="22"/>
-                <w:szCs w:val="22"/>
-              </w:rPr>
-              <w:t xml:space="preserve">Attribution  </w:t>
-            </w:r>
-            <w:r>
-              <w:rPr>
-                <w:rFonts w:ascii="Calibri" w:cs="Calibri" w:eastAsia="Calibri" w:hAnsi="Calibri"/>
-                <w:sz w:val="22"/>
-                <w:szCs w:val="22"/>
-              </w:rPr>
-              <w:t xml:space="preserve">John Waterhouse, Founder and CEO, Cloud Titans Ltd</w:t>
-            </w:r>
-          </w:p>
-          <w:p>
-            <w:pPr>
-              <w:spacing w:after="90"/>
-            </w:pPr>
-            <w:r>
-              <w:rPr>
-                <w:rFonts w:ascii="Calibri" w:cs="Calibri" w:eastAsia="Calibri" w:hAnsi="Calibri"/>
-                <w:b/>
-                <w:bCs/>
-                <w:color w:val="22205D"/>
-                <w:sz w:val="22"/>
-                <w:szCs w:val="22"/>
-              </w:rPr>
-              <w:t xml:space="preserve">Button  </w:t>
-            </w:r>
-            <w:r>
-              <w:rPr>
-                <w:rFonts w:ascii="Calibri" w:cs="Calibri" w:eastAsia="Calibri" w:hAnsi="Calibri"/>
-                <w:sz w:val="22"/>
-                <w:szCs w:val="22"/>
-              </w:rPr>
-              <w:t xml:space="preserve">Start with one use case</w:t>
-            </w:r>
-          </w:p>
-          <w:p>
-            <w:pPr>
-              <w:spacing w:after="90"/>
-            </w:pPr>
-            <w:r>
-              <w:rPr>
-                <w:rFonts w:ascii="Calibri" w:cs="Calibri" w:eastAsia="Calibri" w:hAnsi="Calibri"/>
-                <w:b/>
-                <w:bCs/>
-                <w:color w:val="22205D"/>
-                <w:sz w:val="22"/>
-                <w:szCs w:val="22"/>
-              </w:rPr>
-              <w:t xml:space="preserve">Doha footer  </w:t>
-            </w:r>
-            <w:r>
-              <w:rPr>
-                <w:rFonts w:ascii="Calibri" w:cs="Calibri" w:eastAsia="Calibri" w:hAnsi="Calibri"/>
-                <w:sz w:val="22"/>
-                <w:szCs w:val="22"/>
-              </w:rPr>
-              <w:t xml:space="preserve">QFC Tower 1, West Bay, Doha, Qatar (RHQ)</w:t>
-            </w:r>
-          </w:p>
-        </w:tc>
-      </w:tr>
-    </w:tbl>
-    <w:p>
-      <w:pPr>
-        <w:spacing w:after="60"/>
-      </w:pPr>
-      <w:r>
-        <w:rPr>
-          <w:rFonts w:ascii="Calibri" w:cs="Calibri" w:eastAsia="Calibri" w:hAnsi="Calibri"/>
-          <w:sz w:val="22"/>
-          <w:szCs w:val="22"/>
-        </w:rPr>
-        <w:t xml:space="preserve"/>
-      </w:r>
-    </w:p>
-    <w:p>
-      <w:pPr>
-        <w:spacing w:after="120"/>
-      </w:pPr>
-      <w:r>
-        <w:rPr>
-          <w:rFonts w:ascii="Calibri" w:cs="Calibri" w:eastAsia="Calibri" w:hAnsi="Calibri"/>
-          <w:color w:val="5B5A80"/>
-          <w:sz w:val="20"/>
-          <w:szCs w:val="20"/>
-        </w:rPr>
-        <w:t xml:space="preserve">The quote must stay word for word. It is from a signed testimonial and is the only client name allowed in the deck.</w:t>
-      </w:r>
-    </w:p>
-    <w:p>
-      <w:pPr>
-        <w:pStyle w:val="Heading1"/>
-        <w:keepNext/>
-        <w:spacing w:after="160" w:before="360"/>
-      </w:pPr>
-      <w:r>
-        <w:rPr>
-          <w:rFonts w:ascii="Calibri" w:cs="Calibri" w:eastAsia="Calibri" w:hAnsi="Calibri"/>
-          <w:b/>
-          <w:bCs/>
-          <w:color w:val="22205D"/>
-          <w:sz w:val="34"/>
-          <w:szCs w:val="34"/>
-        </w:rPr>
-        <w:t xml:space="preserve">Optional swap: Gulf data platforms</w:t>
-      </w:r>
-    </w:p>
-    <w:p>
-      <w:pPr>
-        <w:spacing w:after="120"/>
-      </w:pPr>
-      <w:r>
-        <w:rPr>
-          <w:rFonts w:ascii="Calibri" w:cs="Calibri" w:eastAsia="Calibri" w:hAnsi="Calibri"/>
-          <w:sz w:val="22"/>
-          <w:szCs w:val="22"/>
-        </w:rPr>
-        <w:t xml:space="preserve">Use this only if sales asks for the bank, real estate and maritime clients as a case study. It would replace slide 8. Build it on the slide 38 template (Challenge, What xLoop Delivered, Business Value).</w:t>
-      </w:r>
-    </w:p>
-    <w:tbl>
-      <w:tblPr>
-        <w:tblW w:type="dxa" w:w="9360"/>
-        <w:tblBorders>
-          <w:top w:val="single" w:color="D5D9E6" w:sz="4"/>
-          <w:left w:val="single" w:color="D5D9E6" w:sz="4"/>
-          <w:bottom w:val="single" w:color="D5D9E6" w:sz="4"/>
-          <w:right w:val="single" w:color="D5D9E6" w:sz="4"/>
-          <w:insideH w:val="single" w:color="D5D9E6" w:sz="4"/>
-          <w:insideV w:val="single" w:color="D5D9E6" w:sz="4"/>
-        </w:tblBorders>
-      </w:tblPr>
-      <w:tblGrid>
-        <w:gridCol w:w="9360"/>
-      </w:tblGrid>
-      <w:tr>
-        <w:tc>
-          <w:tcPr>
-            <w:tcW w:type="dxa" w:w="9360"/>
-            <w:shd w:fill="EEF1F8" w:color="auto" w:val="clear"/>
-            <w:tcMar>
-              <w:top w:type="dxa" w:w="140"/>
-              <w:left w:type="dxa" w:w="180"/>
-              <w:bottom w:type="dxa" w:w="140"/>
-              <w:right w:type="dxa" w:w="180"/>
-            </w:tcMar>
-          </w:tcPr>
-          <w:p>
-            <w:pPr>
-              <w:spacing w:after="90"/>
-            </w:pPr>
-            <w:r>
-              <w:rPr>
-                <w:rFonts w:ascii="Calibri" w:cs="Calibri" w:eastAsia="Calibri" w:hAnsi="Calibri"/>
-                <w:b/>
-                <w:bCs/>
-                <w:color w:val="22205D"/>
-                <w:sz w:val="22"/>
-                <w:szCs w:val="22"/>
-              </w:rPr>
-              <w:t xml:space="preserve">Title  </w:t>
-            </w:r>
-            <w:r>
-              <w:rPr>
-                <w:rFonts w:ascii="Calibri" w:cs="Calibri" w:eastAsia="Calibri" w:hAnsi="Calibri"/>
-                <w:sz w:val="22"/>
-                <w:szCs w:val="22"/>
-              </w:rPr>
-              <w:t xml:space="preserve">One Source of Truth for Gulf Enterprises</w:t>
-            </w:r>
-          </w:p>
-          <w:p>
-            <w:pPr>
-              <w:spacing w:after="90"/>
-            </w:pPr>
-            <w:r>
-              <w:rPr>
-                <w:rFonts w:ascii="Calibri" w:cs="Calibri" w:eastAsia="Calibri" w:hAnsi="Calibri"/>
-                <w:b/>
-                <w:bCs/>
-                <w:color w:val="22205D"/>
-                <w:sz w:val="22"/>
-                <w:szCs w:val="22"/>
-              </w:rPr>
-              <w:t xml:space="preserve">The Challenge  </w:t>
-            </w:r>
-            <w:r>
-              <w:rPr>
-                <w:rFonts w:ascii="Calibri" w:cs="Calibri" w:eastAsia="Calibri" w:hAnsi="Calibri"/>
-                <w:sz w:val="22"/>
-                <w:szCs w:val="22"/>
-              </w:rPr>
-              <w:t xml:space="preserve">Analytics teams could not get full value from data spread across many systems.</w:t>
-            </w:r>
-          </w:p>
-          <w:p>
-            <w:pPr>
-              <w:spacing w:after="90"/>
-            </w:pPr>
-            <w:r>
-              <w:rPr>
-                <w:rFonts w:ascii="Calibri" w:cs="Calibri" w:eastAsia="Calibri" w:hAnsi="Calibri"/>
-                <w:b/>
-                <w:bCs/>
-                <w:color w:val="22205D"/>
-                <w:sz w:val="22"/>
-                <w:szCs w:val="22"/>
-              </w:rPr>
-              <w:t xml:space="preserve">What we do  </w:t>
-            </w:r>
-            <w:r>
-              <w:rPr>
-                <w:rFonts w:ascii="Calibri" w:cs="Calibri" w:eastAsia="Calibri" w:hAnsi="Calibri"/>
-                <w:sz w:val="22"/>
-                <w:szCs w:val="22"/>
-              </w:rPr>
-              <w:t xml:space="preserve">We build one trusted data platform on Databricks and Microsoft Azure, so leadership decides from the same numbers.</w:t>
-            </w:r>
-          </w:p>
-          <w:p>
-            <w:pPr>
-              <w:spacing w:after="90"/>
-            </w:pPr>
-            <w:r>
-              <w:rPr>
-                <w:rFonts w:ascii="Calibri" w:cs="Calibri" w:eastAsia="Calibri" w:hAnsi="Calibri"/>
-                <w:b/>
-                <w:bCs/>
-                <w:color w:val="22205D"/>
-                <w:sz w:val="22"/>
-                <w:szCs w:val="22"/>
-              </w:rPr>
-              <w:t xml:space="preserve">Client 1  </w:t>
-            </w:r>
-            <w:r>
-              <w:rPr>
-                <w:rFonts w:ascii="Calibri" w:cs="Calibri" w:eastAsia="Calibri" w:hAnsi="Calibri"/>
-                <w:sz w:val="22"/>
-                <w:szCs w:val="22"/>
-              </w:rPr>
-              <w:t xml:space="preserve">A UAE commercial bank · Banking · Migration to Microsoft Azure</w:t>
-            </w:r>
-          </w:p>
-          <w:p>
-            <w:pPr>
-              <w:spacing w:after="90"/>
-            </w:pPr>
-            <w:r>
-              <w:rPr>
-                <w:rFonts w:ascii="Calibri" w:cs="Calibri" w:eastAsia="Calibri" w:hAnsi="Calibri"/>
-                <w:b/>
-                <w:bCs/>
-                <w:color w:val="22205D"/>
-                <w:sz w:val="22"/>
-                <w:szCs w:val="22"/>
-              </w:rPr>
-              <w:t xml:space="preserve">Client 2  </w:t>
-            </w:r>
-            <w:r>
-              <w:rPr>
-                <w:rFonts w:ascii="Calibri" w:cs="Calibri" w:eastAsia="Calibri" w:hAnsi="Calibri"/>
-                <w:sz w:val="22"/>
-                <w:szCs w:val="22"/>
-              </w:rPr>
-              <w:t xml:space="preserve">A leading UAE real estate group · Real Estate · Data platform on Databricks</w:t>
-            </w:r>
-          </w:p>
-          <w:p>
-            <w:pPr>
-              <w:spacing w:after="90"/>
-            </w:pPr>
-            <w:r>
-              <w:rPr>
-                <w:rFonts w:ascii="Calibri" w:cs="Calibri" w:eastAsia="Calibri" w:hAnsi="Calibri"/>
-                <w:b/>
-                <w:bCs/>
-                <w:color w:val="22205D"/>
-                <w:sz w:val="22"/>
-                <w:szCs w:val="22"/>
-              </w:rPr>
               <w:t xml:space="preserve">Client 3  </w:t>
             </w:r>
             <w:r>
@@ -5211,7 +6936,7 @@
                 <w:sz w:val="22"/>
                 <w:szCs w:val="22"/>
               </w:rPr>
-              <w:t xml:space="preserve">A global maritime services company · Maritime · Data platform on Databricks</w:t>
+              <w:t xml:space="preserve">A global maritime services company Â· Maritime Â· Data platform on Databricks</w:t>
             </w:r>
           </w:p>
           <w:p>
@@ -5416,7 +7141,7 @@
     <w:lvl w:ilvl="0" w:tentative="1">
       <w:start w:val="1"/>
       <w:numFmt w:val="bullet"/>
-      <w:lvlText w:val="•"/>
+      <w:lvlText w:val="â€¢"/>
       <w:lvlJc w:val="left"/>
       <w:pPr>
         <w:ind w:left="540" w:hanging="260"/>

</xml_diff>

<commit_message>
Auto-save: 1 file(s) — 2026-10-16 18:31
</commit_message>
<xml_diff>
--- a/Notes/2026-10-16-xloop-poland-pitch-slide-plan.docx
+++ b/Notes/2026-10-16-xloop-poland-pitch-slide-plan.docx
@@ -75,7 +75,7 @@
           <w:sz w:val="22"/>
           <w:szCs w:val="22"/>
         </w:rPr>
-        <w:t xml:space="preserve">10 slides. Five case studies, with credentials and story around them.</w:t>
+        <w:t xml:space="preserve">11 slides. Six case studies, with credentials and story around them.</w:t>
       </w:r>
     </w:p>
     <w:p>
@@ -216,7 +216,7 @@
           <w:sz w:val="34"/>
           <w:szCs w:val="34"/>
         </w:rPr>
-        <w:t xml:space="preserve">The 10 slides at a glance</w:t>
+        <w:t xml:space="preserve">The 11 slides at a glance</w:t>
       </w:r>
     </w:p>
     <w:tbl>
@@ -1278,7 +1278,7 @@
                 <w:sz w:val="19"/>
                 <w:szCs w:val="19"/>
               </w:rPr>
-              <w:t xml:space="preserve">Case: Poland fintech</w:t>
+              <w:t xml:space="preserve">Case: Gulf data platforms</w:t>
             </w:r>
           </w:p>
         </w:tc>
@@ -1304,7 +1304,7 @@
                 <w:sz w:val="19"/>
                 <w:szCs w:val="19"/>
               </w:rPr>
-              <w:t xml:space="preserve">Slide 62</w:t>
+              <w:t xml:space="preserve">New, on the slide 36 layout</w:t>
             </w:r>
           </w:p>
         </w:tc>
@@ -1330,7 +1330,7 @@
                 <w:sz w:val="19"/>
                 <w:szCs w:val="19"/>
               </w:rPr>
-              <w:t xml:space="preserve">Rebuild on the slide 36 layout</w:t>
+              <w:t xml:space="preserve">New slide</w:t>
             </w:r>
           </w:p>
         </w:tc>
@@ -1362,6 +1362,115 @@
                 <w:szCs w:val="19"/>
               </w:rPr>
               <w:t xml:space="preserve">10</w:t>
+            </w:r>
+          </w:p>
+        </w:tc>
+        <w:tc>
+          <w:tcPr>
+            <w:tcW w:type="dxa" w:w="3200"/>
+            <w:tcMar>
+              <w:top w:type="dxa" w:w="80"/>
+              <w:left w:type="dxa" w:w="100"/>
+              <w:bottom w:type="dxa" w:w="80"/>
+              <w:right w:type="dxa" w:w="100"/>
+            </w:tcMar>
+          </w:tcPr>
+          <w:p>
+            <w:pPr>
+              <w:spacing w:after="40"/>
+            </w:pPr>
+            <w:r>
+              <w:rPr>
+                <w:rFonts w:ascii="Calibri" w:cs="Calibri" w:eastAsia="Calibri" w:hAnsi="Calibri"/>
+                <w:b w:val="false"/>
+                <w:bCs w:val="false"/>
+                <w:sz w:val="19"/>
+                <w:szCs w:val="19"/>
+              </w:rPr>
+              <w:t xml:space="preserve">Case: Poland fintech</w:t>
+            </w:r>
+          </w:p>
+        </w:tc>
+        <w:tc>
+          <w:tcPr>
+            <w:tcW w:type="dxa" w:w="2860"/>
+            <w:tcMar>
+              <w:top w:type="dxa" w:w="80"/>
+              <w:left w:type="dxa" w:w="100"/>
+              <w:bottom w:type="dxa" w:w="80"/>
+              <w:right w:type="dxa" w:w="100"/>
+            </w:tcMar>
+          </w:tcPr>
+          <w:p>
+            <w:pPr>
+              <w:spacing w:after="40"/>
+            </w:pPr>
+            <w:r>
+              <w:rPr>
+                <w:rFonts w:ascii="Calibri" w:cs="Calibri" w:eastAsia="Calibri" w:hAnsi="Calibri"/>
+                <w:b w:val="false"/>
+                <w:bCs w:val="false"/>
+                <w:sz w:val="19"/>
+                <w:szCs w:val="19"/>
+              </w:rPr>
+              <w:t xml:space="preserve">Slide 62</w:t>
+            </w:r>
+          </w:p>
+        </w:tc>
+        <w:tc>
+          <w:tcPr>
+            <w:tcW w:type="dxa" w:w="2800"/>
+            <w:tcMar>
+              <w:top w:type="dxa" w:w="80"/>
+              <w:left w:type="dxa" w:w="100"/>
+              <w:bottom w:type="dxa" w:w="80"/>
+              <w:right w:type="dxa" w:w="100"/>
+            </w:tcMar>
+          </w:tcPr>
+          <w:p>
+            <w:pPr>
+              <w:spacing w:after="40"/>
+            </w:pPr>
+            <w:r>
+              <w:rPr>
+                <w:rFonts w:ascii="Calibri" w:cs="Calibri" w:eastAsia="Calibri" w:hAnsi="Calibri"/>
+                <w:b w:val="false"/>
+                <w:bCs w:val="false"/>
+                <w:sz w:val="19"/>
+                <w:szCs w:val="19"/>
+              </w:rPr>
+              <w:t xml:space="preserve">Rebuild on the slide 36 layout</w:t>
+            </w:r>
+          </w:p>
+        </w:tc>
+      </w:tr>
+      <w:tr>
+        <w:trPr>
+          <w:tblHeader w:val="off"/>
+        </w:trPr>
+        <w:tc>
+          <w:tcPr>
+            <w:tcW w:type="dxa" w:w="500"/>
+            <w:tcMar>
+              <w:top w:type="dxa" w:w="80"/>
+              <w:left w:type="dxa" w:w="100"/>
+              <w:bottom w:type="dxa" w:w="80"/>
+              <w:right w:type="dxa" w:w="100"/>
+            </w:tcMar>
+          </w:tcPr>
+          <w:p>
+            <w:pPr>
+              <w:spacing w:after="40"/>
+            </w:pPr>
+            <w:r>
+              <w:rPr>
+                <w:rFonts w:ascii="Calibri" w:cs="Calibri" w:eastAsia="Calibri" w:hAnsi="Calibri"/>
+                <w:b w:val="false"/>
+                <w:bCs w:val="false"/>
+                <w:sz w:val="19"/>
+                <w:szCs w:val="19"/>
+              </w:rPr>
+              <w:t xml:space="preserve">11</w:t>
             </w:r>
           </w:p>
         </w:tc>
@@ -3746,7 +3855,7 @@
           <w:sz w:val="34"/>
           <w:szCs w:val="34"/>
         </w:rPr>
-        <w:t xml:space="preserve">Slides 5 to 9: Case studies</w:t>
+        <w:t xml:space="preserve">Slides 5 to 10: Case studies</w:t>
       </w:r>
     </w:p>
     <w:p>
@@ -3759,7 +3868,7 @@
           <w:sz w:val="22"/>
           <w:szCs w:val="22"/>
         </w:rPr>
-        <w:t xml:space="preserve">All five cases use one layout, so the deck reads as one set. Use the slide 36 layout for every case. Rebuild slides 27, 25, 28 and 62 on it, and reuse their existing images.</w:t>
+        <w:t xml:space="preserve">All six cases use one layout, so the deck reads as one set. Use the slide 36 layout for every case. Rebuild slides 27, 25, 28 and 62 on it, build the Gulf case new on it, and reuse their existing images.</w:t>
       </w:r>
     </w:p>
     <w:p>
@@ -3772,7 +3881,7 @@
           <wp:inline distT="0" distB="0" distL="0" distR="0">
             <wp:extent cx="3657600" cy="2057400"/>
             <wp:effectExtent t="0" r="0" b="0" l="0"/>
-            <wp:docPr id="5" name="Layout for all five cases: slide 36" descr="Layout for all five cases: slide 36" title="Layout for all five cases: slide 36"/>
+            <wp:docPr id="5" name="Layout for all six cases: slide 36" descr="Layout for all six cases: slide 36" title="Layout for all six cases: slide 36"/>
             <wp:cNvGraphicFramePr>
               <a:graphicFrameLocks xmlns:a="http://schemas.openxmlformats.org/drawingml/2006/main" noChangeAspect="1"/>
             </wp:cNvGraphicFramePr>
@@ -3821,7 +3930,7 @@
           <w:sz w:val="18"/>
           <w:szCs w:val="18"/>
         </w:rPr>
-        <w:t xml:space="preserve">Layout for all five cases: slide 36</w:t>
+        <w:t xml:space="preserve">Layout for all six cases: slide 36</w:t>
       </w:r>
     </w:p>
     <w:p>
@@ -5986,7 +6095,7 @@
           <w:sz w:val="28"/>
           <w:szCs w:val="28"/>
         </w:rPr>
-        <w:t xml:space="preserve">Slide 9: Poland, fintech platform</w:t>
+        <w:t xml:space="preserve">Slide 9: Gulf, data platforms</w:t>
       </w:r>
     </w:p>
     <w:p>
@@ -6009,7 +6118,7 @@
           <w:sz w:val="22"/>
           <w:szCs w:val="22"/>
         </w:rPr>
-        <w:t xml:space="preserve">slide 62. Rebuild on the slide 36 layout with the copy below. Reuse the current image.</w:t>
+        <w:t xml:space="preserve">new slide on the slide 36 layout. Use the image from slide 38. No client names or logos.</w:t>
       </w:r>
     </w:p>
     <w:tbl>
@@ -6063,6 +6172,339 @@
                 <w:sz w:val="22"/>
                 <w:szCs w:val="22"/>
               </w:rPr>
+              <w:t xml:space="preserve">Three Gulf enterprises: a UAE commercial bank, a leading UAE real estate group and a global maritime services company</w:t>
+            </w:r>
+          </w:p>
+          <w:p>
+            <w:pPr>
+              <w:spacing w:after="90"/>
+            </w:pPr>
+            <w:r>
+              <w:rPr>
+                <w:rFonts w:ascii="Calibri" w:cs="Calibri" w:eastAsia="Calibri" w:hAnsi="Calibri"/>
+                <w:b/>
+                <w:bCs/>
+                <w:color w:val="22205D"/>
+                <w:sz w:val="22"/>
+                <w:szCs w:val="22"/>
+              </w:rPr>
+              <w:t xml:space="preserve">Headline  </w:t>
+            </w:r>
+            <w:r>
+              <w:rPr>
+                <w:rFonts w:ascii="Calibri" w:cs="Calibri" w:eastAsia="Calibri" w:hAnsi="Calibri"/>
+                <w:sz w:val="22"/>
+                <w:szCs w:val="22"/>
+              </w:rPr>
+              <w:t xml:space="preserve">One Source of Truth for Gulf Enterprises</w:t>
+            </w:r>
+          </w:p>
+          <w:p>
+            <w:pPr>
+              <w:spacing w:after="90"/>
+            </w:pPr>
+            <w:r>
+              <w:rPr>
+                <w:rFonts w:ascii="Calibri" w:cs="Calibri" w:eastAsia="Calibri" w:hAnsi="Calibri"/>
+                <w:b/>
+                <w:bCs/>
+                <w:color w:val="22205D"/>
+                <w:sz w:val="22"/>
+                <w:szCs w:val="22"/>
+              </w:rPr>
+              <w:t xml:space="preserve">Summary  </w:t>
+            </w:r>
+            <w:r>
+              <w:rPr>
+                <w:rFonts w:ascii="Calibri" w:cs="Calibri" w:eastAsia="Calibri" w:hAnsi="Calibri"/>
+                <w:sz w:val="22"/>
+                <w:szCs w:val="22"/>
+              </w:rPr>
+              <w:t xml:space="preserve">One trusted data platform for each of three Gulf enterprises, so leadership decides from the same numbers.</w:t>
+            </w:r>
+          </w:p>
+          <w:p>
+            <w:pPr>
+              <w:spacing w:after="90"/>
+            </w:pPr>
+            <w:r>
+              <w:rPr>
+                <w:rFonts w:ascii="Calibri" w:cs="Calibri" w:eastAsia="Calibri" w:hAnsi="Calibri"/>
+                <w:b/>
+                <w:bCs/>
+                <w:color w:val="22205D"/>
+                <w:sz w:val="22"/>
+                <w:szCs w:val="22"/>
+              </w:rPr>
+              <w:t xml:space="preserve">Tags  </w:t>
+            </w:r>
+            <w:r>
+              <w:rPr>
+                <w:rFonts w:ascii="Calibri" w:cs="Calibri" w:eastAsia="Calibri" w:hAnsi="Calibri"/>
+                <w:sz w:val="22"/>
+                <w:szCs w:val="22"/>
+              </w:rPr>
+              <w:t xml:space="preserve">Gulf Enterprises  Â·  Data Platforms  Â·  Databricks and Azure</w:t>
+            </w:r>
+          </w:p>
+          <w:p>
+            <w:pPr>
+              <w:spacing w:after="90"/>
+            </w:pPr>
+            <w:r>
+              <w:rPr>
+                <w:rFonts w:ascii="Calibri" w:cs="Calibri" w:eastAsia="Calibri" w:hAnsi="Calibri"/>
+                <w:b/>
+                <w:bCs/>
+                <w:color w:val="22205D"/>
+                <w:sz w:val="22"/>
+                <w:szCs w:val="22"/>
+              </w:rPr>
+              <w:t xml:space="preserve">The Challenge  </w:t>
+            </w:r>
+            <w:r>
+              <w:rPr>
+                <w:rFonts w:ascii="Calibri" w:cs="Calibri" w:eastAsia="Calibri" w:hAnsi="Calibri"/>
+                <w:sz w:val="22"/>
+                <w:szCs w:val="22"/>
+              </w:rPr>
+              <w:t xml:space="preserve"/>
+            </w:r>
+          </w:p>
+          <w:p>
+            <w:pPr>
+              <w:spacing w:after="90"/>
+            </w:pPr>
+            <w:r>
+              <w:rPr>
+                <w:rFonts w:ascii="Calibri" w:cs="Calibri" w:eastAsia="Calibri" w:hAnsi="Calibri"/>
+                <w:sz w:val="22"/>
+                <w:szCs w:val="22"/>
+              </w:rPr>
+              <w:t xml:space="preserve">â€¢  Analytics teams could not get full value from their data.</w:t>
+            </w:r>
+          </w:p>
+          <w:p>
+            <w:pPr>
+              <w:spacing w:after="90"/>
+            </w:pPr>
+            <w:r>
+              <w:rPr>
+                <w:rFonts w:ascii="Calibri" w:cs="Calibri" w:eastAsia="Calibri" w:hAnsi="Calibri"/>
+                <w:sz w:val="22"/>
+                <w:szCs w:val="22"/>
+              </w:rPr>
+              <w:t xml:space="preserve">â€¢  Data sat across many systems, without a single source of truth.</w:t>
+            </w:r>
+          </w:p>
+          <w:p>
+            <w:pPr>
+              <w:spacing w:after="90"/>
+            </w:pPr>
+            <w:r>
+              <w:rPr>
+                <w:rFonts w:ascii="Calibri" w:cs="Calibri" w:eastAsia="Calibri" w:hAnsi="Calibri"/>
+                <w:sz w:val="22"/>
+                <w:szCs w:val="22"/>
+              </w:rPr>
+              <w:t xml:space="preserve">â€¢  Leadership needed one trusted view to make better decisions.</w:t>
+            </w:r>
+          </w:p>
+          <w:p>
+            <w:pPr>
+              <w:spacing w:after="90"/>
+            </w:pPr>
+            <w:r>
+              <w:rPr>
+                <w:rFonts w:ascii="Calibri" w:cs="Calibri" w:eastAsia="Calibri" w:hAnsi="Calibri"/>
+                <w:b/>
+                <w:bCs/>
+                <w:color w:val="22205D"/>
+                <w:sz w:val="22"/>
+                <w:szCs w:val="22"/>
+              </w:rPr>
+              <w:t xml:space="preserve">What xLoop Delivered  </w:t>
+            </w:r>
+            <w:r>
+              <w:rPr>
+                <w:rFonts w:ascii="Calibri" w:cs="Calibri" w:eastAsia="Calibri" w:hAnsi="Calibri"/>
+                <w:sz w:val="22"/>
+                <w:szCs w:val="22"/>
+              </w:rPr>
+              <w:t xml:space="preserve"/>
+            </w:r>
+          </w:p>
+          <w:p>
+            <w:pPr>
+              <w:spacing w:after="90"/>
+            </w:pPr>
+            <w:r>
+              <w:rPr>
+                <w:rFonts w:ascii="Calibri" w:cs="Calibri" w:eastAsia="Calibri" w:hAnsi="Calibri"/>
+                <w:sz w:val="22"/>
+                <w:szCs w:val="22"/>
+              </w:rPr>
+              <w:t xml:space="preserve">1  UAE Commercial Bank: Migration to Microsoft Azure.</w:t>
+            </w:r>
+          </w:p>
+          <w:p>
+            <w:pPr>
+              <w:spacing w:after="90"/>
+            </w:pPr>
+            <w:r>
+              <w:rPr>
+                <w:rFonts w:ascii="Calibri" w:cs="Calibri" w:eastAsia="Calibri" w:hAnsi="Calibri"/>
+                <w:sz w:val="22"/>
+                <w:szCs w:val="22"/>
+              </w:rPr>
+              <w:t xml:space="preserve">2  UAE Real Estate Group: A single source of truth built on Databricks.</w:t>
+            </w:r>
+          </w:p>
+          <w:p>
+            <w:pPr>
+              <w:spacing w:after="90"/>
+            </w:pPr>
+            <w:r>
+              <w:rPr>
+                <w:rFonts w:ascii="Calibri" w:cs="Calibri" w:eastAsia="Calibri" w:hAnsi="Calibri"/>
+                <w:sz w:val="22"/>
+                <w:szCs w:val="22"/>
+              </w:rPr>
+              <w:t xml:space="preserve">3  Global Maritime Services Company: A single source of truth built on Databricks.</w:t>
+            </w:r>
+          </w:p>
+          <w:p>
+            <w:pPr>
+              <w:spacing w:after="90"/>
+            </w:pPr>
+            <w:r>
+              <w:rPr>
+                <w:rFonts w:ascii="Calibri" w:cs="Calibri" w:eastAsia="Calibri" w:hAnsi="Calibri"/>
+                <w:sz w:val="22"/>
+                <w:szCs w:val="22"/>
+              </w:rPr>
+              <w:t xml:space="preserve">4  One Approach: We build one governed data platform, so teams work from one set of numbers.</w:t>
+            </w:r>
+          </w:p>
+          <w:p>
+            <w:pPr>
+              <w:spacing w:after="90"/>
+            </w:pPr>
+            <w:r>
+              <w:rPr>
+                <w:rFonts w:ascii="Calibri" w:cs="Calibri" w:eastAsia="Calibri" w:hAnsi="Calibri"/>
+                <w:b/>
+                <w:bCs/>
+                <w:color w:val="22205D"/>
+                <w:sz w:val="22"/>
+                <w:szCs w:val="22"/>
+              </w:rPr>
+              <w:t xml:space="preserve">Business Value  </w:t>
+            </w:r>
+            <w:r>
+              <w:rPr>
+                <w:rFonts w:ascii="Calibri" w:cs="Calibri" w:eastAsia="Calibri" w:hAnsi="Calibri"/>
+                <w:sz w:val="22"/>
+                <w:szCs w:val="22"/>
+              </w:rPr>
+              <w:t xml:space="preserve">One trusted source of data  Â·  Decisions from the same numbers  Â·  Analytics on a modern cloud platform  Â·  331% ROI reported for Azure Databricks (Forrester TEI, commissioned by Microsoft) [Sana to confirm the figure]</w:t>
+            </w:r>
+          </w:p>
+        </w:tc>
+      </w:tr>
+    </w:tbl>
+    <w:p>
+      <w:pPr>
+        <w:pStyle w:val="Heading2"/>
+        <w:keepNext/>
+        <w:spacing w:after="120" w:before="280"/>
+      </w:pPr>
+      <w:r>
+        <w:rPr>
+          <w:rFonts w:ascii="Calibri" w:cs="Calibri" w:eastAsia="Calibri" w:hAnsi="Calibri"/>
+          <w:b/>
+          <w:bCs/>
+          <w:color w:val="22205D"/>
+          <w:sz w:val="28"/>
+          <w:szCs w:val="28"/>
+        </w:rPr>
+        <w:t xml:space="preserve">Slide 10: Poland, fintech platform</w:t>
+      </w:r>
+    </w:p>
+    <w:p>
+      <w:pPr>
+        <w:spacing w:after="120"/>
+      </w:pPr>
+      <w:r>
+        <w:rPr>
+          <w:rFonts w:ascii="Calibri" w:cs="Calibri" w:eastAsia="Calibri" w:hAnsi="Calibri"/>
+          <w:b/>
+          <w:bCs/>
+          <w:sz w:val="22"/>
+          <w:szCs w:val="22"/>
+        </w:rPr>
+        <w:t xml:space="preserve">Source: </w:t>
+      </w:r>
+      <w:r>
+        <w:rPr>
+          <w:rFonts w:ascii="Calibri" w:cs="Calibri" w:eastAsia="Calibri" w:hAnsi="Calibri"/>
+          <w:sz w:val="22"/>
+          <w:szCs w:val="22"/>
+        </w:rPr>
+        <w:t xml:space="preserve">slide 62. Rebuild on the slide 36 layout with the copy below. Reuse the current image.</w:t>
+      </w:r>
+    </w:p>
+    <w:tbl>
+      <w:tblPr>
+        <w:tblW w:type="dxa" w:w="9360"/>
+        <w:tblBorders>
+          <w:top w:val="single" w:color="D5D9E6" w:sz="4"/>
+          <w:left w:val="single" w:color="D5D9E6" w:sz="4"/>
+          <w:bottom w:val="single" w:color="D5D9E6" w:sz="4"/>
+          <w:right w:val="single" w:color="D5D9E6" w:sz="4"/>
+          <w:insideH w:val="single" w:color="D5D9E6" w:sz="4"/>
+          <w:insideV w:val="single" w:color="D5D9E6" w:sz="4"/>
+        </w:tblBorders>
+      </w:tblPr>
+      <w:tblGrid>
+        <w:gridCol w:w="9360"/>
+      </w:tblGrid>
+      <w:tr>
+        <w:trPr>
+          <w:cantSplit/>
+        </w:trPr>
+        <w:tc>
+          <w:tcPr>
+            <w:tcW w:type="dxa" w:w="9360"/>
+            <w:shd w:fill="EEF1F8" w:color="auto" w:val="clear"/>
+            <w:tcMar>
+              <w:top w:type="dxa" w:w="140"/>
+              <w:left w:type="dxa" w:w="180"/>
+              <w:bottom w:type="dxa" w:w="140"/>
+              <w:right w:type="dxa" w:w="180"/>
+            </w:tcMar>
+          </w:tcPr>
+          <w:p>
+            <w:pPr>
+              <w:spacing w:after="90"/>
+            </w:pPr>
+            <w:r>
+              <w:rPr>
+                <w:rFonts w:ascii="Calibri" w:cs="Calibri" w:eastAsia="Calibri" w:hAnsi="Calibri"/>
+                <w:b/>
+                <w:bCs/>
+                <w:color w:val="22205D"/>
+                <w:sz w:val="22"/>
+                <w:szCs w:val="22"/>
+              </w:rPr>
+              <w:t xml:space="preserve">Client  </w:t>
+            </w:r>
+            <w:r>
+              <w:rPr>
+                <w:rFonts w:ascii="Calibri" w:cs="Calibri" w:eastAsia="Calibri" w:hAnsi="Calibri"/>
+                <w:sz w:val="22"/>
+                <w:szCs w:val="22"/>
+              </w:rPr>
               <w:t xml:space="preserve">A Polish fintech company</w:t>
             </w:r>
           </w:p>
@@ -6346,7 +6788,7 @@
           <w:sz w:val="34"/>
           <w:szCs w:val="34"/>
         </w:rPr>
-        <w:t xml:space="preserve">Slide 10: Why xLoop for Poland, and contact</w:t>
+        <w:t xml:space="preserve">Slide 11: Why xLoop for Poland, and contact</w:t>
       </w:r>
     </w:p>
     <w:p>
@@ -6734,238 +7176,6 @@
         <w:t xml:space="preserve">The quote must stay word for word. It is from a signed testimonial and is the only client name allowed in the deck.</w:t>
       </w:r>
     </w:p>
-    <w:p>
-      <w:pPr>
-        <w:pStyle w:val="Heading1"/>
-        <w:keepNext/>
-        <w:spacing w:after="160" w:before="360"/>
-      </w:pPr>
-      <w:r>
-        <w:rPr>
-          <w:rFonts w:ascii="Calibri" w:cs="Calibri" w:eastAsia="Calibri" w:hAnsi="Calibri"/>
-          <w:b/>
-          <w:bCs/>
-          <w:color w:val="22205D"/>
-          <w:sz w:val="34"/>
-          <w:szCs w:val="34"/>
-        </w:rPr>
-        <w:t xml:space="preserve">Optional swap: Gulf data platforms</w:t>
-      </w:r>
-    </w:p>
-    <w:p>
-      <w:pPr>
-        <w:spacing w:after="120"/>
-      </w:pPr>
-      <w:r>
-        <w:rPr>
-          <w:rFonts w:ascii="Calibri" w:cs="Calibri" w:eastAsia="Calibri" w:hAnsi="Calibri"/>
-          <w:sz w:val="22"/>
-          <w:szCs w:val="22"/>
-        </w:rPr>
-        <w:t xml:space="preserve">Use this only if sales asks for the bank, real estate and maritime clients as a case study. It would replace slide 8. Build it on the slide 38 template (Challenge, What xLoop Delivered, Business Value).</w:t>
-      </w:r>
-    </w:p>
-    <w:tbl>
-      <w:tblPr>
-        <w:tblW w:type="dxa" w:w="9360"/>
-        <w:tblBorders>
-          <w:top w:val="single" w:color="D5D9E6" w:sz="4"/>
-          <w:left w:val="single" w:color="D5D9E6" w:sz="4"/>
-          <w:bottom w:val="single" w:color="D5D9E6" w:sz="4"/>
-          <w:right w:val="single" w:color="D5D9E6" w:sz="4"/>
-          <w:insideH w:val="single" w:color="D5D9E6" w:sz="4"/>
-          <w:insideV w:val="single" w:color="D5D9E6" w:sz="4"/>
-        </w:tblBorders>
-      </w:tblPr>
-      <w:tblGrid>
-        <w:gridCol w:w="9360"/>
-      </w:tblGrid>
-      <w:tr>
-        <w:trPr>
-          <w:cantSplit/>
-        </w:trPr>
-        <w:tc>
-          <w:tcPr>
-            <w:tcW w:type="dxa" w:w="9360"/>
-            <w:shd w:fill="EEF1F8" w:color="auto" w:val="clear"/>
-            <w:tcMar>
-              <w:top w:type="dxa" w:w="140"/>
-              <w:left w:type="dxa" w:w="180"/>
-              <w:bottom w:type="dxa" w:w="140"/>
-              <w:right w:type="dxa" w:w="180"/>
-            </w:tcMar>
-          </w:tcPr>
-          <w:p>
-            <w:pPr>
-              <w:spacing w:after="90"/>
-            </w:pPr>
-            <w:r>
-              <w:rPr>
-                <w:rFonts w:ascii="Calibri" w:cs="Calibri" w:eastAsia="Calibri" w:hAnsi="Calibri"/>
-                <w:b/>
-                <w:bCs/>
-                <w:color w:val="22205D"/>
-                <w:sz w:val="22"/>
-                <w:szCs w:val="22"/>
-              </w:rPr>
-              <w:t xml:space="preserve">Title  </w:t>
-            </w:r>
-            <w:r>
-              <w:rPr>
-                <w:rFonts w:ascii="Calibri" w:cs="Calibri" w:eastAsia="Calibri" w:hAnsi="Calibri"/>
-                <w:sz w:val="22"/>
-                <w:szCs w:val="22"/>
-              </w:rPr>
-              <w:t xml:space="preserve">One Source of Truth for Gulf Enterprises</w:t>
-            </w:r>
-          </w:p>
-          <w:p>
-            <w:pPr>
-              <w:spacing w:after="90"/>
-            </w:pPr>
-            <w:r>
-              <w:rPr>
-                <w:rFonts w:ascii="Calibri" w:cs="Calibri" w:eastAsia="Calibri" w:hAnsi="Calibri"/>
-                <w:b/>
-                <w:bCs/>
-                <w:color w:val="22205D"/>
-                <w:sz w:val="22"/>
-                <w:szCs w:val="22"/>
-              </w:rPr>
-              <w:t xml:space="preserve">The Challenge  </w:t>
-            </w:r>
-            <w:r>
-              <w:rPr>
-                <w:rFonts w:ascii="Calibri" w:cs="Calibri" w:eastAsia="Calibri" w:hAnsi="Calibri"/>
-                <w:sz w:val="22"/>
-                <w:szCs w:val="22"/>
-              </w:rPr>
-              <w:t xml:space="preserve">Analytics teams could not get full value from data spread across many systems.</w:t>
-            </w:r>
-          </w:p>
-          <w:p>
-            <w:pPr>
-              <w:spacing w:after="90"/>
-            </w:pPr>
-            <w:r>
-              <w:rPr>
-                <w:rFonts w:ascii="Calibri" w:cs="Calibri" w:eastAsia="Calibri" w:hAnsi="Calibri"/>
-                <w:b/>
-                <w:bCs/>
-                <w:color w:val="22205D"/>
-                <w:sz w:val="22"/>
-                <w:szCs w:val="22"/>
-              </w:rPr>
-              <w:t xml:space="preserve">What we do  </w:t>
-            </w:r>
-            <w:r>
-              <w:rPr>
-                <w:rFonts w:ascii="Calibri" w:cs="Calibri" w:eastAsia="Calibri" w:hAnsi="Calibri"/>
-                <w:sz w:val="22"/>
-                <w:szCs w:val="22"/>
-              </w:rPr>
-              <w:t xml:space="preserve">We build one trusted data platform on Databricks and Microsoft Azure, so leadership decides from the same numbers.</w:t>
-            </w:r>
-          </w:p>
-          <w:p>
-            <w:pPr>
-              <w:spacing w:after="90"/>
-            </w:pPr>
-            <w:r>
-              <w:rPr>
-                <w:rFonts w:ascii="Calibri" w:cs="Calibri" w:eastAsia="Calibri" w:hAnsi="Calibri"/>
-                <w:b/>
-                <w:bCs/>
-                <w:color w:val="22205D"/>
-                <w:sz w:val="22"/>
-                <w:szCs w:val="22"/>
-              </w:rPr>
-              <w:t xml:space="preserve">Client 1  </w:t>
-            </w:r>
-            <w:r>
-              <w:rPr>
-                <w:rFonts w:ascii="Calibri" w:cs="Calibri" w:eastAsia="Calibri" w:hAnsi="Calibri"/>
-                <w:sz w:val="22"/>
-                <w:szCs w:val="22"/>
-              </w:rPr>
-              <w:t xml:space="preserve">A UAE commercial bank Â· Banking Â· Migration to Microsoft Azure</w:t>
-            </w:r>
-          </w:p>
-          <w:p>
-            <w:pPr>
-              <w:spacing w:after="90"/>
-            </w:pPr>
-            <w:r>
-              <w:rPr>
-                <w:rFonts w:ascii="Calibri" w:cs="Calibri" w:eastAsia="Calibri" w:hAnsi="Calibri"/>
-                <w:b/>
-                <w:bCs/>
-                <w:color w:val="22205D"/>
-                <w:sz w:val="22"/>
-                <w:szCs w:val="22"/>
-              </w:rPr>
-              <w:t xml:space="preserve">Client 2  </w:t>
-            </w:r>
-            <w:r>
-              <w:rPr>
-                <w:rFonts w:ascii="Calibri" w:cs="Calibri" w:eastAsia="Calibri" w:hAnsi="Calibri"/>
-                <w:sz w:val="22"/>
-                <w:szCs w:val="22"/>
-              </w:rPr>
-              <w:t xml:space="preserve">A leading UAE real estate group Â· Real Estate Â· Data platform on Databricks</w:t>
-            </w:r>
-          </w:p>
-          <w:p>
-            <w:pPr>
-              <w:spacing w:after="90"/>
-            </w:pPr>
-            <w:r>
-              <w:rPr>
-                <w:rFonts w:ascii="Calibri" w:cs="Calibri" w:eastAsia="Calibri" w:hAnsi="Calibri"/>
-                <w:b/>
-                <w:bCs/>
-                <w:color w:val="22205D"/>
-                <w:sz w:val="22"/>
-                <w:szCs w:val="22"/>
-              </w:rPr>
-              <w:t xml:space="preserve">Client 3  </w:t>
-            </w:r>
-            <w:r>
-              <w:rPr>
-                <w:rFonts w:ascii="Calibri" w:cs="Calibri" w:eastAsia="Calibri" w:hAnsi="Calibri"/>
-                <w:sz w:val="22"/>
-                <w:szCs w:val="22"/>
-              </w:rPr>
-              <w:t xml:space="preserve">A global maritime services company Â· Maritime Â· Data platform on Databricks</w:t>
-            </w:r>
-          </w:p>
-          <w:p>
-            <w:pPr>
-              <w:spacing w:after="90"/>
-            </w:pPr>
-            <w:r>
-              <w:rPr>
-                <w:rFonts w:ascii="Calibri" w:cs="Calibri" w:eastAsia="Calibri" w:hAnsi="Calibri"/>
-                <w:b/>
-                <w:bCs/>
-                <w:color w:val="22205D"/>
-                <w:sz w:val="22"/>
-                <w:szCs w:val="22"/>
-              </w:rPr>
-              <w:t xml:space="preserve">Industry callout  </w:t>
-            </w:r>
-            <w:r>
-              <w:rPr>
-                <w:rFonts w:ascii="Calibri" w:cs="Calibri" w:eastAsia="Calibri" w:hAnsi="Calibri"/>
-                <w:sz w:val="22"/>
-                <w:szCs w:val="22"/>
-              </w:rPr>
-              <w:t xml:space="preserve">331% ROI reported for Azure Databricks deployments. Source: Forrester Total Economic Impact study, commissioned by Microsoft. [Sana to confirm the figure]</w:t>
-            </w:r>
-          </w:p>
-        </w:tc>
-      </w:tr>
-    </w:tbl>
     <w:sectPr>
       <w:pgSz w:w="12240" w:h="15840" w:orient="portrait"/>
       <w:pgMar w:top="1080" w:right="1440" w:bottom="1080" w:left="1440" w:header="708" w:footer="708" w:gutter="0"/>

</xml_diff>